<commit_message>
Work on literature review
</commit_message>
<xml_diff>
--- a/Literature Review.docx
+++ b/Literature Review.docx
@@ -4,6 +4,393 @@
   <w:body>
     <w:p>
       <w:pPr>
+        <w:spacing w:after="0"/>
+        <w:rPr>
+          <w:sz w:val="16"/>
+          <w:szCs w:val="16"/>
+          <w:lang w:val="en-AT"/>
+        </w:rPr>
+      </w:pPr>
+      <w:r>
+        <w:rPr>
+          <w:sz w:val="16"/>
+          <w:szCs w:val="16"/>
+          <w:lang w:val="en-AT"/>
+        </w:rPr>
+        <w:t xml:space="preserve">You should submit a draft literature survey for your project. This should be a document covering at least 4-6 examples of previous work or academic literature. </w:t>
+      </w:r>
+    </w:p>
+    <w:p>
+      <w:pPr>
+        <w:spacing w:after="0"/>
+        <w:rPr>
+          <w:sz w:val="16"/>
+          <w:szCs w:val="16"/>
+          <w:lang w:val="en-AT"/>
+        </w:rPr>
+      </w:pPr>
+      <w:r>
+        <w:rPr>
+          <w:sz w:val="16"/>
+          <w:szCs w:val="16"/>
+          <w:lang w:val="en-AT"/>
+        </w:rPr>
+        <w:t>Examples of types of literature you might want to include:</w:t>
+      </w:r>
+    </w:p>
+    <w:p>
+      <w:pPr>
+        <w:numPr>
+          <w:ilvl w:val="0"/>
+          <w:numId w:val="2"/>
+        </w:numPr>
+        <w:spacing w:after="0"/>
+        <w:rPr>
+          <w:sz w:val="16"/>
+          <w:szCs w:val="16"/>
+          <w:lang w:val="en-AT"/>
+        </w:rPr>
+      </w:pPr>
+      <w:r>
+        <w:rPr>
+          <w:sz w:val="16"/>
+          <w:szCs w:val="16"/>
+          <w:lang w:val="en-AT"/>
+        </w:rPr>
+        <w:t xml:space="preserve">Examples of projects that are </w:t>
+      </w:r>
+      <w:proofErr w:type="gramStart"/>
+      <w:r>
+        <w:rPr>
+          <w:sz w:val="16"/>
+          <w:szCs w:val="16"/>
+          <w:lang w:val="en-AT"/>
+        </w:rPr>
+        <w:t>similar to</w:t>
+      </w:r>
+      <w:proofErr w:type="gramEnd"/>
+      <w:r>
+        <w:rPr>
+          <w:sz w:val="16"/>
+          <w:szCs w:val="16"/>
+          <w:lang w:val="en-AT"/>
+        </w:rPr>
+        <w:t xml:space="preserve"> your own (these can be the same as those used in your proposal).</w:t>
+      </w:r>
+    </w:p>
+    <w:p>
+      <w:pPr>
+        <w:numPr>
+          <w:ilvl w:val="0"/>
+          <w:numId w:val="2"/>
+        </w:numPr>
+        <w:spacing w:after="0"/>
+        <w:rPr>
+          <w:sz w:val="16"/>
+          <w:szCs w:val="16"/>
+          <w:lang w:val="en-AT"/>
+        </w:rPr>
+      </w:pPr>
+      <w:r>
+        <w:rPr>
+          <w:sz w:val="16"/>
+          <w:szCs w:val="16"/>
+          <w:lang w:val="en-AT"/>
+        </w:rPr>
+        <w:t xml:space="preserve">Techniques and methods that you plan to use. These could be software libraries, algorithms, or research methodologies. </w:t>
+      </w:r>
+    </w:p>
+    <w:p>
+      <w:pPr>
+        <w:numPr>
+          <w:ilvl w:val="0"/>
+          <w:numId w:val="2"/>
+        </w:numPr>
+        <w:spacing w:after="0"/>
+        <w:rPr>
+          <w:sz w:val="16"/>
+          <w:szCs w:val="16"/>
+          <w:lang w:val="en-AT"/>
+        </w:rPr>
+      </w:pPr>
+      <w:r>
+        <w:rPr>
+          <w:sz w:val="16"/>
+          <w:szCs w:val="16"/>
+          <w:lang w:val="en-AT"/>
+        </w:rPr>
+        <w:t xml:space="preserve">Research studies that show the effectiveness of the project you intend to create (for example, if you are doing a project on educational technology, a psychological or educational study showing that the techniques you are using are effective for teaching). </w:t>
+      </w:r>
+    </w:p>
+    <w:p>
+      <w:pPr>
+        <w:spacing w:after="0"/>
+        <w:rPr>
+          <w:sz w:val="16"/>
+          <w:szCs w:val="16"/>
+          <w:lang w:val="en-AT"/>
+        </w:rPr>
+      </w:pPr>
+      <w:r>
+        <w:rPr>
+          <w:sz w:val="16"/>
+          <w:szCs w:val="16"/>
+          <w:lang w:val="en-AT"/>
+        </w:rPr>
+        <w:t xml:space="preserve">This literature can include academic papers and books. It can also include online articles and websites, but in that case, you should also explain why you consider them credible sources. </w:t>
+      </w:r>
+    </w:p>
+    <w:p>
+      <w:pPr>
+        <w:spacing w:after="0"/>
+        <w:rPr>
+          <w:sz w:val="16"/>
+          <w:szCs w:val="16"/>
+          <w:lang w:val="en-AT"/>
+        </w:rPr>
+      </w:pPr>
+      <w:r>
+        <w:rPr>
+          <w:sz w:val="16"/>
+          <w:szCs w:val="16"/>
+          <w:lang w:val="en-AT"/>
+        </w:rPr>
+        <w:t xml:space="preserve">You should evaluate the literature and explain how it contributes to your project, or how it demonstrates the gaps that your project intends to fill. </w:t>
+      </w:r>
+    </w:p>
+    <w:p>
+      <w:pPr>
+        <w:spacing w:after="0"/>
+        <w:rPr>
+          <w:sz w:val="16"/>
+          <w:szCs w:val="16"/>
+          <w:lang w:val="en-AT"/>
+        </w:rPr>
+      </w:pPr>
+      <w:r>
+        <w:rPr>
+          <w:sz w:val="16"/>
+          <w:szCs w:val="16"/>
+          <w:lang w:val="en-AT"/>
+        </w:rPr>
+        <w:t xml:space="preserve">The report should be in PDF format, up to 6 pages (minimum font size 11pt, minimum margin 2cm). There is a word limit in the summative </w:t>
+      </w:r>
+      <w:proofErr w:type="gramStart"/>
+      <w:r>
+        <w:rPr>
+          <w:sz w:val="16"/>
+          <w:szCs w:val="16"/>
+          <w:lang w:val="en-AT"/>
+        </w:rPr>
+        <w:t>assessments</w:t>
+      </w:r>
+      <w:proofErr w:type="gramEnd"/>
+      <w:r>
+        <w:rPr>
+          <w:sz w:val="16"/>
+          <w:szCs w:val="16"/>
+          <w:lang w:val="en-AT"/>
+        </w:rPr>
+        <w:t xml:space="preserve"> of 2500 words for your literature review, so it is a good idea to try to keep within this limit. You may include additional pages of images and citations. </w:t>
+      </w:r>
+    </w:p>
+    <w:p>
+      <w:pPr>
+        <w:spacing w:after="0"/>
+        <w:rPr>
+          <w:sz w:val="16"/>
+          <w:szCs w:val="16"/>
+          <w:lang w:val="en-AT"/>
+        </w:rPr>
+      </w:pPr>
+      <w:r>
+        <w:rPr>
+          <w:sz w:val="16"/>
+          <w:szCs w:val="16"/>
+          <w:lang w:val="en-AT"/>
+        </w:rPr>
+        <w:t xml:space="preserve">You should, if appropriate, use visual materials, for example, images and diagrams from the literature you are citing. If you do include such items, you also must cite them appropriately. You might also want to include tables that compare different examples of prior work. </w:t>
+      </w:r>
+    </w:p>
+    <w:p>
+      <w:pPr>
+        <w:spacing w:after="0"/>
+        <w:rPr>
+          <w:sz w:val="16"/>
+          <w:szCs w:val="16"/>
+          <w:lang w:val="en-AT"/>
+        </w:rPr>
+      </w:pPr>
+      <w:r>
+        <w:rPr>
+          <w:sz w:val="16"/>
+          <w:szCs w:val="16"/>
+          <w:lang w:val="en-AT"/>
+        </w:rPr>
+        <w:t xml:space="preserve">Note that a good literature review is more than just a serial summary of the items you’ve chosen to present. Drawing similarities, identifying differing views, contrasting, etc., is the added value that a </w:t>
+      </w:r>
+      <w:proofErr w:type="gramStart"/>
+      <w:r>
+        <w:rPr>
+          <w:sz w:val="16"/>
+          <w:szCs w:val="16"/>
+          <w:lang w:val="en-AT"/>
+        </w:rPr>
+        <w:t>high quality</w:t>
+      </w:r>
+      <w:proofErr w:type="gramEnd"/>
+      <w:r>
+        <w:rPr>
+          <w:sz w:val="16"/>
+          <w:szCs w:val="16"/>
+          <w:lang w:val="en-AT"/>
+        </w:rPr>
+        <w:t xml:space="preserve"> review provides to the reader. This aspect is what makes a review pertinent to your </w:t>
+      </w:r>
+      <w:proofErr w:type="gramStart"/>
+      <w:r>
+        <w:rPr>
+          <w:sz w:val="16"/>
+          <w:szCs w:val="16"/>
+          <w:lang w:val="en-AT"/>
+        </w:rPr>
+        <w:t>particular topic</w:t>
+      </w:r>
+      <w:proofErr w:type="gramEnd"/>
+      <w:r>
+        <w:rPr>
+          <w:sz w:val="16"/>
+          <w:szCs w:val="16"/>
+          <w:lang w:val="en-AT"/>
+        </w:rPr>
+        <w:t xml:space="preserve"> and the focus you are taking for it.</w:t>
+      </w:r>
+    </w:p>
+    <w:p>
+      <w:pPr>
+        <w:spacing w:after="0"/>
+        <w:rPr>
+          <w:sz w:val="16"/>
+          <w:szCs w:val="16"/>
+          <w:lang w:val="en-AT"/>
+        </w:rPr>
+      </w:pPr>
+    </w:p>
+    <w:p>
+      <w:pPr>
+        <w:spacing w:after="0"/>
+        <w:rPr>
+          <w:sz w:val="16"/>
+          <w:szCs w:val="16"/>
+          <w:lang w:val="en-AT"/>
+        </w:rPr>
+      </w:pPr>
+      <w:r>
+        <w:rPr>
+          <w:sz w:val="16"/>
+          <w:szCs w:val="16"/>
+          <w:lang w:val="en-AT"/>
+        </w:rPr>
+        <w:t>Grading criteria:</w:t>
+      </w:r>
+    </w:p>
+    <w:p>
+      <w:pPr>
+        <w:numPr>
+          <w:ilvl w:val="0"/>
+          <w:numId w:val="3"/>
+        </w:numPr>
+        <w:spacing w:after="0"/>
+        <w:rPr>
+          <w:sz w:val="16"/>
+          <w:szCs w:val="16"/>
+          <w:lang w:val="en-AT"/>
+        </w:rPr>
+      </w:pPr>
+      <w:r>
+        <w:rPr>
+          <w:sz w:val="16"/>
+          <w:szCs w:val="16"/>
+          <w:lang w:val="en-AT"/>
+        </w:rPr>
+        <w:t>Does the report display knowledge of the area of study, previous work and academic literature?</w:t>
+      </w:r>
+    </w:p>
+    <w:p>
+      <w:pPr>
+        <w:numPr>
+          <w:ilvl w:val="0"/>
+          <w:numId w:val="3"/>
+        </w:numPr>
+        <w:spacing w:after="0"/>
+        <w:rPr>
+          <w:sz w:val="16"/>
+          <w:szCs w:val="16"/>
+          <w:lang w:val="en-AT"/>
+        </w:rPr>
+      </w:pPr>
+      <w:r>
+        <w:rPr>
+          <w:sz w:val="16"/>
+          <w:szCs w:val="16"/>
+          <w:lang w:val="en-AT"/>
+        </w:rPr>
+        <w:t>Does the report critically evaluate the previous work and/or academic literature?</w:t>
+      </w:r>
+    </w:p>
+    <w:p>
+      <w:pPr>
+        <w:numPr>
+          <w:ilvl w:val="0"/>
+          <w:numId w:val="3"/>
+        </w:numPr>
+        <w:spacing w:after="0"/>
+        <w:rPr>
+          <w:sz w:val="16"/>
+          <w:szCs w:val="16"/>
+          <w:lang w:val="en-AT"/>
+        </w:rPr>
+      </w:pPr>
+      <w:r>
+        <w:rPr>
+          <w:sz w:val="16"/>
+          <w:szCs w:val="16"/>
+          <w:lang w:val="en-AT"/>
+        </w:rPr>
+        <w:t>Does the report use proper citation and referencing?</w:t>
+      </w:r>
+    </w:p>
+    <w:p>
+      <w:pPr>
+        <w:numPr>
+          <w:ilvl w:val="0"/>
+          <w:numId w:val="3"/>
+        </w:numPr>
+        <w:spacing w:after="0"/>
+        <w:rPr>
+          <w:sz w:val="16"/>
+          <w:szCs w:val="16"/>
+          <w:lang w:val="en-AT"/>
+        </w:rPr>
+      </w:pPr>
+      <w:r>
+        <w:rPr>
+          <w:sz w:val="16"/>
+          <w:szCs w:val="16"/>
+          <w:lang w:val="en-AT"/>
+        </w:rPr>
+        <w:t>Does the report add value beyond summarising the different work coherently?</w:t>
+      </w:r>
+    </w:p>
+    <w:p>
+      <w:pPr>
+        <w:rPr>
+          <w:lang w:val="en-AT"/>
+        </w:rPr>
+      </w:pPr>
+    </w:p>
+    <w:p>
+      <w:pPr>
         <w:pStyle w:val="Heading1"/>
       </w:pPr>
       <w:r>
@@ -16,104 +403,27 @@
           <w:lang w:val="en-AT"/>
         </w:rPr>
       </w:pPr>
-      <w:r>
-        <w:rPr>
-          <w:lang w:val="en-AT"/>
-        </w:rPr>
-        <w:t>Papers: Research on gamification in mobile applications and disaster management tools</w:t>
-      </w:r>
     </w:p>
     <w:p>
       <w:pPr>
-        <w:pStyle w:val="ListParagraph"/>
-        <w:numPr>
-          <w:ilvl w:val="0"/>
-          <w:numId w:val="1"/>
-        </w:numPr>
-        <w:rPr>
-          <w:lang w:val="en-AT"/>
-        </w:rPr>
-      </w:pPr>
-      <w:proofErr w:type="spellStart"/>
-      <w:r>
-        <w:rPr>
-          <w:lang w:val="en-AT"/>
-        </w:rPr>
-        <w:t>Kankanamge</w:t>
-      </w:r>
-      <w:proofErr w:type="spellEnd"/>
-      <w:r>
-        <w:rPr>
-          <w:lang w:val="en-AT"/>
-        </w:rPr>
-        <w:t xml:space="preserve">, N., </w:t>
-      </w:r>
-      <w:proofErr w:type="spellStart"/>
-      <w:r>
-        <w:rPr>
-          <w:lang w:val="en-AT"/>
-        </w:rPr>
-        <w:t>Yigitcanlar</w:t>
-      </w:r>
-      <w:proofErr w:type="spellEnd"/>
-      <w:r>
-        <w:rPr>
-          <w:lang w:val="en-AT"/>
-        </w:rPr>
-        <w:t xml:space="preserve">, T., Goonetilleke, A. and </w:t>
-      </w:r>
-      <w:proofErr w:type="spellStart"/>
-      <w:r>
-        <w:rPr>
-          <w:lang w:val="en-AT"/>
-        </w:rPr>
-        <w:t>Kamruzzaman</w:t>
-      </w:r>
-      <w:proofErr w:type="spellEnd"/>
-      <w:r>
-        <w:rPr>
-          <w:lang w:val="en-AT"/>
-        </w:rPr>
-        <w:t>, M., 2020. How can gamification be incorporated into disaster emergency planning? A systematic review of the literature. International Journal of Disaster Resilience in the Built Environment, 11(4), pp.481-506.</w:t>
-      </w:r>
+        <w:rPr>
+          <w:lang w:val="en-AT"/>
+        </w:rPr>
+      </w:pPr>
     </w:p>
     <w:p>
       <w:pPr>
-        <w:pStyle w:val="ListParagraph"/>
-        <w:numPr>
-          <w:ilvl w:val="0"/>
-          <w:numId w:val="1"/>
-        </w:numPr>
-        <w:rPr>
-          <w:lang w:val="en-AT"/>
-        </w:rPr>
-      </w:pPr>
-      <w:r>
-        <w:rPr>
-          <w:lang w:val="en-AT"/>
-        </w:rPr>
-        <w:t xml:space="preserve">Matsuno, Y., </w:t>
-      </w:r>
-      <w:proofErr w:type="spellStart"/>
-      <w:r>
-        <w:rPr>
-          <w:lang w:val="en-AT"/>
-        </w:rPr>
-        <w:t>Fukanuma</w:t>
-      </w:r>
-      <w:proofErr w:type="spellEnd"/>
-      <w:r>
-        <w:rPr>
-          <w:lang w:val="en-AT"/>
-        </w:rPr>
-        <w:t>, F. and Tsuruoka, S., 2021. Development of flood disaster prevention simulation smartphone application using gamification. Dynam</w:t>
-      </w:r>
-      <w:r>
-        <w:rPr>
-          <w:lang w:val="en-AT"/>
-        </w:rPr>
-        <w:t>ics of Disasters: Impact, Risk, Resilience, and Solutions, pp.147-159.</w:t>
-      </w:r>
+        <w:rPr>
+          <w:lang w:val="en-AT"/>
+        </w:rPr>
+      </w:pPr>
+    </w:p>
+    <w:p>
+      <w:pPr>
+        <w:rPr>
+          <w:lang w:val="en-AT"/>
+        </w:rPr>
+      </w:pPr>
     </w:p>
     <w:sdt>
       <w:sdtPr>
@@ -122,7 +432,7 @@
           <w:color w:val="000000"/>
           <w:lang w:val="en-US"/>
         </w:rPr>
-        <w:tag w:val="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"/>
+        <w:tag w:val="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"/>
         <w:id w:val="392780191"/>
         <w:placeholder>
           <w:docPart w:val="DefaultPlaceholder_-1854013440"/>
@@ -134,24 +444,137 @@
             <w:rPr>
               <w:rFonts w:ascii="Aptos" w:hAnsi="Aptos"/>
               <w:color w:val="000000"/>
+              <w:lang w:val="en-US"/>
+            </w:rPr>
+          </w:pPr>
+          <w:r>
+            <w:rPr>
+              <w:rFonts w:ascii="Aptos" w:eastAsia="Times New Roman" w:hAnsi="Aptos"/>
+              <w:color w:val="000000"/>
+              <w:lang w:val="en-AT"/>
+            </w:rPr>
+            <w:t xml:space="preserve">(Austrian Federal Ministry of Agriculture Forestry Climate and Environmental Protection Regions and Water Management, n.d.; Bai et al., 2024; </w:t>
+          </w:r>
+          <w:proofErr w:type="spellStart"/>
+          <w:r>
+            <w:rPr>
+              <w:rFonts w:ascii="Aptos" w:eastAsia="Times New Roman" w:hAnsi="Aptos"/>
+              <w:color w:val="000000"/>
+              <w:lang w:val="en-AT"/>
+            </w:rPr>
+            <w:t>CombiRisk</w:t>
+          </w:r>
+          <w:proofErr w:type="spellEnd"/>
+          <w:r>
+            <w:rPr>
+              <w:rFonts w:ascii="Aptos" w:eastAsia="Times New Roman" w:hAnsi="Aptos"/>
+              <w:color w:val="000000"/>
+              <w:lang w:val="en-AT"/>
+            </w:rPr>
+            <w:t xml:space="preserve"> Risk-Management GmbH, 2025; dominoc925, 2026; </w:t>
+          </w:r>
+          <w:proofErr w:type="spellStart"/>
+          <w:r>
+            <w:rPr>
+              <w:rFonts w:ascii="Aptos" w:eastAsia="Times New Roman" w:hAnsi="Aptos"/>
+              <w:color w:val="000000"/>
+              <w:lang w:val="en-AT"/>
+            </w:rPr>
+            <w:t>Gehirn</w:t>
+          </w:r>
+          <w:proofErr w:type="spellEnd"/>
+          <w:r>
+            <w:rPr>
+              <w:rFonts w:ascii="Aptos" w:eastAsia="Times New Roman" w:hAnsi="Aptos"/>
+              <w:color w:val="000000"/>
+              <w:lang w:val="en-AT"/>
+            </w:rPr>
+            <w:t xml:space="preserve"> Inc., 2026; </w:t>
+          </w:r>
+          <w:proofErr w:type="spellStart"/>
+          <w:r>
+            <w:rPr>
+              <w:rFonts w:ascii="Aptos" w:eastAsia="Times New Roman" w:hAnsi="Aptos"/>
+              <w:color w:val="000000"/>
+              <w:lang w:val="en-AT"/>
+            </w:rPr>
+            <w:t>GeoSphere</w:t>
+          </w:r>
+          <w:proofErr w:type="spellEnd"/>
+          <w:r>
+            <w:rPr>
+              <w:rFonts w:ascii="Aptos" w:eastAsia="Times New Roman" w:hAnsi="Aptos"/>
+              <w:color w:val="000000"/>
+              <w:lang w:val="en-AT"/>
+            </w:rPr>
+            <w:t xml:space="preserve"> Austria, n.d.; </w:t>
+          </w:r>
+          <w:proofErr w:type="spellStart"/>
+          <w:r>
+            <w:rPr>
+              <w:rFonts w:ascii="Aptos" w:eastAsia="Times New Roman" w:hAnsi="Aptos"/>
+              <w:color w:val="000000"/>
+              <w:lang w:val="en-AT"/>
+            </w:rPr>
+            <w:t>Kankanamge</w:t>
+          </w:r>
+          <w:proofErr w:type="spellEnd"/>
+          <w:r>
+            <w:rPr>
+              <w:rFonts w:ascii="Aptos" w:eastAsia="Times New Roman" w:hAnsi="Aptos"/>
+              <w:color w:val="000000"/>
+              <w:lang w:val="en-AT"/>
+            </w:rPr>
+            <w:t xml:space="preserve"> et al., 2020; Matsuno et al., 2021; Nagaraju et al., 2024; </w:t>
+          </w:r>
+          <w:proofErr w:type="spellStart"/>
+          <w:r>
+            <w:rPr>
+              <w:rFonts w:ascii="Aptos" w:eastAsia="Times New Roman" w:hAnsi="Aptos"/>
+              <w:color w:val="000000"/>
+              <w:lang w:val="en-AT"/>
+            </w:rPr>
+            <w:t>Österr</w:t>
+          </w:r>
+          <w:proofErr w:type="spellEnd"/>
+          <w:r>
+            <w:rPr>
+              <w:rFonts w:ascii="Aptos" w:eastAsia="Times New Roman" w:hAnsi="Aptos"/>
+              <w:color w:val="000000"/>
+              <w:lang w:val="en-AT"/>
+            </w:rPr>
+            <w:t xml:space="preserve">. </w:t>
+          </w:r>
+          <w:r>
+            <w:rPr>
+              <w:rFonts w:ascii="Aptos" w:eastAsia="Times New Roman" w:hAnsi="Aptos"/>
+              <w:color w:val="000000"/>
               <w:lang w:val="de-AT"/>
             </w:rPr>
-          </w:pPr>
-          <w:r>
-            <w:rPr>
-              <w:rFonts w:ascii="Aptos" w:eastAsia="Times New Roman" w:hAnsi="Aptos"/>
-              <w:color w:val="000000"/>
-              <w:lang w:val="en-AT"/>
-            </w:rPr>
-            <w:t xml:space="preserve">(Bai et al., 2024; CombiRisk Risk-Management GmbH, 2025; dominoc925, 2026; Gehirn Inc., 2026; Kankanamge et al., 2020; Matsuno et al., 2021; Österr. </w:t>
-          </w:r>
-          <w:r>
-            <w:rPr>
-              <w:rFonts w:ascii="Aptos" w:eastAsia="Times New Roman" w:hAnsi="Aptos"/>
-              <w:color w:val="000000"/>
-              <w:lang w:val="de-AT"/>
-            </w:rPr>
-            <w:t>Rotes Kreuz, 2024; SOBOS GmbH, 2026; Toledo et al., 2017; Ubimet Int. AG, 2025; West &amp; Valentini, 2013)</w:t>
+            <w:t xml:space="preserve">Rotes Kreuz, 2024; Rundfunk und Telekom Regulierungs GmbH, n.d.; SOBOS GmbH, 2026; Toledo et al., 2017; Ubimet Int. </w:t>
+          </w:r>
+          <w:r>
+            <w:rPr>
+              <w:rFonts w:ascii="Aptos" w:eastAsia="Times New Roman" w:hAnsi="Aptos"/>
+              <w:color w:val="000000"/>
+            </w:rPr>
+            <w:t xml:space="preserve">AG, 2025; West &amp; Valentini, 2013; </w:t>
+          </w:r>
+          <w:proofErr w:type="spellStart"/>
+          <w:r>
+            <w:rPr>
+              <w:rFonts w:ascii="Aptos" w:eastAsia="Times New Roman" w:hAnsi="Aptos"/>
+              <w:color w:val="000000"/>
+            </w:rPr>
+            <w:t>Zippenfenig</w:t>
+          </w:r>
+          <w:proofErr w:type="spellEnd"/>
+          <w:r>
+            <w:rPr>
+              <w:rFonts w:ascii="Aptos" w:eastAsia="Times New Roman" w:hAnsi="Aptos"/>
+              <w:color w:val="000000"/>
+            </w:rPr>
+            <w:t>, 2023)</w:t>
           </w:r>
         </w:p>
       </w:sdtContent>
@@ -161,7 +584,7 @@
         <w:rPr>
           <w:rFonts w:ascii="Aptos" w:hAnsi="Aptos"/>
           <w:color w:val="000000"/>
-          <w:lang w:val="de-AT"/>
+          <w:lang w:val="en-US"/>
         </w:rPr>
       </w:pPr>
     </w:p>
@@ -184,7 +607,7 @@
             <w:autoSpaceDE w:val="0"/>
             <w:autoSpaceDN w:val="0"/>
             <w:ind w:hanging="480"/>
-            <w:divId w:val="1364593320"/>
+            <w:divId w:val="2137524266"/>
             <w:rPr>
               <w:rFonts w:ascii="Aptos" w:eastAsia="Times New Roman" w:hAnsi="Aptos"/>
               <w:color w:val="000000"/>
@@ -200,7 +623,7 @@
               <w:color w:val="000000"/>
               <w:lang w:val="en-US"/>
             </w:rPr>
-            <w:t xml:space="preserve">Bai, S., Zeng, H., Zhong, Q., Shen, Y., Cao, L., &amp; He, M. (2024). Application of Gamification Teaching in Disaster Education: Scoping Review. </w:t>
+            <w:t xml:space="preserve">Austrian Federal Ministry of Agriculture Forestry Climate and Environmental Protection Regions and Water Management. (n.d.). </w:t>
           </w:r>
           <w:r>
             <w:rPr>
@@ -210,16 +633,9 @@
               <w:color w:val="000000"/>
               <w:lang w:val="en-US"/>
             </w:rPr>
-            <w:t>JMIR Serious Games</w:t>
-          </w:r>
-          <w:r>
-            <w:rPr>
-              <w:rFonts w:ascii="Aptos" w:eastAsia="Times New Roman" w:hAnsi="Aptos"/>
-              <w:color w:val="000000"/>
-              <w:lang w:val="en-US"/>
-            </w:rPr>
-            <w:t xml:space="preserve">, </w:t>
-          </w:r>
+            <w:t xml:space="preserve">Current measurements from the </w:t>
+          </w:r>
+          <w:proofErr w:type="gramStart"/>
           <w:r>
             <w:rPr>
               <w:rFonts w:ascii="Aptos" w:eastAsia="Times New Roman" w:hAnsi="Aptos"/>
@@ -228,15 +644,26 @@
               <w:color w:val="000000"/>
               <w:lang w:val="en-US"/>
             </w:rPr>
-            <w:t>12</w:t>
-          </w:r>
-          <w:r>
-            <w:rPr>
-              <w:rFonts w:ascii="Aptos" w:eastAsia="Times New Roman" w:hAnsi="Aptos"/>
-              <w:color w:val="000000"/>
-              <w:lang w:val="en-US"/>
-            </w:rPr>
-            <w:t>, e64939–e64939. https://doi.org/10.2196/64939</w:t>
+            <w:t>radiation early warning</w:t>
+          </w:r>
+          <w:proofErr w:type="gramEnd"/>
+          <w:r>
+            <w:rPr>
+              <w:rFonts w:ascii="Aptos" w:eastAsia="Times New Roman" w:hAnsi="Aptos"/>
+              <w:i/>
+              <w:iCs/>
+              <w:color w:val="000000"/>
+              <w:lang w:val="en-US"/>
+            </w:rPr>
+            <w:t xml:space="preserve"> system</w:t>
+          </w:r>
+          <w:r>
+            <w:rPr>
+              <w:rFonts w:ascii="Aptos" w:eastAsia="Times New Roman" w:hAnsi="Aptos"/>
+              <w:color w:val="000000"/>
+              <w:lang w:val="en-US"/>
+            </w:rPr>
+            <w:t>. Radiation Early Warning System and Monitoring. Retrieved May 11, 2026, from https://www.bmluk.gv.at/themen/klima-und-umwelt/strahlenschutz/fruehwarnsystem/messwerte.html</w:t>
           </w:r>
         </w:p>
         <w:p>
@@ -244,30 +671,20 @@
             <w:autoSpaceDE w:val="0"/>
             <w:autoSpaceDN w:val="0"/>
             <w:ind w:hanging="480"/>
-            <w:divId w:val="1433747815"/>
+            <w:divId w:val="1582518027"/>
             <w:rPr>
               <w:rFonts w:ascii="Aptos" w:eastAsia="Times New Roman" w:hAnsi="Aptos"/>
               <w:color w:val="000000"/>
               <w:lang w:val="en-US"/>
             </w:rPr>
           </w:pPr>
-          <w:proofErr w:type="spellStart"/>
-          <w:r>
-            <w:rPr>
-              <w:rFonts w:ascii="Aptos" w:eastAsia="Times New Roman" w:hAnsi="Aptos"/>
-              <w:color w:val="000000"/>
-              <w:lang w:val="en-US"/>
-            </w:rPr>
-            <w:t>CombiRisk</w:t>
-          </w:r>
-          <w:proofErr w:type="spellEnd"/>
-          <w:r>
-            <w:rPr>
-              <w:rFonts w:ascii="Aptos" w:eastAsia="Times New Roman" w:hAnsi="Aptos"/>
-              <w:color w:val="000000"/>
-              <w:lang w:val="en-US"/>
-            </w:rPr>
-            <w:t xml:space="preserve"> Risk-Management GmbH. (2025). </w:t>
+          <w:r>
+            <w:rPr>
+              <w:rFonts w:ascii="Aptos" w:eastAsia="Times New Roman" w:hAnsi="Aptos"/>
+              <w:color w:val="000000"/>
+              <w:lang w:val="en-US"/>
+            </w:rPr>
+            <w:t xml:space="preserve">Bai, S., Zeng, H., Zhong, Q., Shen, Y., Cao, L., &amp; He, M. (2024). Application of Gamification Teaching in Disaster Education: Scoping Review. </w:t>
           </w:r>
           <w:r>
             <w:rPr>
@@ -277,15 +694,33 @@
               <w:color w:val="000000"/>
               <w:lang w:val="en-US"/>
             </w:rPr>
-            <w:t>KATWARN</w:t>
-          </w:r>
-          <w:r>
-            <w:rPr>
-              <w:rFonts w:ascii="Aptos" w:eastAsia="Times New Roman" w:hAnsi="Aptos"/>
-              <w:color w:val="000000"/>
-              <w:lang w:val="en-US"/>
-            </w:rPr>
-            <w:t>. https://play.google.com/store/apps/details?id=de.combirisk.katwarn&amp;hl=en</w:t>
+            <w:t>JMIR Serious Games</w:t>
+          </w:r>
+          <w:r>
+            <w:rPr>
+              <w:rFonts w:ascii="Aptos" w:eastAsia="Times New Roman" w:hAnsi="Aptos"/>
+              <w:color w:val="000000"/>
+              <w:lang w:val="en-US"/>
+            </w:rPr>
+            <w:t xml:space="preserve">, </w:t>
+          </w:r>
+          <w:r>
+            <w:rPr>
+              <w:rFonts w:ascii="Aptos" w:eastAsia="Times New Roman" w:hAnsi="Aptos"/>
+              <w:i/>
+              <w:iCs/>
+              <w:color w:val="000000"/>
+              <w:lang w:val="en-US"/>
+            </w:rPr>
+            <w:t>12</w:t>
+          </w:r>
+          <w:r>
+            <w:rPr>
+              <w:rFonts w:ascii="Aptos" w:eastAsia="Times New Roman" w:hAnsi="Aptos"/>
+              <w:color w:val="000000"/>
+              <w:lang w:val="en-US"/>
+            </w:rPr>
+            <w:t>, 1–11. https://doi.org/10.2196/64939</w:t>
           </w:r>
         </w:p>
         <w:p>
@@ -293,22 +728,32 @@
             <w:autoSpaceDE w:val="0"/>
             <w:autoSpaceDN w:val="0"/>
             <w:ind w:hanging="480"/>
-            <w:divId w:val="1965383929"/>
+            <w:divId w:val="1278875710"/>
             <w:rPr>
               <w:rFonts w:ascii="Aptos" w:eastAsia="Times New Roman" w:hAnsi="Aptos"/>
               <w:color w:val="000000"/>
               <w:lang w:val="en-US"/>
             </w:rPr>
           </w:pPr>
-          <w:r>
-            <w:rPr>
-              <w:rFonts w:ascii="Aptos" w:eastAsia="Times New Roman" w:hAnsi="Aptos"/>
-              <w:color w:val="000000"/>
-              <w:lang w:val="en-US"/>
-            </w:rPr>
-            <w:t xml:space="preserve">dominoc925. (2026). </w:t>
-          </w:r>
           <w:proofErr w:type="spellStart"/>
+          <w:r>
+            <w:rPr>
+              <w:rFonts w:ascii="Aptos" w:eastAsia="Times New Roman" w:hAnsi="Aptos"/>
+              <w:color w:val="000000"/>
+              <w:lang w:val="en-US"/>
+            </w:rPr>
+            <w:lastRenderedPageBreak/>
+            <w:t>CombiRisk</w:t>
+          </w:r>
+          <w:proofErr w:type="spellEnd"/>
+          <w:r>
+            <w:rPr>
+              <w:rFonts w:ascii="Aptos" w:eastAsia="Times New Roman" w:hAnsi="Aptos"/>
+              <w:color w:val="000000"/>
+              <w:lang w:val="en-US"/>
+            </w:rPr>
+            <w:t xml:space="preserve"> Risk-Management GmbH. (2025). </w:t>
+          </w:r>
           <w:r>
             <w:rPr>
               <w:rFonts w:ascii="Aptos" w:eastAsia="Times New Roman" w:hAnsi="Aptos"/>
@@ -317,26 +762,15 @@
               <w:color w:val="000000"/>
               <w:lang w:val="en-US"/>
             </w:rPr>
-            <w:t>Disastermon</w:t>
-          </w:r>
-          <w:proofErr w:type="spellEnd"/>
-          <w:r>
-            <w:rPr>
-              <w:rFonts w:ascii="Aptos" w:eastAsia="Times New Roman" w:hAnsi="Aptos"/>
-              <w:i/>
-              <w:iCs/>
-              <w:color w:val="000000"/>
-              <w:lang w:val="en-US"/>
-            </w:rPr>
-            <w:t xml:space="preserve"> Natural Disaster Monitor</w:t>
-          </w:r>
-          <w:r>
-            <w:rPr>
-              <w:rFonts w:ascii="Aptos" w:eastAsia="Times New Roman" w:hAnsi="Aptos"/>
-              <w:color w:val="000000"/>
-              <w:lang w:val="en-US"/>
-            </w:rPr>
-            <w:t>. https://play.google.com/store/apps/details?id=com.dom925.disastermon&amp;hl=en</w:t>
+            <w:t>KATWARN</w:t>
+          </w:r>
+          <w:r>
+            <w:rPr>
+              <w:rFonts w:ascii="Aptos" w:eastAsia="Times New Roman" w:hAnsi="Aptos"/>
+              <w:color w:val="000000"/>
+              <w:lang w:val="en-US"/>
+            </w:rPr>
+            <w:t>. https://play.google.com/store/apps/details?id=de.combirisk.katwarn&amp;hl=en</w:t>
           </w:r>
         </w:p>
         <w:p>
@@ -344,31 +778,22 @@
             <w:autoSpaceDE w:val="0"/>
             <w:autoSpaceDN w:val="0"/>
             <w:ind w:hanging="480"/>
-            <w:divId w:val="511799743"/>
+            <w:divId w:val="314605165"/>
             <w:rPr>
               <w:rFonts w:ascii="Aptos" w:eastAsia="Times New Roman" w:hAnsi="Aptos"/>
               <w:color w:val="000000"/>
               <w:lang w:val="en-US"/>
             </w:rPr>
           </w:pPr>
+          <w:r>
+            <w:rPr>
+              <w:rFonts w:ascii="Aptos" w:eastAsia="Times New Roman" w:hAnsi="Aptos"/>
+              <w:color w:val="000000"/>
+              <w:lang w:val="en-US"/>
+            </w:rPr>
+            <w:t xml:space="preserve">dominoc925. (2026). </w:t>
+          </w:r>
           <w:proofErr w:type="spellStart"/>
-          <w:r>
-            <w:rPr>
-              <w:rFonts w:ascii="Aptos" w:eastAsia="Times New Roman" w:hAnsi="Aptos"/>
-              <w:color w:val="000000"/>
-              <w:lang w:val="en-US"/>
-            </w:rPr>
-            <w:t>Gehirn</w:t>
-          </w:r>
-          <w:proofErr w:type="spellEnd"/>
-          <w:r>
-            <w:rPr>
-              <w:rFonts w:ascii="Aptos" w:eastAsia="Times New Roman" w:hAnsi="Aptos"/>
-              <w:color w:val="000000"/>
-              <w:lang w:val="en-US"/>
-            </w:rPr>
-            <w:t xml:space="preserve"> Inc. (2026). </w:t>
-          </w:r>
           <w:r>
             <w:rPr>
               <w:rFonts w:ascii="Aptos" w:eastAsia="Times New Roman" w:hAnsi="Aptos"/>
@@ -377,15 +802,26 @@
               <w:color w:val="000000"/>
               <w:lang w:val="en-US"/>
             </w:rPr>
-            <w:t>NERV Disaster Prevention</w:t>
-          </w:r>
-          <w:r>
-            <w:rPr>
-              <w:rFonts w:ascii="Aptos" w:eastAsia="Times New Roman" w:hAnsi="Aptos"/>
-              <w:color w:val="000000"/>
-              <w:lang w:val="en-US"/>
-            </w:rPr>
-            <w:t>. https://play.google.com/store/apps/details?id=app.nerv&amp;hl=en</w:t>
+            <w:t>Disastermon</w:t>
+          </w:r>
+          <w:proofErr w:type="spellEnd"/>
+          <w:r>
+            <w:rPr>
+              <w:rFonts w:ascii="Aptos" w:eastAsia="Times New Roman" w:hAnsi="Aptos"/>
+              <w:i/>
+              <w:iCs/>
+              <w:color w:val="000000"/>
+              <w:lang w:val="en-US"/>
+            </w:rPr>
+            <w:t xml:space="preserve"> Natural Disaster Monitor</w:t>
+          </w:r>
+          <w:r>
+            <w:rPr>
+              <w:rFonts w:ascii="Aptos" w:eastAsia="Times New Roman" w:hAnsi="Aptos"/>
+              <w:color w:val="000000"/>
+              <w:lang w:val="en-US"/>
+            </w:rPr>
+            <w:t>. https://play.google.com/store/apps/details?id=com.dom925.disastermon&amp;hl=en</w:t>
           </w:r>
         </w:p>
         <w:p>
@@ -393,7 +829,7 @@
             <w:autoSpaceDE w:val="0"/>
             <w:autoSpaceDN w:val="0"/>
             <w:ind w:hanging="480"/>
-            <w:divId w:val="1012340982"/>
+            <w:divId w:val="2123063385"/>
             <w:rPr>
               <w:rFonts w:ascii="Aptos" w:eastAsia="Times New Roman" w:hAnsi="Aptos"/>
               <w:color w:val="000000"/>
@@ -407,7 +843,7 @@
               <w:color w:val="000000"/>
               <w:lang w:val="en-US"/>
             </w:rPr>
-            <w:t>Kankanamge</w:t>
+            <w:t>Gehirn</w:t>
           </w:r>
           <w:proofErr w:type="spellEnd"/>
           <w:r>
@@ -416,61 +852,7 @@
               <w:color w:val="000000"/>
               <w:lang w:val="en-US"/>
             </w:rPr>
-            <w:t xml:space="preserve">, N., </w:t>
-          </w:r>
-          <w:proofErr w:type="spellStart"/>
-          <w:r>
-            <w:rPr>
-              <w:rFonts w:ascii="Aptos" w:eastAsia="Times New Roman" w:hAnsi="Aptos"/>
-              <w:color w:val="000000"/>
-              <w:lang w:val="en-US"/>
-            </w:rPr>
-            <w:t>Yigitcanlar</w:t>
-          </w:r>
-          <w:proofErr w:type="spellEnd"/>
-          <w:r>
-            <w:rPr>
-              <w:rFonts w:ascii="Aptos" w:eastAsia="Times New Roman" w:hAnsi="Aptos"/>
-              <w:color w:val="000000"/>
-              <w:lang w:val="en-US"/>
-            </w:rPr>
-            <w:t xml:space="preserve">, T., Goonetilleke, A., &amp; </w:t>
-          </w:r>
-          <w:proofErr w:type="spellStart"/>
-          <w:r>
-            <w:rPr>
-              <w:rFonts w:ascii="Aptos" w:eastAsia="Times New Roman" w:hAnsi="Aptos"/>
-              <w:color w:val="000000"/>
-              <w:lang w:val="en-US"/>
-            </w:rPr>
-            <w:t>Kamruzzaman</w:t>
-          </w:r>
-          <w:proofErr w:type="spellEnd"/>
-          <w:r>
-            <w:rPr>
-              <w:rFonts w:ascii="Aptos" w:eastAsia="Times New Roman" w:hAnsi="Aptos"/>
-              <w:color w:val="000000"/>
-              <w:lang w:val="en-US"/>
-            </w:rPr>
-            <w:t xml:space="preserve">, M. (2020). How can gamification be incorporated into disaster emergency planning? A systematic review of </w:t>
-          </w:r>
-          <w:proofErr w:type="gramStart"/>
-          <w:r>
-            <w:rPr>
-              <w:rFonts w:ascii="Aptos" w:eastAsia="Times New Roman" w:hAnsi="Aptos"/>
-              <w:color w:val="000000"/>
-              <w:lang w:val="en-US"/>
-            </w:rPr>
-            <w:t>the literature</w:t>
-          </w:r>
-          <w:proofErr w:type="gramEnd"/>
-          <w:r>
-            <w:rPr>
-              <w:rFonts w:ascii="Aptos" w:eastAsia="Times New Roman" w:hAnsi="Aptos"/>
-              <w:color w:val="000000"/>
-              <w:lang w:val="en-US"/>
-            </w:rPr>
-            <w:t xml:space="preserve">. In </w:t>
+            <w:t xml:space="preserve"> Inc. (2026). </w:t>
           </w:r>
           <w:r>
             <w:rPr>
@@ -480,15 +862,15 @@
               <w:color w:val="000000"/>
               <w:lang w:val="en-US"/>
             </w:rPr>
-            <w:t>International Journal of Disaster Resilience in the Built Environment</w:t>
-          </w:r>
-          <w:r>
-            <w:rPr>
-              <w:rFonts w:ascii="Aptos" w:eastAsia="Times New Roman" w:hAnsi="Aptos"/>
-              <w:color w:val="000000"/>
-              <w:lang w:val="en-US"/>
-            </w:rPr>
-            <w:t xml:space="preserve"> (Vol. 11, Number 4, pp. 481–506). Emerald Group Holdings Ltd. https://doi.org/10.1108/IJDRBE-08-2019-0054</w:t>
+            <w:t>NERV Disaster Prevention</w:t>
+          </w:r>
+          <w:r>
+            <w:rPr>
+              <w:rFonts w:ascii="Aptos" w:eastAsia="Times New Roman" w:hAnsi="Aptos"/>
+              <w:color w:val="000000"/>
+              <w:lang w:val="en-US"/>
+            </w:rPr>
+            <w:t>. https://play.google.com/store/apps/details?id=app.nerv&amp;hl=en</w:t>
           </w:r>
         </w:p>
         <w:p>
@@ -496,21 +878,13 @@
             <w:autoSpaceDE w:val="0"/>
             <w:autoSpaceDN w:val="0"/>
             <w:ind w:hanging="480"/>
-            <w:divId w:val="722485007"/>
-            <w:rPr>
-              <w:rFonts w:ascii="Aptos" w:eastAsia="Times New Roman" w:hAnsi="Aptos"/>
-              <w:color w:val="000000"/>
-              <w:lang w:val="de-AT"/>
+            <w:divId w:val="422073192"/>
+            <w:rPr>
+              <w:rFonts w:ascii="Aptos" w:eastAsia="Times New Roman" w:hAnsi="Aptos"/>
+              <w:color w:val="000000"/>
+              <w:lang w:val="en-US"/>
             </w:rPr>
           </w:pPr>
-          <w:r>
-            <w:rPr>
-              <w:rFonts w:ascii="Aptos" w:eastAsia="Times New Roman" w:hAnsi="Aptos"/>
-              <w:color w:val="000000"/>
-              <w:lang w:val="en-US"/>
-            </w:rPr>
-            <w:t xml:space="preserve">Matsuno, Y., </w:t>
-          </w:r>
           <w:proofErr w:type="spellStart"/>
           <w:r>
             <w:rPr>
@@ -518,7 +892,7 @@
               <w:color w:val="000000"/>
               <w:lang w:val="en-US"/>
             </w:rPr>
-            <w:t>Fukanuma</w:t>
+            <w:t>GeoSphere</w:t>
           </w:r>
           <w:proofErr w:type="spellEnd"/>
           <w:r>
@@ -527,7 +901,7 @@
               <w:color w:val="000000"/>
               <w:lang w:val="en-US"/>
             </w:rPr>
-            <w:t xml:space="preserve">, F., &amp; Tsuruoka, S. (n.d.). </w:t>
+            <w:t xml:space="preserve"> Austria. (n.d.). </w:t>
           </w:r>
           <w:r>
             <w:rPr>
@@ -537,7 +911,29 @@
               <w:color w:val="000000"/>
               <w:lang w:val="en-US"/>
             </w:rPr>
-            <w:t>Development of Flood Disaster Prevention Simulation Smartphone Application Using Gamification</w:t>
+            <w:t xml:space="preserve">Warn API v1: </w:t>
+          </w:r>
+          <w:proofErr w:type="spellStart"/>
+          <w:r>
+            <w:rPr>
+              <w:rFonts w:ascii="Aptos" w:eastAsia="Times New Roman" w:hAnsi="Aptos"/>
+              <w:i/>
+              <w:iCs/>
+              <w:color w:val="000000"/>
+              <w:lang w:val="en-US"/>
+            </w:rPr>
+            <w:t>OpenAPI</w:t>
+          </w:r>
+          <w:proofErr w:type="spellEnd"/>
+          <w:r>
+            <w:rPr>
+              <w:rFonts w:ascii="Aptos" w:eastAsia="Times New Roman" w:hAnsi="Aptos"/>
+              <w:i/>
+              <w:iCs/>
+              <w:color w:val="000000"/>
+              <w:lang w:val="en-US"/>
+            </w:rPr>
+            <w:t xml:space="preserve"> Documentation</w:t>
           </w:r>
           <w:r>
             <w:rPr>
@@ -547,13 +943,23 @@
             </w:rPr>
             <w:t xml:space="preserve">. </w:t>
           </w:r>
-          <w:r>
-            <w:rPr>
-              <w:rFonts w:ascii="Aptos" w:eastAsia="Times New Roman" w:hAnsi="Aptos"/>
-              <w:color w:val="000000"/>
-              <w:lang w:val="de-AT"/>
-            </w:rPr>
-            <w:t>Retrieved https://www.pokemongo.com</w:t>
+          <w:proofErr w:type="spellStart"/>
+          <w:r>
+            <w:rPr>
+              <w:rFonts w:ascii="Aptos" w:eastAsia="Times New Roman" w:hAnsi="Aptos"/>
+              <w:color w:val="000000"/>
+              <w:lang w:val="en-US"/>
+            </w:rPr>
+            <w:t>GeoSphere</w:t>
+          </w:r>
+          <w:proofErr w:type="spellEnd"/>
+          <w:r>
+            <w:rPr>
+              <w:rFonts w:ascii="Aptos" w:eastAsia="Times New Roman" w:hAnsi="Aptos"/>
+              <w:color w:val="000000"/>
+              <w:lang w:val="en-US"/>
+            </w:rPr>
+            <w:t xml:space="preserve"> Austria Swagger UI. Retrieved May 11, 2026, from https://openapi.hub.geosphere.at/warnapi/v1/</w:t>
           </w:r>
         </w:p>
         <w:p>
@@ -561,20 +967,84 @@
             <w:autoSpaceDE w:val="0"/>
             <w:autoSpaceDN w:val="0"/>
             <w:ind w:hanging="480"/>
-            <w:divId w:val="2090689380"/>
-            <w:rPr>
-              <w:rFonts w:ascii="Aptos" w:eastAsia="Times New Roman" w:hAnsi="Aptos"/>
-              <w:color w:val="000000"/>
-              <w:lang w:val="de-AT"/>
+            <w:divId w:val="1087917362"/>
+            <w:rPr>
+              <w:rFonts w:ascii="Aptos" w:eastAsia="Times New Roman" w:hAnsi="Aptos"/>
+              <w:color w:val="000000"/>
+              <w:lang w:val="en-US"/>
             </w:rPr>
           </w:pPr>
-          <w:r>
-            <w:rPr>
-              <w:rFonts w:ascii="Aptos" w:eastAsia="Times New Roman" w:hAnsi="Aptos"/>
-              <w:color w:val="000000"/>
-              <w:lang w:val="de-AT"/>
-            </w:rPr>
-            <w:t xml:space="preserve">Österr. Rotes Kreuz, L. S. (2024). </w:t>
+          <w:proofErr w:type="spellStart"/>
+          <w:r>
+            <w:rPr>
+              <w:rFonts w:ascii="Aptos" w:eastAsia="Times New Roman" w:hAnsi="Aptos"/>
+              <w:color w:val="000000"/>
+              <w:lang w:val="en-US"/>
+            </w:rPr>
+            <w:t>Kankanamge</w:t>
+          </w:r>
+          <w:proofErr w:type="spellEnd"/>
+          <w:r>
+            <w:rPr>
+              <w:rFonts w:ascii="Aptos" w:eastAsia="Times New Roman" w:hAnsi="Aptos"/>
+              <w:color w:val="000000"/>
+              <w:lang w:val="en-US"/>
+            </w:rPr>
+            <w:t xml:space="preserve">, N., </w:t>
+          </w:r>
+          <w:proofErr w:type="spellStart"/>
+          <w:r>
+            <w:rPr>
+              <w:rFonts w:ascii="Aptos" w:eastAsia="Times New Roman" w:hAnsi="Aptos"/>
+              <w:color w:val="000000"/>
+              <w:lang w:val="en-US"/>
+            </w:rPr>
+            <w:t>Yigitcanlar</w:t>
+          </w:r>
+          <w:proofErr w:type="spellEnd"/>
+          <w:r>
+            <w:rPr>
+              <w:rFonts w:ascii="Aptos" w:eastAsia="Times New Roman" w:hAnsi="Aptos"/>
+              <w:color w:val="000000"/>
+              <w:lang w:val="en-US"/>
+            </w:rPr>
+            <w:t xml:space="preserve">, T., Goonetilleke, A., &amp; </w:t>
+          </w:r>
+          <w:proofErr w:type="spellStart"/>
+          <w:r>
+            <w:rPr>
+              <w:rFonts w:ascii="Aptos" w:eastAsia="Times New Roman" w:hAnsi="Aptos"/>
+              <w:color w:val="000000"/>
+              <w:lang w:val="en-US"/>
+            </w:rPr>
+            <w:t>Kamruzzaman</w:t>
+          </w:r>
+          <w:proofErr w:type="spellEnd"/>
+          <w:r>
+            <w:rPr>
+              <w:rFonts w:ascii="Aptos" w:eastAsia="Times New Roman" w:hAnsi="Aptos"/>
+              <w:color w:val="000000"/>
+              <w:lang w:val="en-US"/>
+            </w:rPr>
+            <w:t xml:space="preserve">, M. (2020). How can gamification be incorporated into disaster emergency planning? A systematic review of </w:t>
+          </w:r>
+          <w:proofErr w:type="gramStart"/>
+          <w:r>
+            <w:rPr>
+              <w:rFonts w:ascii="Aptos" w:eastAsia="Times New Roman" w:hAnsi="Aptos"/>
+              <w:color w:val="000000"/>
+              <w:lang w:val="en-US"/>
+            </w:rPr>
+            <w:t>the literature</w:t>
+          </w:r>
+          <w:proofErr w:type="gramEnd"/>
+          <w:r>
+            <w:rPr>
+              <w:rFonts w:ascii="Aptos" w:eastAsia="Times New Roman" w:hAnsi="Aptos"/>
+              <w:color w:val="000000"/>
+              <w:lang w:val="en-US"/>
+            </w:rPr>
+            <w:t xml:space="preserve">. </w:t>
           </w:r>
           <w:r>
             <w:rPr>
@@ -582,17 +1052,35 @@
               <w:i/>
               <w:iCs/>
               <w:color w:val="000000"/>
-              <w:lang w:val="de-AT"/>
-            </w:rPr>
-            <w:t>Erste Hilfe - Rotes Kreuz</w:t>
-          </w:r>
-          <w:r>
-            <w:rPr>
-              <w:rFonts w:ascii="Aptos" w:eastAsia="Times New Roman" w:hAnsi="Aptos"/>
-              <w:color w:val="000000"/>
-              <w:lang w:val="de-AT"/>
-            </w:rPr>
-            <w:t>. https://play.google.com/store/apps/details?id=at.roteskreuz.st.erstehilfe&amp;hl=en</w:t>
+              <w:lang w:val="en-US"/>
+            </w:rPr>
+            <w:t>International Journal of Disaster Resilience in the Built Environment</w:t>
+          </w:r>
+          <w:r>
+            <w:rPr>
+              <w:rFonts w:ascii="Aptos" w:eastAsia="Times New Roman" w:hAnsi="Aptos"/>
+              <w:color w:val="000000"/>
+              <w:lang w:val="en-US"/>
+            </w:rPr>
+            <w:t xml:space="preserve">, </w:t>
+          </w:r>
+          <w:r>
+            <w:rPr>
+              <w:rFonts w:ascii="Aptos" w:eastAsia="Times New Roman" w:hAnsi="Aptos"/>
+              <w:i/>
+              <w:iCs/>
+              <w:color w:val="000000"/>
+              <w:lang w:val="en-US"/>
+            </w:rPr>
+            <w:t>11</w:t>
+          </w:r>
+          <w:r>
+            <w:rPr>
+              <w:rFonts w:ascii="Aptos" w:eastAsia="Times New Roman" w:hAnsi="Aptos"/>
+              <w:color w:val="000000"/>
+              <w:lang w:val="en-US"/>
+            </w:rPr>
+            <w:t>(4), 481–506. https://doi.org/10.1108/IJDRBE-08-2019-0054</w:t>
           </w:r>
         </w:p>
         <w:p>
@@ -600,7 +1088,7 @@
             <w:autoSpaceDE w:val="0"/>
             <w:autoSpaceDN w:val="0"/>
             <w:ind w:hanging="480"/>
-            <w:divId w:val="639309817"/>
+            <w:divId w:val="891309475"/>
             <w:rPr>
               <w:rFonts w:ascii="Aptos" w:eastAsia="Times New Roman" w:hAnsi="Aptos"/>
               <w:color w:val="000000"/>
@@ -611,11 +1099,33 @@
             <w:rPr>
               <w:rFonts w:ascii="Aptos" w:eastAsia="Times New Roman" w:hAnsi="Aptos"/>
               <w:color w:val="000000"/>
-              <w:lang w:val="en-US"/>
-            </w:rPr>
-            <w:t xml:space="preserve">SOBOS GmbH. (2026). </w:t>
+            </w:rPr>
+            <w:t xml:space="preserve">Matsuno, Y., </w:t>
           </w:r>
           <w:proofErr w:type="spellStart"/>
+          <w:r>
+            <w:rPr>
+              <w:rFonts w:ascii="Aptos" w:eastAsia="Times New Roman" w:hAnsi="Aptos"/>
+              <w:color w:val="000000"/>
+            </w:rPr>
+            <w:t>Fukanuma</w:t>
+          </w:r>
+          <w:proofErr w:type="spellEnd"/>
+          <w:r>
+            <w:rPr>
+              <w:rFonts w:ascii="Aptos" w:eastAsia="Times New Roman" w:hAnsi="Aptos"/>
+              <w:color w:val="000000"/>
+            </w:rPr>
+            <w:t xml:space="preserve">, F., &amp; Tsuruoka, S. (2021). </w:t>
+          </w:r>
+          <w:r>
+            <w:rPr>
+              <w:rFonts w:ascii="Aptos" w:eastAsia="Times New Roman" w:hAnsi="Aptos"/>
+              <w:color w:val="000000"/>
+              <w:lang w:val="en-US"/>
+            </w:rPr>
+            <w:t xml:space="preserve">Development of Flood Disaster Prevention Simulation Smartphone Application Using Gamification. </w:t>
+          </w:r>
           <w:r>
             <w:rPr>
               <w:rFonts w:ascii="Aptos" w:eastAsia="Times New Roman" w:hAnsi="Aptos"/>
@@ -624,48 +1134,15 @@
               <w:color w:val="000000"/>
               <w:lang w:val="en-US"/>
             </w:rPr>
-            <w:t>FloodAlert</w:t>
-          </w:r>
-          <w:proofErr w:type="spellEnd"/>
-          <w:r>
-            <w:rPr>
-              <w:rFonts w:ascii="Aptos" w:eastAsia="Times New Roman" w:hAnsi="Aptos"/>
-              <w:i/>
-              <w:iCs/>
-              <w:color w:val="000000"/>
-              <w:lang w:val="en-US"/>
-            </w:rPr>
-            <w:t xml:space="preserve"> </w:t>
-          </w:r>
-          <w:proofErr w:type="spellStart"/>
-          <w:r>
-            <w:rPr>
-              <w:rFonts w:ascii="Aptos" w:eastAsia="Times New Roman" w:hAnsi="Aptos"/>
-              <w:i/>
-              <w:iCs/>
-              <w:color w:val="000000"/>
-              <w:lang w:val="en-US"/>
-            </w:rPr>
-            <w:t>Waterlevel</w:t>
-          </w:r>
-          <w:proofErr w:type="spellEnd"/>
-          <w:r>
-            <w:rPr>
-              <w:rFonts w:ascii="Aptos" w:eastAsia="Times New Roman" w:hAnsi="Aptos"/>
-              <w:i/>
-              <w:iCs/>
-              <w:color w:val="000000"/>
-              <w:lang w:val="en-US"/>
-            </w:rPr>
-            <w:t xml:space="preserve"> Alerts</w:t>
-          </w:r>
-          <w:r>
-            <w:rPr>
-              <w:rFonts w:ascii="Aptos" w:eastAsia="Times New Roman" w:hAnsi="Aptos"/>
-              <w:color w:val="000000"/>
-              <w:lang w:val="en-US"/>
-            </w:rPr>
-            <w:t>. https://play.google.com/store/apps/details?id=at.pegelalarm.app&amp;hl=en</w:t>
+            <w:t>Dynamics of Disasters: Impact, Risk, Resilience, and Solutions</w:t>
+          </w:r>
+          <w:r>
+            <w:rPr>
+              <w:rFonts w:ascii="Aptos" w:eastAsia="Times New Roman" w:hAnsi="Aptos"/>
+              <w:color w:val="000000"/>
+              <w:lang w:val="en-US"/>
+            </w:rPr>
+            <w:t>, 147–159.</w:t>
           </w:r>
         </w:p>
         <w:p>
@@ -673,7 +1150,7 @@
             <w:autoSpaceDE w:val="0"/>
             <w:autoSpaceDN w:val="0"/>
             <w:ind w:hanging="480"/>
-            <w:divId w:val="852690669"/>
+            <w:divId w:val="931818446"/>
             <w:rPr>
               <w:rFonts w:ascii="Aptos" w:eastAsia="Times New Roman" w:hAnsi="Aptos"/>
               <w:color w:val="000000"/>
@@ -684,108 +1161,45 @@
             <w:rPr>
               <w:rFonts w:ascii="Aptos" w:eastAsia="Times New Roman" w:hAnsi="Aptos"/>
               <w:color w:val="000000"/>
-            </w:rPr>
-            <w:t xml:space="preserve">Toledo, M. P., </w:t>
+              <w:lang w:val="en-US"/>
+            </w:rPr>
+            <w:t xml:space="preserve">Nagaraju, M. S., </w:t>
           </w:r>
           <w:proofErr w:type="spellStart"/>
           <w:r>
             <w:rPr>
               <w:rFonts w:ascii="Aptos" w:eastAsia="Times New Roman" w:hAnsi="Aptos"/>
               <w:color w:val="000000"/>
-            </w:rPr>
-            <w:t>Sarvida</w:t>
+              <w:lang w:val="en-US"/>
+            </w:rPr>
+            <w:t>Kakarala</w:t>
           </w:r>
           <w:proofErr w:type="spellEnd"/>
           <w:r>
             <w:rPr>
               <w:rFonts w:ascii="Aptos" w:eastAsia="Times New Roman" w:hAnsi="Aptos"/>
               <w:color w:val="000000"/>
-            </w:rPr>
-            <w:t xml:space="preserve">, J. C. Y., </w:t>
+              <w:lang w:val="en-US"/>
+            </w:rPr>
+            <w:t xml:space="preserve">, H., Sai, V., &amp; </w:t>
           </w:r>
           <w:proofErr w:type="spellStart"/>
           <w:r>
             <w:rPr>
               <w:rFonts w:ascii="Aptos" w:eastAsia="Times New Roman" w:hAnsi="Aptos"/>
               <w:color w:val="000000"/>
-            </w:rPr>
-            <w:t>Patiten</w:t>
+              <w:lang w:val="en-US"/>
+            </w:rPr>
+            <w:t>Vattikunta</w:t>
           </w:r>
           <w:proofErr w:type="spellEnd"/>
           <w:r>
             <w:rPr>
               <w:rFonts w:ascii="Aptos" w:eastAsia="Times New Roman" w:hAnsi="Aptos"/>
               <w:color w:val="000000"/>
-            </w:rPr>
-            <w:t xml:space="preserve">, B. K. S., </w:t>
-          </w:r>
-          <w:proofErr w:type="spellStart"/>
-          <w:r>
-            <w:rPr>
-              <w:rFonts w:ascii="Aptos" w:eastAsia="Times New Roman" w:hAnsi="Aptos"/>
-              <w:color w:val="000000"/>
-            </w:rPr>
-            <w:t>Mitamura</w:t>
-          </w:r>
-          <w:proofErr w:type="spellEnd"/>
-          <w:r>
-            <w:rPr>
-              <w:rFonts w:ascii="Aptos" w:eastAsia="Times New Roman" w:hAnsi="Aptos"/>
-              <w:color w:val="000000"/>
-            </w:rPr>
-            <w:t xml:space="preserve">, D. C. R., &amp; </w:t>
-          </w:r>
-          <w:proofErr w:type="spellStart"/>
-          <w:r>
-            <w:rPr>
-              <w:rFonts w:ascii="Aptos" w:eastAsia="Times New Roman" w:hAnsi="Aptos"/>
-              <w:color w:val="000000"/>
-            </w:rPr>
-            <w:t>Guadana</w:t>
-          </w:r>
-          <w:proofErr w:type="spellEnd"/>
-          <w:r>
-            <w:rPr>
-              <w:rFonts w:ascii="Aptos" w:eastAsia="Times New Roman" w:hAnsi="Aptos"/>
-              <w:color w:val="000000"/>
-            </w:rPr>
-            <w:t xml:space="preserve">, R. R. H. (2017). </w:t>
-          </w:r>
-          <w:proofErr w:type="spellStart"/>
-          <w:r>
-            <w:rPr>
-              <w:rFonts w:ascii="Aptos" w:eastAsia="Times New Roman" w:hAnsi="Aptos"/>
-              <w:color w:val="000000"/>
-              <w:lang w:val="en-US"/>
-            </w:rPr>
-            <w:t>SakunAPP</w:t>
-          </w:r>
-          <w:proofErr w:type="spellEnd"/>
-          <w:r>
-            <w:rPr>
-              <w:rFonts w:ascii="Aptos" w:eastAsia="Times New Roman" w:hAnsi="Aptos"/>
-              <w:color w:val="000000"/>
-              <w:lang w:val="en-US"/>
-            </w:rPr>
-            <w:t xml:space="preserve">: A framework for mobile application development in disaster awareness, </w:t>
-          </w:r>
-          <w:proofErr w:type="gramStart"/>
-          <w:r>
-            <w:rPr>
-              <w:rFonts w:ascii="Aptos" w:eastAsia="Times New Roman" w:hAnsi="Aptos"/>
-              <w:color w:val="000000"/>
-              <w:lang w:val="en-US"/>
-            </w:rPr>
-            <w:t>preparedness</w:t>
-          </w:r>
-          <w:proofErr w:type="gramEnd"/>
-          <w:r>
-            <w:rPr>
-              <w:rFonts w:ascii="Aptos" w:eastAsia="Times New Roman" w:hAnsi="Aptos"/>
-              <w:color w:val="000000"/>
-              <w:lang w:val="en-US"/>
-            </w:rPr>
-            <w:t xml:space="preserve"> and response. </w:t>
+              <w:lang w:val="en-US"/>
+            </w:rPr>
+            <w:t xml:space="preserve">, V. P. (2024). Mobile Application for Disaster Safety Management. </w:t>
           </w:r>
           <w:r>
             <w:rPr>
@@ -795,15 +1209,15 @@
               <w:color w:val="000000"/>
               <w:lang w:val="en-US"/>
             </w:rPr>
-            <w:t>TENCON 2017 - 2017 IEEE Region 10 Conference</w:t>
-          </w:r>
-          <w:r>
-            <w:rPr>
-              <w:rFonts w:ascii="Aptos" w:eastAsia="Times New Roman" w:hAnsi="Aptos"/>
-              <w:color w:val="000000"/>
-              <w:lang w:val="en-US"/>
-            </w:rPr>
-            <w:t>, 2759–2764. https://doi.org/10.1109/TENCON.2017.8228331</w:t>
+            <w:t>10th International Conference on Advanced Computing and Communication Systems, ICACCS 2024</w:t>
+          </w:r>
+          <w:r>
+            <w:rPr>
+              <w:rFonts w:ascii="Aptos" w:eastAsia="Times New Roman" w:hAnsi="Aptos"/>
+              <w:color w:val="000000"/>
+              <w:lang w:val="en-US"/>
+            </w:rPr>
+            <w:t>, 1008–1013. https://doi.org/10.1109/ICACCS60874.2024.10717114</w:t>
           </w:r>
         </w:p>
         <w:p>
@@ -811,31 +1225,20 @@
             <w:autoSpaceDE w:val="0"/>
             <w:autoSpaceDN w:val="0"/>
             <w:ind w:hanging="480"/>
-            <w:divId w:val="57942773"/>
+            <w:divId w:val="1003237630"/>
             <w:rPr>
               <w:rFonts w:ascii="Aptos" w:eastAsia="Times New Roman" w:hAnsi="Aptos"/>
               <w:color w:val="000000"/>
               <w:lang w:val="de-AT"/>
             </w:rPr>
           </w:pPr>
-          <w:proofErr w:type="spellStart"/>
-          <w:r>
-            <w:rPr>
-              <w:rFonts w:ascii="Aptos" w:eastAsia="Times New Roman" w:hAnsi="Aptos"/>
-              <w:color w:val="000000"/>
-              <w:lang w:val="en-US"/>
-            </w:rPr>
-            <w:lastRenderedPageBreak/>
-            <w:t>Ubimet</w:t>
-          </w:r>
-          <w:proofErr w:type="spellEnd"/>
-          <w:r>
-            <w:rPr>
-              <w:rFonts w:ascii="Aptos" w:eastAsia="Times New Roman" w:hAnsi="Aptos"/>
-              <w:color w:val="000000"/>
-              <w:lang w:val="en-US"/>
-            </w:rPr>
-            <w:t xml:space="preserve"> Int. AG. (2025). </w:t>
+          <w:r>
+            <w:rPr>
+              <w:rFonts w:ascii="Aptos" w:eastAsia="Times New Roman" w:hAnsi="Aptos"/>
+              <w:color w:val="000000"/>
+              <w:lang w:val="de-AT"/>
+            </w:rPr>
+            <w:t xml:space="preserve">Österr. Rotes Kreuz, L. S. (2024). </w:t>
           </w:r>
           <w:r>
             <w:rPr>
@@ -845,7 +1248,7 @@
               <w:color w:val="000000"/>
               <w:lang w:val="de-AT"/>
             </w:rPr>
-            <w:t>UWZ Österreich: Gewitter Sturm</w:t>
+            <w:t>Erste Hilfe - Rotes Kreuz</w:t>
           </w:r>
           <w:r>
             <w:rPr>
@@ -853,7 +1256,7 @@
               <w:color w:val="000000"/>
               <w:lang w:val="de-AT"/>
             </w:rPr>
-            <w:t>. https://play.google.com/store/apps/details?id=com.ubimet.uwz&amp;hl=en</w:t>
+            <w:t>. https://play.google.com/store/apps/details?id=at.roteskreuz.st.erstehilfe&amp;hl=en</w:t>
           </w:r>
         </w:p>
         <w:p>
@@ -861,7 +1264,7 @@
             <w:autoSpaceDE w:val="0"/>
             <w:autoSpaceDN w:val="0"/>
             <w:ind w:hanging="480"/>
-            <w:divId w:val="1295672560"/>
+            <w:divId w:val="1897429126"/>
             <w:rPr>
               <w:rFonts w:ascii="Aptos" w:eastAsia="Times New Roman" w:hAnsi="Aptos"/>
               <w:color w:val="000000"/>
@@ -872,9 +1275,17 @@
             <w:rPr>
               <w:rFonts w:ascii="Aptos" w:eastAsia="Times New Roman" w:hAnsi="Aptos"/>
               <w:color w:val="000000"/>
-              <w:lang w:val="en-US"/>
-            </w:rPr>
-            <w:t xml:space="preserve">West, D. M., &amp; Valentini, E. (2013). How Mobile Devices are Transforming Disaster Relief and Public Safety. </w:t>
+              <w:lang w:val="de-AT"/>
+            </w:rPr>
+            <w:t xml:space="preserve">Rundfunk und Telekom Regulierungs GmbH. </w:t>
+          </w:r>
+          <w:r>
+            <w:rPr>
+              <w:rFonts w:ascii="Aptos" w:eastAsia="Times New Roman" w:hAnsi="Aptos"/>
+              <w:color w:val="000000"/>
+              <w:lang w:val="en-US"/>
+            </w:rPr>
+            <w:t xml:space="preserve">(n.d.). </w:t>
           </w:r>
           <w:r>
             <w:rPr>
@@ -884,6 +1295,341 @@
               <w:color w:val="000000"/>
               <w:lang w:val="en-US"/>
             </w:rPr>
+            <w:t>AT-Alert Web Dashboard</w:t>
+          </w:r>
+          <w:r>
+            <w:rPr>
+              <w:rFonts w:ascii="Aptos" w:eastAsia="Times New Roman" w:hAnsi="Aptos"/>
+              <w:color w:val="000000"/>
+              <w:lang w:val="en-US"/>
+            </w:rPr>
+            <w:t xml:space="preserve">. AT-Alert - </w:t>
+          </w:r>
+          <w:proofErr w:type="spellStart"/>
+          <w:r>
+            <w:rPr>
+              <w:rFonts w:ascii="Aptos" w:eastAsia="Times New Roman" w:hAnsi="Aptos"/>
+              <w:color w:val="000000"/>
+              <w:lang w:val="en-US"/>
+            </w:rPr>
+            <w:t>Öffentliches</w:t>
+          </w:r>
+          <w:proofErr w:type="spellEnd"/>
+          <w:r>
+            <w:rPr>
+              <w:rFonts w:ascii="Aptos" w:eastAsia="Times New Roman" w:hAnsi="Aptos"/>
+              <w:color w:val="000000"/>
+              <w:lang w:val="en-US"/>
+            </w:rPr>
+            <w:t xml:space="preserve"> </w:t>
+          </w:r>
+          <w:proofErr w:type="spellStart"/>
+          <w:r>
+            <w:rPr>
+              <w:rFonts w:ascii="Aptos" w:eastAsia="Times New Roman" w:hAnsi="Aptos"/>
+              <w:color w:val="000000"/>
+              <w:lang w:val="en-US"/>
+            </w:rPr>
+            <w:t>Warnsystem</w:t>
+          </w:r>
+          <w:proofErr w:type="spellEnd"/>
+          <w:r>
+            <w:rPr>
+              <w:rFonts w:ascii="Aptos" w:eastAsia="Times New Roman" w:hAnsi="Aptos"/>
+              <w:color w:val="000000"/>
+              <w:lang w:val="en-US"/>
+            </w:rPr>
+            <w:t>. Retrieved May 11, 2026, from https://warnungen.at-alert.at/en</w:t>
+          </w:r>
+        </w:p>
+        <w:p>
+          <w:pPr>
+            <w:autoSpaceDE w:val="0"/>
+            <w:autoSpaceDN w:val="0"/>
+            <w:ind w:hanging="480"/>
+            <w:divId w:val="1442912828"/>
+            <w:rPr>
+              <w:rFonts w:ascii="Aptos" w:eastAsia="Times New Roman" w:hAnsi="Aptos"/>
+              <w:color w:val="000000"/>
+              <w:lang w:val="en-US"/>
+            </w:rPr>
+          </w:pPr>
+          <w:r>
+            <w:rPr>
+              <w:rFonts w:ascii="Aptos" w:eastAsia="Times New Roman" w:hAnsi="Aptos"/>
+              <w:color w:val="000000"/>
+              <w:lang w:val="en-US"/>
+            </w:rPr>
+            <w:t xml:space="preserve">SOBOS GmbH. (2026). </w:t>
+          </w:r>
+          <w:proofErr w:type="spellStart"/>
+          <w:r>
+            <w:rPr>
+              <w:rFonts w:ascii="Aptos" w:eastAsia="Times New Roman" w:hAnsi="Aptos"/>
+              <w:i/>
+              <w:iCs/>
+              <w:color w:val="000000"/>
+              <w:lang w:val="en-US"/>
+            </w:rPr>
+            <w:t>FloodAlert</w:t>
+          </w:r>
+          <w:proofErr w:type="spellEnd"/>
+          <w:r>
+            <w:rPr>
+              <w:rFonts w:ascii="Aptos" w:eastAsia="Times New Roman" w:hAnsi="Aptos"/>
+              <w:i/>
+              <w:iCs/>
+              <w:color w:val="000000"/>
+              <w:lang w:val="en-US"/>
+            </w:rPr>
+            <w:t xml:space="preserve"> </w:t>
+          </w:r>
+          <w:proofErr w:type="spellStart"/>
+          <w:r>
+            <w:rPr>
+              <w:rFonts w:ascii="Aptos" w:eastAsia="Times New Roman" w:hAnsi="Aptos"/>
+              <w:i/>
+              <w:iCs/>
+              <w:color w:val="000000"/>
+              <w:lang w:val="en-US"/>
+            </w:rPr>
+            <w:t>Waterlevel</w:t>
+          </w:r>
+          <w:proofErr w:type="spellEnd"/>
+          <w:r>
+            <w:rPr>
+              <w:rFonts w:ascii="Aptos" w:eastAsia="Times New Roman" w:hAnsi="Aptos"/>
+              <w:i/>
+              <w:iCs/>
+              <w:color w:val="000000"/>
+              <w:lang w:val="en-US"/>
+            </w:rPr>
+            <w:t xml:space="preserve"> Alerts</w:t>
+          </w:r>
+          <w:r>
+            <w:rPr>
+              <w:rFonts w:ascii="Aptos" w:eastAsia="Times New Roman" w:hAnsi="Aptos"/>
+              <w:color w:val="000000"/>
+              <w:lang w:val="en-US"/>
+            </w:rPr>
+            <w:t>. https://play.google.com/store/apps/details?id=at.pegelalarm.app&amp;hl=en</w:t>
+          </w:r>
+        </w:p>
+        <w:p>
+          <w:pPr>
+            <w:autoSpaceDE w:val="0"/>
+            <w:autoSpaceDN w:val="0"/>
+            <w:ind w:hanging="480"/>
+            <w:divId w:val="1875193148"/>
+            <w:rPr>
+              <w:rFonts w:ascii="Aptos" w:eastAsia="Times New Roman" w:hAnsi="Aptos"/>
+              <w:color w:val="000000"/>
+              <w:lang w:val="en-US"/>
+            </w:rPr>
+          </w:pPr>
+          <w:r>
+            <w:rPr>
+              <w:rFonts w:ascii="Aptos" w:eastAsia="Times New Roman" w:hAnsi="Aptos"/>
+              <w:color w:val="000000"/>
+            </w:rPr>
+            <w:t xml:space="preserve">Toledo, M. P., </w:t>
+          </w:r>
+          <w:proofErr w:type="spellStart"/>
+          <w:r>
+            <w:rPr>
+              <w:rFonts w:ascii="Aptos" w:eastAsia="Times New Roman" w:hAnsi="Aptos"/>
+              <w:color w:val="000000"/>
+            </w:rPr>
+            <w:t>Sarvida</w:t>
+          </w:r>
+          <w:proofErr w:type="spellEnd"/>
+          <w:r>
+            <w:rPr>
+              <w:rFonts w:ascii="Aptos" w:eastAsia="Times New Roman" w:hAnsi="Aptos"/>
+              <w:color w:val="000000"/>
+            </w:rPr>
+            <w:t xml:space="preserve">, J. C. Y., </w:t>
+          </w:r>
+          <w:proofErr w:type="spellStart"/>
+          <w:r>
+            <w:rPr>
+              <w:rFonts w:ascii="Aptos" w:eastAsia="Times New Roman" w:hAnsi="Aptos"/>
+              <w:color w:val="000000"/>
+            </w:rPr>
+            <w:t>Patiten</w:t>
+          </w:r>
+          <w:proofErr w:type="spellEnd"/>
+          <w:r>
+            <w:rPr>
+              <w:rFonts w:ascii="Aptos" w:eastAsia="Times New Roman" w:hAnsi="Aptos"/>
+              <w:color w:val="000000"/>
+            </w:rPr>
+            <w:t xml:space="preserve">, B. K. S., </w:t>
+          </w:r>
+          <w:proofErr w:type="spellStart"/>
+          <w:r>
+            <w:rPr>
+              <w:rFonts w:ascii="Aptos" w:eastAsia="Times New Roman" w:hAnsi="Aptos"/>
+              <w:color w:val="000000"/>
+            </w:rPr>
+            <w:t>Mitamura</w:t>
+          </w:r>
+          <w:proofErr w:type="spellEnd"/>
+          <w:r>
+            <w:rPr>
+              <w:rFonts w:ascii="Aptos" w:eastAsia="Times New Roman" w:hAnsi="Aptos"/>
+              <w:color w:val="000000"/>
+            </w:rPr>
+            <w:t xml:space="preserve">, D. C. R., &amp; </w:t>
+          </w:r>
+          <w:proofErr w:type="spellStart"/>
+          <w:r>
+            <w:rPr>
+              <w:rFonts w:ascii="Aptos" w:eastAsia="Times New Roman" w:hAnsi="Aptos"/>
+              <w:color w:val="000000"/>
+            </w:rPr>
+            <w:t>Guadana</w:t>
+          </w:r>
+          <w:proofErr w:type="spellEnd"/>
+          <w:r>
+            <w:rPr>
+              <w:rFonts w:ascii="Aptos" w:eastAsia="Times New Roman" w:hAnsi="Aptos"/>
+              <w:color w:val="000000"/>
+            </w:rPr>
+            <w:t xml:space="preserve">, R. R. H. (2017). </w:t>
+          </w:r>
+          <w:proofErr w:type="spellStart"/>
+          <w:r>
+            <w:rPr>
+              <w:rFonts w:ascii="Aptos" w:eastAsia="Times New Roman" w:hAnsi="Aptos"/>
+              <w:color w:val="000000"/>
+              <w:lang w:val="en-US"/>
+            </w:rPr>
+            <w:t>SakunAPP</w:t>
+          </w:r>
+          <w:proofErr w:type="spellEnd"/>
+          <w:r>
+            <w:rPr>
+              <w:rFonts w:ascii="Aptos" w:eastAsia="Times New Roman" w:hAnsi="Aptos"/>
+              <w:color w:val="000000"/>
+              <w:lang w:val="en-US"/>
+            </w:rPr>
+            <w:t xml:space="preserve">: A framework for mobile application development in disaster awareness, </w:t>
+          </w:r>
+          <w:proofErr w:type="gramStart"/>
+          <w:r>
+            <w:rPr>
+              <w:rFonts w:ascii="Aptos" w:eastAsia="Times New Roman" w:hAnsi="Aptos"/>
+              <w:color w:val="000000"/>
+              <w:lang w:val="en-US"/>
+            </w:rPr>
+            <w:t>preparedness</w:t>
+          </w:r>
+          <w:proofErr w:type="gramEnd"/>
+          <w:r>
+            <w:rPr>
+              <w:rFonts w:ascii="Aptos" w:eastAsia="Times New Roman" w:hAnsi="Aptos"/>
+              <w:color w:val="000000"/>
+              <w:lang w:val="en-US"/>
+            </w:rPr>
+            <w:t xml:space="preserve"> and response. </w:t>
+          </w:r>
+          <w:r>
+            <w:rPr>
+              <w:rFonts w:ascii="Aptos" w:eastAsia="Times New Roman" w:hAnsi="Aptos"/>
+              <w:i/>
+              <w:iCs/>
+              <w:color w:val="000000"/>
+              <w:lang w:val="en-US"/>
+            </w:rPr>
+            <w:t>TENCON 2017 - 2017 IEEE Region 10 Conference</w:t>
+          </w:r>
+          <w:r>
+            <w:rPr>
+              <w:rFonts w:ascii="Aptos" w:eastAsia="Times New Roman" w:hAnsi="Aptos"/>
+              <w:color w:val="000000"/>
+              <w:lang w:val="en-US"/>
+            </w:rPr>
+            <w:t>, 2759–2764. https://doi.org/10.1109/TENCON.2017.8228331</w:t>
+          </w:r>
+        </w:p>
+        <w:p>
+          <w:pPr>
+            <w:autoSpaceDE w:val="0"/>
+            <w:autoSpaceDN w:val="0"/>
+            <w:ind w:hanging="480"/>
+            <w:divId w:val="1192568984"/>
+            <w:rPr>
+              <w:rFonts w:ascii="Aptos" w:eastAsia="Times New Roman" w:hAnsi="Aptos"/>
+              <w:color w:val="000000"/>
+              <w:lang w:val="de-AT"/>
+            </w:rPr>
+          </w:pPr>
+          <w:proofErr w:type="spellStart"/>
+          <w:r>
+            <w:rPr>
+              <w:rFonts w:ascii="Aptos" w:eastAsia="Times New Roman" w:hAnsi="Aptos"/>
+              <w:color w:val="000000"/>
+              <w:lang w:val="en-US"/>
+            </w:rPr>
+            <w:t>Ubimet</w:t>
+          </w:r>
+          <w:proofErr w:type="spellEnd"/>
+          <w:r>
+            <w:rPr>
+              <w:rFonts w:ascii="Aptos" w:eastAsia="Times New Roman" w:hAnsi="Aptos"/>
+              <w:color w:val="000000"/>
+              <w:lang w:val="en-US"/>
+            </w:rPr>
+            <w:t xml:space="preserve"> Int. AG. (2025). </w:t>
+          </w:r>
+          <w:r>
+            <w:rPr>
+              <w:rFonts w:ascii="Aptos" w:eastAsia="Times New Roman" w:hAnsi="Aptos"/>
+              <w:i/>
+              <w:iCs/>
+              <w:color w:val="000000"/>
+              <w:lang w:val="de-AT"/>
+            </w:rPr>
+            <w:t>UWZ Österreich: Gewitter Sturm</w:t>
+          </w:r>
+          <w:r>
+            <w:rPr>
+              <w:rFonts w:ascii="Aptos" w:eastAsia="Times New Roman" w:hAnsi="Aptos"/>
+              <w:color w:val="000000"/>
+              <w:lang w:val="de-AT"/>
+            </w:rPr>
+            <w:t>. https://play.google.com/store/apps/details?id=com.ubimet.uwz&amp;hl=en</w:t>
+          </w:r>
+        </w:p>
+        <w:p>
+          <w:pPr>
+            <w:autoSpaceDE w:val="0"/>
+            <w:autoSpaceDN w:val="0"/>
+            <w:ind w:hanging="480"/>
+            <w:divId w:val="295992755"/>
+            <w:rPr>
+              <w:rFonts w:ascii="Aptos" w:eastAsia="Times New Roman" w:hAnsi="Aptos"/>
+              <w:color w:val="000000"/>
+              <w:lang w:val="en-US"/>
+            </w:rPr>
+          </w:pPr>
+          <w:r>
+            <w:rPr>
+              <w:rFonts w:ascii="Aptos" w:eastAsia="Times New Roman" w:hAnsi="Aptos"/>
+              <w:color w:val="000000"/>
+              <w:lang w:val="en-US"/>
+            </w:rPr>
+            <w:t xml:space="preserve">West, D. M., &amp; Valentini, E. (2013). How Mobile Devices are Transforming Disaster Relief and Public Safety. </w:t>
+          </w:r>
+          <w:r>
+            <w:rPr>
+              <w:rFonts w:ascii="Aptos" w:eastAsia="Times New Roman" w:hAnsi="Aptos"/>
+              <w:i/>
+              <w:iCs/>
+              <w:color w:val="000000"/>
+              <w:lang w:val="en-US"/>
+            </w:rPr>
             <w:t>Issues in Technology Innovation</w:t>
           </w:r>
           <w:r>
@@ -893,6 +1639,73 @@
               <w:lang w:val="en-US"/>
             </w:rPr>
             <w:t>. https://www.brookings.edu/wp-content/uploads/2016/06/West_Valentini_Mobile-Technology-Disaster-Relief_v20.pdf</w:t>
+          </w:r>
+        </w:p>
+        <w:p>
+          <w:pPr>
+            <w:autoSpaceDE w:val="0"/>
+            <w:autoSpaceDN w:val="0"/>
+            <w:ind w:hanging="480"/>
+            <w:divId w:val="1061370902"/>
+            <w:rPr>
+              <w:rFonts w:ascii="Aptos" w:eastAsia="Times New Roman" w:hAnsi="Aptos"/>
+              <w:color w:val="000000"/>
+              <w:lang w:val="en-US"/>
+            </w:rPr>
+          </w:pPr>
+          <w:proofErr w:type="spellStart"/>
+          <w:r>
+            <w:rPr>
+              <w:rFonts w:ascii="Aptos" w:eastAsia="Times New Roman" w:hAnsi="Aptos"/>
+              <w:color w:val="000000"/>
+              <w:lang w:val="en-US"/>
+            </w:rPr>
+            <w:t>Zippenfenig</w:t>
+          </w:r>
+          <w:proofErr w:type="spellEnd"/>
+          <w:r>
+            <w:rPr>
+              <w:rFonts w:ascii="Aptos" w:eastAsia="Times New Roman" w:hAnsi="Aptos"/>
+              <w:color w:val="000000"/>
+              <w:lang w:val="en-US"/>
+            </w:rPr>
+            <w:t xml:space="preserve">, P. (2023). </w:t>
+          </w:r>
+          <w:r>
+            <w:rPr>
+              <w:rFonts w:ascii="Aptos" w:eastAsia="Times New Roman" w:hAnsi="Aptos"/>
+              <w:i/>
+              <w:iCs/>
+              <w:color w:val="000000"/>
+              <w:lang w:val="en-US"/>
+            </w:rPr>
+            <w:t>Open-Meteo.com Air Quality API</w:t>
+          </w:r>
+          <w:r>
+            <w:rPr>
+              <w:rFonts w:ascii="Aptos" w:eastAsia="Times New Roman" w:hAnsi="Aptos"/>
+              <w:color w:val="000000"/>
+              <w:lang w:val="en-US"/>
+            </w:rPr>
+            <w:t>. Open-</w:t>
+          </w:r>
+          <w:proofErr w:type="spellStart"/>
+          <w:r>
+            <w:rPr>
+              <w:rFonts w:ascii="Aptos" w:eastAsia="Times New Roman" w:hAnsi="Aptos"/>
+              <w:color w:val="000000"/>
+              <w:lang w:val="en-US"/>
+            </w:rPr>
+            <w:t>Meteo</w:t>
+          </w:r>
+          <w:proofErr w:type="spellEnd"/>
+          <w:r>
+            <w:rPr>
+              <w:rFonts w:ascii="Aptos" w:eastAsia="Times New Roman" w:hAnsi="Aptos"/>
+              <w:color w:val="000000"/>
+              <w:lang w:val="en-US"/>
+            </w:rPr>
+            <w:t xml:space="preserve"> and Copernicus Atmosphere Monitoring Service (CAMS). https://doi.org/10.5281/ZENODO.7970649</w:t>
           </w:r>
         </w:p>
         <w:p>
@@ -1036,8 +1849,276 @@
       </w:rPr>
     </w:lvl>
   </w:abstractNum>
+  <w:abstractNum w:abstractNumId="1" w15:restartNumberingAfterBreak="0">
+    <w:nsid w:val="075158D1"/>
+    <w:multiLevelType w:val="multilevel"/>
+    <w:tmpl w:val="105ABFD2"/>
+    <w:lvl w:ilvl="0">
+      <w:start w:val="1"/>
+      <w:numFmt w:val="bullet"/>
+      <w:lvlText w:val=""/>
+      <w:lvlJc w:val="left"/>
+      <w:pPr>
+        <w:tabs>
+          <w:tab w:val="num" w:pos="720"/>
+        </w:tabs>
+        <w:ind w:left="720" w:hanging="360"/>
+      </w:pPr>
+      <w:rPr>
+        <w:rFonts w:ascii="Symbol" w:hAnsi="Symbol" w:hint="default"/>
+        <w:sz w:val="20"/>
+      </w:rPr>
+    </w:lvl>
+    <w:lvl w:ilvl="1" w:tentative="1">
+      <w:start w:val="1"/>
+      <w:numFmt w:val="bullet"/>
+      <w:lvlText w:val=""/>
+      <w:lvlJc w:val="left"/>
+      <w:pPr>
+        <w:tabs>
+          <w:tab w:val="num" w:pos="1440"/>
+        </w:tabs>
+        <w:ind w:left="1440" w:hanging="360"/>
+      </w:pPr>
+      <w:rPr>
+        <w:rFonts w:ascii="Symbol" w:hAnsi="Symbol" w:hint="default"/>
+        <w:sz w:val="20"/>
+      </w:rPr>
+    </w:lvl>
+    <w:lvl w:ilvl="2" w:tentative="1">
+      <w:start w:val="1"/>
+      <w:numFmt w:val="bullet"/>
+      <w:lvlText w:val=""/>
+      <w:lvlJc w:val="left"/>
+      <w:pPr>
+        <w:tabs>
+          <w:tab w:val="num" w:pos="2160"/>
+        </w:tabs>
+        <w:ind w:left="2160" w:hanging="360"/>
+      </w:pPr>
+      <w:rPr>
+        <w:rFonts w:ascii="Symbol" w:hAnsi="Symbol" w:hint="default"/>
+        <w:sz w:val="20"/>
+      </w:rPr>
+    </w:lvl>
+    <w:lvl w:ilvl="3" w:tentative="1">
+      <w:start w:val="1"/>
+      <w:numFmt w:val="bullet"/>
+      <w:lvlText w:val=""/>
+      <w:lvlJc w:val="left"/>
+      <w:pPr>
+        <w:tabs>
+          <w:tab w:val="num" w:pos="2880"/>
+        </w:tabs>
+        <w:ind w:left="2880" w:hanging="360"/>
+      </w:pPr>
+      <w:rPr>
+        <w:rFonts w:ascii="Symbol" w:hAnsi="Symbol" w:hint="default"/>
+        <w:sz w:val="20"/>
+      </w:rPr>
+    </w:lvl>
+    <w:lvl w:ilvl="4" w:tentative="1">
+      <w:start w:val="1"/>
+      <w:numFmt w:val="bullet"/>
+      <w:lvlText w:val=""/>
+      <w:lvlJc w:val="left"/>
+      <w:pPr>
+        <w:tabs>
+          <w:tab w:val="num" w:pos="3600"/>
+        </w:tabs>
+        <w:ind w:left="3600" w:hanging="360"/>
+      </w:pPr>
+      <w:rPr>
+        <w:rFonts w:ascii="Symbol" w:hAnsi="Symbol" w:hint="default"/>
+        <w:sz w:val="20"/>
+      </w:rPr>
+    </w:lvl>
+    <w:lvl w:ilvl="5" w:tentative="1">
+      <w:start w:val="1"/>
+      <w:numFmt w:val="bullet"/>
+      <w:lvlText w:val=""/>
+      <w:lvlJc w:val="left"/>
+      <w:pPr>
+        <w:tabs>
+          <w:tab w:val="num" w:pos="4320"/>
+        </w:tabs>
+        <w:ind w:left="4320" w:hanging="360"/>
+      </w:pPr>
+      <w:rPr>
+        <w:rFonts w:ascii="Symbol" w:hAnsi="Symbol" w:hint="default"/>
+        <w:sz w:val="20"/>
+      </w:rPr>
+    </w:lvl>
+    <w:lvl w:ilvl="6" w:tentative="1">
+      <w:start w:val="1"/>
+      <w:numFmt w:val="bullet"/>
+      <w:lvlText w:val=""/>
+      <w:lvlJc w:val="left"/>
+      <w:pPr>
+        <w:tabs>
+          <w:tab w:val="num" w:pos="5040"/>
+        </w:tabs>
+        <w:ind w:left="5040" w:hanging="360"/>
+      </w:pPr>
+      <w:rPr>
+        <w:rFonts w:ascii="Symbol" w:hAnsi="Symbol" w:hint="default"/>
+        <w:sz w:val="20"/>
+      </w:rPr>
+    </w:lvl>
+    <w:lvl w:ilvl="7" w:tentative="1">
+      <w:start w:val="1"/>
+      <w:numFmt w:val="bullet"/>
+      <w:lvlText w:val=""/>
+      <w:lvlJc w:val="left"/>
+      <w:pPr>
+        <w:tabs>
+          <w:tab w:val="num" w:pos="5760"/>
+        </w:tabs>
+        <w:ind w:left="5760" w:hanging="360"/>
+      </w:pPr>
+      <w:rPr>
+        <w:rFonts w:ascii="Symbol" w:hAnsi="Symbol" w:hint="default"/>
+        <w:sz w:val="20"/>
+      </w:rPr>
+    </w:lvl>
+    <w:lvl w:ilvl="8" w:tentative="1">
+      <w:start w:val="1"/>
+      <w:numFmt w:val="bullet"/>
+      <w:lvlText w:val=""/>
+      <w:lvlJc w:val="left"/>
+      <w:pPr>
+        <w:tabs>
+          <w:tab w:val="num" w:pos="6480"/>
+        </w:tabs>
+        <w:ind w:left="6480" w:hanging="360"/>
+      </w:pPr>
+      <w:rPr>
+        <w:rFonts w:ascii="Symbol" w:hAnsi="Symbol" w:hint="default"/>
+        <w:sz w:val="20"/>
+      </w:rPr>
+    </w:lvl>
+  </w:abstractNum>
+  <w:abstractNum w:abstractNumId="2" w15:restartNumberingAfterBreak="0">
+    <w:nsid w:val="093847DB"/>
+    <w:multiLevelType w:val="multilevel"/>
+    <w:tmpl w:val="ADFE8676"/>
+    <w:lvl w:ilvl="0">
+      <w:start w:val="1"/>
+      <w:numFmt w:val="decimal"/>
+      <w:lvlText w:val="%1."/>
+      <w:lvlJc w:val="left"/>
+      <w:pPr>
+        <w:tabs>
+          <w:tab w:val="num" w:pos="720"/>
+        </w:tabs>
+        <w:ind w:left="720" w:hanging="360"/>
+      </w:pPr>
+    </w:lvl>
+    <w:lvl w:ilvl="1" w:tentative="1">
+      <w:start w:val="1"/>
+      <w:numFmt w:val="decimal"/>
+      <w:lvlText w:val="%2."/>
+      <w:lvlJc w:val="left"/>
+      <w:pPr>
+        <w:tabs>
+          <w:tab w:val="num" w:pos="1440"/>
+        </w:tabs>
+        <w:ind w:left="1440" w:hanging="360"/>
+      </w:pPr>
+    </w:lvl>
+    <w:lvl w:ilvl="2" w:tentative="1">
+      <w:start w:val="1"/>
+      <w:numFmt w:val="decimal"/>
+      <w:lvlText w:val="%3."/>
+      <w:lvlJc w:val="left"/>
+      <w:pPr>
+        <w:tabs>
+          <w:tab w:val="num" w:pos="2160"/>
+        </w:tabs>
+        <w:ind w:left="2160" w:hanging="360"/>
+      </w:pPr>
+    </w:lvl>
+    <w:lvl w:ilvl="3" w:tentative="1">
+      <w:start w:val="1"/>
+      <w:numFmt w:val="decimal"/>
+      <w:lvlText w:val="%4."/>
+      <w:lvlJc w:val="left"/>
+      <w:pPr>
+        <w:tabs>
+          <w:tab w:val="num" w:pos="2880"/>
+        </w:tabs>
+        <w:ind w:left="2880" w:hanging="360"/>
+      </w:pPr>
+    </w:lvl>
+    <w:lvl w:ilvl="4" w:tentative="1">
+      <w:start w:val="1"/>
+      <w:numFmt w:val="decimal"/>
+      <w:lvlText w:val="%5."/>
+      <w:lvlJc w:val="left"/>
+      <w:pPr>
+        <w:tabs>
+          <w:tab w:val="num" w:pos="3600"/>
+        </w:tabs>
+        <w:ind w:left="3600" w:hanging="360"/>
+      </w:pPr>
+    </w:lvl>
+    <w:lvl w:ilvl="5" w:tentative="1">
+      <w:start w:val="1"/>
+      <w:numFmt w:val="decimal"/>
+      <w:lvlText w:val="%6."/>
+      <w:lvlJc w:val="left"/>
+      <w:pPr>
+        <w:tabs>
+          <w:tab w:val="num" w:pos="4320"/>
+        </w:tabs>
+        <w:ind w:left="4320" w:hanging="360"/>
+      </w:pPr>
+    </w:lvl>
+    <w:lvl w:ilvl="6" w:tentative="1">
+      <w:start w:val="1"/>
+      <w:numFmt w:val="decimal"/>
+      <w:lvlText w:val="%7."/>
+      <w:lvlJc w:val="left"/>
+      <w:pPr>
+        <w:tabs>
+          <w:tab w:val="num" w:pos="5040"/>
+        </w:tabs>
+        <w:ind w:left="5040" w:hanging="360"/>
+      </w:pPr>
+    </w:lvl>
+    <w:lvl w:ilvl="7" w:tentative="1">
+      <w:start w:val="1"/>
+      <w:numFmt w:val="decimal"/>
+      <w:lvlText w:val="%8."/>
+      <w:lvlJc w:val="left"/>
+      <w:pPr>
+        <w:tabs>
+          <w:tab w:val="num" w:pos="5760"/>
+        </w:tabs>
+        <w:ind w:left="5760" w:hanging="360"/>
+      </w:pPr>
+    </w:lvl>
+    <w:lvl w:ilvl="8" w:tentative="1">
+      <w:start w:val="1"/>
+      <w:numFmt w:val="decimal"/>
+      <w:lvlText w:val="%9."/>
+      <w:lvlJc w:val="left"/>
+      <w:pPr>
+        <w:tabs>
+          <w:tab w:val="num" w:pos="6480"/>
+        </w:tabs>
+        <w:ind w:left="6480" w:hanging="360"/>
+      </w:pPr>
+    </w:lvl>
+  </w:abstractNum>
   <w:num w:numId="1" w16cid:durableId="701707052">
     <w:abstractNumId w:val="0"/>
+  </w:num>
+  <w:num w:numId="2" w16cid:durableId="1221332456">
+    <w:abstractNumId w:val="1"/>
+  </w:num>
+  <w:num w:numId="3" w16cid:durableId="132497">
+    <w:abstractNumId w:val="2"/>
   </w:num>
 </w:numbering>
 </file>
@@ -1654,7 +2735,6 @@
   <w:style w:type="character" w:default="1" w:styleId="DefaultParagraphFont">
     <w:name w:val="Default Paragraph Font"/>
     <w:uiPriority w:val="1"/>
-    <w:semiHidden/>
     <w:unhideWhenUsed/>
   </w:style>
   <w:style w:type="table" w:default="1" w:styleId="TableNormal">
@@ -2108,8 +3188,8 @@
   <w:rsids>
     <w:rsidRoot w:val="00ED6501"/>
     <w:rsid w:val="00766FDD"/>
-    <w:rsid w:val="00AC69F1"/>
     <w:rsid w:val="00ED6501"/>
+    <w:rsid w:val="00FB0479"/>
   </w:rsids>
   <m:mathPr>
     <m:mathFont m:val="Cambria Math"/>
@@ -2891,8 +3971,8 @@
   </we:alternateReferences>
   <we:properties>
     <we:property name="MENDELEY_BIBLIOGRAPHY_IS_DIRTY" value="true"/>
-    <we:property name="MENDELEY_BIBLIOGRAPHY_LAST_MODIFIED" value="1778487891707"/>
-    <we:property name="MENDELEY_CITATIONS" value="[{&quot;citationID&quot;:&quot;MENDELEY_CITATION_fb914af1-9252-457e-877e-6a7777aa02f6&quot;,&quot;properties&quot;:{&quot;noteIndex&quot;:0},&quot;isEdited&quot;:false,&quot;manualOverride&quot;:{&quot;isManuallyOverridden&quot;:false,&quot;citeprocText&quot;:&quot;(Bai et al., 2024; CombiRisk Risk-Management GmbH, 2025; dominoc925, 2026; Gehirn Inc., 2026; Kankanamge et al., 2020; Matsuno et al., 2021; Österr. Rotes Kreuz, 2024; SOBOS GmbH, 2026; Toledo et al., 2017; Ubimet Int. AG, 2025; West &amp;#38; Valentini, 2013)&quot;,&quot;manualOverrideText&quot;:&quot;&quot;},&quot;citationTag&quot;:&quot;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&quot;,&quot;citationItems&quot;:[{&quot;id&quot;:&quot;b4f339d8-6e9c-34d0-a036-639996814880&quot;,&quot;itemData&quot;:{&quot;type&quot;:&quot;paper-conference&quot;,&quot;id&quot;:&quot;b4f339d8-6e9c-34d0-a036-639996814880&quot;,&quot;title&quot;:&quot;SakunAPP: A framework for mobile application development in disaster awareness, preparedness and response&quot;,&quot;author&quot;:[{&quot;family&quot;:&quot;Toledo&quot;,&quot;given&quot;:&quot;Margarette P.&quot;,&quot;parse-names&quot;:false,&quot;dropping-particle&quot;:&quot;&quot;,&quot;non-dropping-particle&quot;:&quot;&quot;},{&quot;family&quot;:&quot;Sarvida&quot;,&quot;given&quot;:&quot;Johannah Crisanta Y.&quot;,&quot;parse-names&quot;:false,&quot;dropping-particle&quot;:&quot;&quot;,&quot;non-dropping-particle&quot;:&quot;&quot;},{&quot;family&quot;:&quot;Patiten&quot;,&quot;given&quot;:&quot;Bill Kevin S.&quot;,&quot;parse-names&quot;:false,&quot;dropping-particle&quot;:&quot;&quot;,&quot;non-dropping-particle&quot;:&quot;&quot;},{&quot;family&quot;:&quot;Mitamura&quot;,&quot;given&quot;:&quot;Daniel Carl R.&quot;,&quot;parse-names&quot;:false,&quot;dropping-particle&quot;:&quot;&quot;,&quot;non-dropping-particle&quot;:&quot;&quot;},{&quot;family&quot;:&quot;Guadana&quot;,&quot;given&quot;:&quot;Ryan Richard H.&quot;,&quot;parse-names&quot;:false,&quot;dropping-particle&quot;:&quot;&quot;,&quot;non-dropping-particle&quot;:&quot;&quot;}],&quot;container-title&quot;:&quot;TENCON 2017 - 2017 IEEE Region 10 Conference&quot;,&quot;DOI&quot;:&quot;10.1109/TENCON.2017.8228331&quot;,&quot;ISBN&quot;:&quot;978-1-5090-1134-6&quot;,&quot;issued&quot;:{&quot;date-parts&quot;:[[2017,11]]},&quot;page&quot;:&quot;2759-2764&quot;,&quot;publisher&quot;:&quot;IEEE&quot;},&quot;isTemporary&quot;:false},{&quot;id&quot;:&quot;a6ec5793-99c6-3664-9b43-50da778f0aa2&quot;,&quot;itemData&quot;:{&quot;type&quot;:&quot;article-journal&quot;,&quot;id&quot;:&quot;a6ec5793-99c6-3664-9b43-50da778f0aa2&quot;,&quot;title&quot;:&quot;How Mobile Devices are Transforming Disaster Relief and Public Safety&quot;,&quot;author&quot;:[{&quot;family&quot;:&quot;West&quot;,&quot;given&quot;:&quot;Darrell M&quot;,&quot;parse-names&quot;:false,&quot;dropping-particle&quot;:&quot;&quot;,&quot;non-dropping-particle&quot;:&quot;&quot;},{&quot;family&quot;:&quot;Valentini&quot;,&quot;given&quot;:&quot;Elizabeth&quot;,&quot;parse-names&quot;:false,&quot;dropping-particle&quot;:&quot;&quot;,&quot;non-dropping-particle&quot;:&quot;&quot;}],&quot;container-title&quot;:&quot;Issues in Technology Innovation&quot;,&quot;accessed&quot;:{&quot;date-parts&quot;:[[2026,5,11]]},&quot;URL&quot;:&quot;https://www.brookings.edu/wp-content/uploads/2016/06/West_Valentini_Mobile-Technology-Disaster-Relief_v20.pdf&quot;,&quot;issued&quot;:{&quot;date-parts&quot;:[[2013,7]]}},&quot;isTemporary&quot;:false},{&quot;id&quot;:&quot;54229e43-90a5-31fa-8326-385619e7ca8a&quot;,&quot;itemData&quot;:{&quot;type&quot;:&quot;article-journal&quot;,&quot;id&quot;:&quot;54229e43-90a5-31fa-8326-385619e7ca8a&quot;,&quot;title&quot;:&quot;Application of Gamification Teaching in Disaster Education: Scoping Review&quot;,&quot;author&quot;:[{&quot;family&quot;:&quot;Bai&quot;,&quot;given&quot;:&quot;Shiyi&quot;,&quot;parse-names&quot;:false,&quot;dropping-particle&quot;:&quot;&quot;,&quot;non-dropping-particle&quot;:&quot;&quot;},{&quot;family&quot;:&quot;Zeng&quot;,&quot;given&quot;:&quot;Huijuan&quot;,&quot;parse-names&quot;:false,&quot;dropping-particle&quot;:&quot;&quot;,&quot;non-dropping-particle&quot;:&quot;&quot;},{&quot;family&quot;:&quot;Zhong&quot;,&quot;given&quot;:&quot;Qianmei&quot;,&quot;parse-names&quot;:false,&quot;dropping-particle&quot;:&quot;&quot;,&quot;non-dropping-particle&quot;:&quot;&quot;},{&quot;family&quot;:&quot;Shen&quot;,&quot;given&quot;:&quot;Yuqi&quot;,&quot;parse-names&quot;:false,&quot;dropping-particle&quot;:&quot;&quot;,&quot;non-dropping-particle&quot;:&quot;&quot;},{&quot;family&quot;:&quot;Cao&quot;,&quot;given&quot;:&quot;Lulu&quot;,&quot;parse-names&quot;:false,&quot;dropping-particle&quot;:&quot;&quot;,&quot;non-dropping-particle&quot;:&quot;&quot;},{&quot;family&quot;:&quot;He&quot;,&quot;given&quot;:&quot;Mei&quot;,&quot;parse-names&quot;:false,&quot;dropping-particle&quot;:&quot;&quot;,&quot;non-dropping-particle&quot;:&quot;&quot;}],&quot;container-title&quot;:&quot;JMIR Serious Games&quot;,&quot;container-title-short&quot;:&quot;JMIR Serious Games&quot;,&quot;DOI&quot;:&quot;10.2196/64939&quot;,&quot;ISSN&quot;:&quot;2291-9279&quot;,&quot;URL&quot;:&quot;https://games.jmir.org/2024/1/e64939&quot;,&quot;issued&quot;:{&quot;date-parts&quot;:[[2024,12,11]]},&quot;page&quot;:&quot;1-11&quot;,&quot;volume&quot;:&quot;12&quot;},&quot;isTemporary&quot;:false},{&quot;id&quot;:&quot;6f1f5b91-4a36-3c87-8f0d-acad8cf02e27&quot;,&quot;itemData&quot;:{&quot;type&quot;:&quot;article-journal&quot;,&quot;id&quot;:&quot;6f1f5b91-4a36-3c87-8f0d-acad8cf02e27&quot;,&quot;title&quot;:&quot;How can gamification be incorporated into disaster emergency planning? A systematic review of the literature&quot;,&quot;author&quot;:[{&quot;family&quot;:&quot;Kankanamge&quot;,&quot;given&quot;:&quot;Nayomi&quot;,&quot;parse-names&quot;:false,&quot;dropping-particle&quot;:&quot;&quot;,&quot;non-dropping-particle&quot;:&quot;&quot;},{&quot;family&quot;:&quot;Yigitcanlar&quot;,&quot;given&quot;:&quot;Tan&quot;,&quot;parse-names&quot;:false,&quot;dropping-particle&quot;:&quot;&quot;,&quot;non-dropping-particle&quot;:&quot;&quot;},{&quot;family&quot;:&quot;Goonetilleke&quot;,&quot;given&quot;:&quot;Ashantha&quot;,&quot;parse-names&quot;:false,&quot;dropping-particle&quot;:&quot;&quot;,&quot;non-dropping-particle&quot;:&quot;&quot;},{&quot;family&quot;:&quot;Kamruzzaman&quot;,&quot;given&quot;:&quot;Md&quot;,&quot;parse-names&quot;:false,&quot;dropping-particle&quot;:&quot;&quot;,&quot;non-dropping-particle&quot;:&quot;&quot;}],&quot;container-title&quot;:&quot;International Journal of Disaster Resilience in the Built Environment&quot;,&quot;container-title-short&quot;:&quot;Int. J. Disaster Resil. Built Environ.&quot;,&quot;DOI&quot;:&quot;10.1108/IJDRBE-08-2019-0054&quot;,&quot;ISSN&quot;:&quot;17595916&quot;,&quot;issued&quot;:{&quot;date-parts&quot;:[[2020,8,26]]},&quot;page&quot;:&quot;481-506&quot;,&quot;abstract&quot;:&quot;Purpose: The purpose of this paper is to investigate the role of gamification as a novel technique in motivating community engagement in disaster-related activities in order to address the question of how gamification can be incorporated into disaster emergency planning. Design/methodology/approach: This study conducts a systematic literature review and explores available gamified applications for disaster emergency planning and their purpose of use. In total, 51 scholarly articles on the topic and 35 disaster-related gamified applications are reviewed. Findings: The findings reveal the following: (a) gamified applications (n = 35) are used for education, research and intervention purposes; (b) gamified applications create new opportunities for community engagement and raise disaster awareness among the community in virtual environments; and (c) gamified applications help shape a new culture – i.e. gamified culture – that supports smart disaster emergency planning practice. Originality/value: During the recent years, utilisation of game elements in non-game contexts – i.e., gamification – has become a popular approach in motivating people in various actions. Increasing research highlighted the benefits of gamification in enhancing community engagement, creating interactive environments, providing better behavioural outcomes and influencing democratic processes. Despite some of the applications indicating the potential of gamification in disaster emergency planning, the use of gamification technique in this discipline is an understudied area. This study reveals gamification can be incorporated into disaster emergency planning.&quot;,&quot;publisher&quot;:&quot;Emerald Group Holdings Ltd.&quot;,&quot;issue&quot;:&quot;4&quot;,&quot;volume&quot;:&quot;11&quot;},&quot;isTemporary&quot;:false},{&quot;id&quot;:&quot;4176182c-444b-391f-99ce-f84dd897f787&quot;,&quot;itemData&quot;:{&quot;type&quot;:&quot;article-journal&quot;,&quot;id&quot;:&quot;4176182c-444b-391f-99ce-f84dd897f787&quot;,&quot;title&quot;:&quot;Development of Flood Disaster Prevention Simulation Smartphone Application Using Gamification&quot;,&quot;author&quot;:[{&quot;family&quot;:&quot;Matsuno&quot;,&quot;given&quot;:&quot;Yutaka&quot;,&quot;parse-names&quot;:false,&quot;dropping-particle&quot;:&quot;&quot;,&quot;non-dropping-particle&quot;:&quot;&quot;},{&quot;family&quot;:&quot;Fukanuma&quot;,&quot;given&quot;:&quot;Futaba&quot;,&quot;parse-names&quot;:false,&quot;dropping-particle&quot;:&quot;&quot;,&quot;non-dropping-particle&quot;:&quot;&quot;},{&quot;family&quot;:&quot;Tsuruoka&quot;,&quot;given&quot;:&quot;Shigenobu&quot;,&quot;parse-names&quot;:false,&quot;dropping-particle&quot;:&quot;&quot;,&quot;non-dropping-particle&quot;:&quot;&quot;}],&quot;container-title&quot;:&quot;Dynamics of Disasters: Impact, Risk, Resilience, and Solutions&quot;,&quot;issued&quot;:{&quot;date-parts&quot;:[[2021]]},&quot;page&quot;:&quot;147-159&quot;,&quot;abstract&quot;:&quot;In recent years, there have been many serious flood disasters. However, only a few citizens have sufficient knowledge about evacuation from the disaster. In order to reduce the damage, it is necessary for citizens to be aware of the flood risk of the residence, to prepare for disasters, and to take appropriate evacuation action at the time of disasters. For that purpose, citizens need to continuously learn disaster prevention information. Based on the above considerations, we develop a smartphone application for simulating flood disaster evacuation, based on the notion of gamification. In this paper, we report design and development of the disaster prevention smartphone application for citizens, focusing on eas-iness, continuity (wanting to use the application continuously), learning effects, and improvement of interest.&quot;},&quot;isTemporary&quot;:false},{&quot;id&quot;:&quot;d433b857-53be-3bee-b10b-cee97cab9c7b&quot;,&quot;itemData&quot;:{&quot;type&quot;:&quot;article&quot;,&quot;id&quot;:&quot;d433b857-53be-3bee-b10b-cee97cab9c7b&quot;,&quot;title&quot;:&quot;NERV Disaster Prevention&quot;,&quot;author&quot;:[{&quot;family&quot;:&quot;Gehirn Inc.&quot;,&quot;given&quot;:&quot;&quot;,&quot;parse-names&quot;:false,&quot;dropping-particle&quot;:&quot;&quot;,&quot;non-dropping-particle&quot;:&quot;&quot;}],&quot;accessed&quot;:{&quot;date-parts&quot;:[[2026,5,11]]},&quot;URL&quot;:&quot;https://play.google.com/store/apps/details?id=app.nerv&amp;hl=en&quot;,&quot;issued&quot;:{&quot;date-parts&quot;:[[2026]]}},&quot;isTemporary&quot;:false},{&quot;id&quot;:&quot;0a0ede94-d528-31c4-bd01-16cba9053d6d&quot;,&quot;itemData&quot;:{&quot;type&quot;:&quot;article&quot;,&quot;id&quot;:&quot;0a0ede94-d528-31c4-bd01-16cba9053d6d&quot;,&quot;title&quot;:&quot;UWZ Österreich: Gewitter Sturm&quot;,&quot;author&quot;:[{&quot;family&quot;:&quot;Ubimet Int. AG&quot;,&quot;given&quot;:&quot;&quot;,&quot;parse-names&quot;:false,&quot;dropping-particle&quot;:&quot;&quot;,&quot;non-dropping-particle&quot;:&quot;&quot;}],&quot;accessed&quot;:{&quot;date-parts&quot;:[[2026,5,11]]},&quot;URL&quot;:&quot;https://play.google.com/store/apps/details?id=com.ubimet.uwz&amp;hl=en&quot;,&quot;issued&quot;:{&quot;date-parts&quot;:[[2025]]}},&quot;isTemporary&quot;:false},{&quot;id&quot;:&quot;f0b01b7d-aa34-3f97-8664-4c969d93c381&quot;,&quot;itemData&quot;:{&quot;type&quot;:&quot;article&quot;,&quot;id&quot;:&quot;f0b01b7d-aa34-3f97-8664-4c969d93c381&quot;,&quot;title&quot;:&quot;Disastermon Natural Disaster Monitor&quot;,&quot;author&quot;:[{&quot;family&quot;:&quot;dominoc925&quot;,&quot;given&quot;:&quot;&quot;,&quot;parse-names&quot;:false,&quot;dropping-particle&quot;:&quot;&quot;,&quot;non-dropping-particle&quot;:&quot;&quot;}],&quot;accessed&quot;:{&quot;date-parts&quot;:[[2026,5,11]]},&quot;URL&quot;:&quot;https://play.google.com/store/apps/details?id=com.dom925.disastermon&amp;hl=en&quot;,&quot;issued&quot;:{&quot;date-parts&quot;:[[2026]]}},&quot;isTemporary&quot;:false},{&quot;id&quot;:&quot;fd2c4f96-3611-3a59-9007-f495f9af880b&quot;,&quot;itemData&quot;:{&quot;type&quot;:&quot;article&quot;,&quot;id&quot;:&quot;fd2c4f96-3611-3a59-9007-f495f9af880b&quot;,&quot;title&quot;:&quot;FloodAlert Waterlevel Alerts&quot;,&quot;author&quot;:[{&quot;family&quot;:&quot;SOBOS GmbH&quot;,&quot;given&quot;:&quot;&quot;,&quot;parse-names&quot;:false,&quot;dropping-particle&quot;:&quot;&quot;,&quot;non-dropping-particle&quot;:&quot;&quot;}],&quot;accessed&quot;:{&quot;date-parts&quot;:[[2026,5,11]]},&quot;URL&quot;:&quot;https://play.google.com/store/apps/details?id=at.pegelalarm.app&amp;hl=en&quot;,&quot;issued&quot;:{&quot;date-parts&quot;:[[2026]]}},&quot;isTemporary&quot;:false},{&quot;id&quot;:&quot;d80d37ba-b2b0-3118-a50c-727d98f799c1&quot;,&quot;itemData&quot;:{&quot;type&quot;:&quot;article&quot;,&quot;id&quot;:&quot;d80d37ba-b2b0-3118-a50c-727d98f799c1&quot;,&quot;title&quot;:&quot;KATWARN&quot;,&quot;author&quot;:[{&quot;family&quot;:&quot;CombiRisk Risk-Management GmbH&quot;,&quot;given&quot;:&quot;&quot;,&quot;parse-names&quot;:false,&quot;dropping-particle&quot;:&quot;&quot;,&quot;non-dropping-particle&quot;:&quot;&quot;}],&quot;accessed&quot;:{&quot;date-parts&quot;:[[2026,5,11]]},&quot;URL&quot;:&quot;https://play.google.com/store/apps/details?id=de.combirisk.katwarn&amp;hl=en&quot;,&quot;issued&quot;:{&quot;date-parts&quot;:[[2025]]}},&quot;isTemporary&quot;:false},{&quot;id&quot;:&quot;179826b5-150f-3045-86d2-e09327713ef9&quot;,&quot;itemData&quot;:{&quot;type&quot;:&quot;article&quot;,&quot;id&quot;:&quot;179826b5-150f-3045-86d2-e09327713ef9&quot;,&quot;title&quot;:&quot;Erste Hilfe - Rotes Kreuz&quot;,&quot;author&quot;:[{&quot;family&quot;:&quot;Österr. Rotes Kreuz&quot;,&quot;given&quot;:&quot;LV Stmk&quot;,&quot;parse-names&quot;:false,&quot;dropping-particle&quot;:&quot;&quot;,&quot;non-dropping-particle&quot;:&quot;&quot;}],&quot;accessed&quot;:{&quot;date-parts&quot;:[[2026,5,11]]},&quot;URL&quot;:&quot;https://play.google.com/store/apps/details?id=at.roteskreuz.st.erstehilfe&amp;hl=en&quot;,&quot;issued&quot;:{&quot;date-parts&quot;:[[2024]]}},&quot;isTemporary&quot;:false}]}]"/>
+    <we:property name="MENDELEY_BIBLIOGRAPHY_LAST_MODIFIED" value="1778493332128"/>
+    <we:property name="MENDELEY_CITATIONS" value="[{&quot;citationID&quot;:&quot;MENDELEY_CITATION_fb914af1-9252-457e-877e-6a7777aa02f6&quot;,&quot;properties&quot;:{&quot;noteIndex&quot;:0},&quot;isEdited&quot;:false,&quot;manualOverride&quot;:{&quot;isManuallyOverridden&quot;:false,&quot;citeprocText&quot;:&quot;(Austrian Federal Ministry of Agriculture Forestry Climate and Environmental Protection Regions and Water Management, n.d.; Bai et al., 2024; CombiRisk Risk-Management GmbH, 2025; dominoc925, 2026; Gehirn Inc., 2026; GeoSphere Austria, n.d.; Kankanamge et al., 2020; Matsuno et al., 2021; Nagaraju et al., 2024; Österr. Rotes Kreuz, 2024; Rundfunk und Telekom Regulierungs GmbH, n.d.; SOBOS GmbH, 2026; Toledo et al., 2017; Ubimet Int. AG, 2025; West &amp;#38; Valentini, 2013; Zippenfenig, 2023)&quot;,&quot;manualOverrideText&quot;:&quot;&quot;},&quot;citationItems&quot;:[{&quot;id&quot;:&quot;b4f339d8-6e9c-34d0-a036-639996814880&quot;,&quot;itemData&quot;:{&quot;type&quot;:&quot;paper-conference&quot;,&quot;id&quot;:&quot;b4f339d8-6e9c-34d0-a036-639996814880&quot;,&quot;title&quot;:&quot;SakunAPP: A framework for mobile application development in disaster awareness, preparedness and response&quot;,&quot;author&quot;:[{&quot;family&quot;:&quot;Toledo&quot;,&quot;given&quot;:&quot;Margarette P.&quot;,&quot;parse-names&quot;:false,&quot;dropping-particle&quot;:&quot;&quot;,&quot;non-dropping-particle&quot;:&quot;&quot;},{&quot;family&quot;:&quot;Sarvida&quot;,&quot;given&quot;:&quot;Johannah Crisanta Y.&quot;,&quot;parse-names&quot;:false,&quot;dropping-particle&quot;:&quot;&quot;,&quot;non-dropping-particle&quot;:&quot;&quot;},{&quot;family&quot;:&quot;Patiten&quot;,&quot;given&quot;:&quot;Bill Kevin S.&quot;,&quot;parse-names&quot;:false,&quot;dropping-particle&quot;:&quot;&quot;,&quot;non-dropping-particle&quot;:&quot;&quot;},{&quot;family&quot;:&quot;Mitamura&quot;,&quot;given&quot;:&quot;Daniel Carl R.&quot;,&quot;parse-names&quot;:false,&quot;dropping-particle&quot;:&quot;&quot;,&quot;non-dropping-particle&quot;:&quot;&quot;},{&quot;family&quot;:&quot;Guadana&quot;,&quot;given&quot;:&quot;Ryan Richard H.&quot;,&quot;parse-names&quot;:false,&quot;dropping-particle&quot;:&quot;&quot;,&quot;non-dropping-particle&quot;:&quot;&quot;}],&quot;container-title&quot;:&quot;TENCON 2017 - 2017 IEEE Region 10 Conference&quot;,&quot;DOI&quot;:&quot;10.1109/TENCON.2017.8228331&quot;,&quot;ISBN&quot;:&quot;978-1-5090-1134-6&quot;,&quot;issued&quot;:{&quot;date-parts&quot;:[[2017,11]]},&quot;page&quot;:&quot;2759-2764&quot;,&quot;publisher&quot;:&quot;IEEE&quot;},&quot;isTemporary&quot;:false},{&quot;id&quot;:&quot;a6ec5793-99c6-3664-9b43-50da778f0aa2&quot;,&quot;itemData&quot;:{&quot;type&quot;:&quot;article-journal&quot;,&quot;id&quot;:&quot;a6ec5793-99c6-3664-9b43-50da778f0aa2&quot;,&quot;title&quot;:&quot;How Mobile Devices are Transforming Disaster Relief and Public Safety&quot;,&quot;author&quot;:[{&quot;family&quot;:&quot;West&quot;,&quot;given&quot;:&quot;Darrell M&quot;,&quot;parse-names&quot;:false,&quot;dropping-particle&quot;:&quot;&quot;,&quot;non-dropping-particle&quot;:&quot;&quot;},{&quot;family&quot;:&quot;Valentini&quot;,&quot;given&quot;:&quot;Elizabeth&quot;,&quot;parse-names&quot;:false,&quot;dropping-particle&quot;:&quot;&quot;,&quot;non-dropping-particle&quot;:&quot;&quot;}],&quot;container-title&quot;:&quot;Issues in Technology Innovation&quot;,&quot;accessed&quot;:{&quot;date-parts&quot;:[[2026,5,11]]},&quot;URL&quot;:&quot;https://www.brookings.edu/wp-content/uploads/2016/06/West_Valentini_Mobile-Technology-Disaster-Relief_v20.pdf&quot;,&quot;issued&quot;:{&quot;date-parts&quot;:[[2013,7]]}},&quot;isTemporary&quot;:false},{&quot;id&quot;:&quot;54229e43-90a5-31fa-8326-385619e7ca8a&quot;,&quot;itemData&quot;:{&quot;type&quot;:&quot;article-journal&quot;,&quot;id&quot;:&quot;54229e43-90a5-31fa-8326-385619e7ca8a&quot;,&quot;title&quot;:&quot;Application of Gamification Teaching in Disaster Education: Scoping Review&quot;,&quot;author&quot;:[{&quot;family&quot;:&quot;Bai&quot;,&quot;given&quot;:&quot;Shiyi&quot;,&quot;parse-names&quot;:false,&quot;dropping-particle&quot;:&quot;&quot;,&quot;non-dropping-particle&quot;:&quot;&quot;},{&quot;family&quot;:&quot;Zeng&quot;,&quot;given&quot;:&quot;Huijuan&quot;,&quot;parse-names&quot;:false,&quot;dropping-particle&quot;:&quot;&quot;,&quot;non-dropping-particle&quot;:&quot;&quot;},{&quot;family&quot;:&quot;Zhong&quot;,&quot;given&quot;:&quot;Qianmei&quot;,&quot;parse-names&quot;:false,&quot;dropping-particle&quot;:&quot;&quot;,&quot;non-dropping-particle&quot;:&quot;&quot;},{&quot;family&quot;:&quot;Shen&quot;,&quot;given&quot;:&quot;Yuqi&quot;,&quot;parse-names&quot;:false,&quot;dropping-particle&quot;:&quot;&quot;,&quot;non-dropping-particle&quot;:&quot;&quot;},{&quot;family&quot;:&quot;Cao&quot;,&quot;given&quot;:&quot;Lulu&quot;,&quot;parse-names&quot;:false,&quot;dropping-particle&quot;:&quot;&quot;,&quot;non-dropping-particle&quot;:&quot;&quot;},{&quot;family&quot;:&quot;He&quot;,&quot;given&quot;:&quot;Mei&quot;,&quot;parse-names&quot;:false,&quot;dropping-particle&quot;:&quot;&quot;,&quot;non-dropping-particle&quot;:&quot;&quot;}],&quot;container-title&quot;:&quot;JMIR Serious Games&quot;,&quot;container-title-short&quot;:&quot;JMIR Serious Games&quot;,&quot;DOI&quot;:&quot;10.2196/64939&quot;,&quot;ISSN&quot;:&quot;2291-9279&quot;,&quot;URL&quot;:&quot;https://games.jmir.org/2024/1/e64939&quot;,&quot;issued&quot;:{&quot;date-parts&quot;:[[2024,12,11]]},&quot;page&quot;:&quot;1-11&quot;,&quot;volume&quot;:&quot;12&quot;},&quot;isTemporary&quot;:false},{&quot;id&quot;:&quot;6f1f5b91-4a36-3c87-8f0d-acad8cf02e27&quot;,&quot;itemData&quot;:{&quot;type&quot;:&quot;article-journal&quot;,&quot;id&quot;:&quot;6f1f5b91-4a36-3c87-8f0d-acad8cf02e27&quot;,&quot;title&quot;:&quot;How can gamification be incorporated into disaster emergency planning? A systematic review of the literature&quot;,&quot;author&quot;:[{&quot;family&quot;:&quot;Kankanamge&quot;,&quot;given&quot;:&quot;Nayomi&quot;,&quot;parse-names&quot;:false,&quot;dropping-particle&quot;:&quot;&quot;,&quot;non-dropping-particle&quot;:&quot;&quot;},{&quot;family&quot;:&quot;Yigitcanlar&quot;,&quot;given&quot;:&quot;Tan&quot;,&quot;parse-names&quot;:false,&quot;dropping-particle&quot;:&quot;&quot;,&quot;non-dropping-particle&quot;:&quot;&quot;},{&quot;family&quot;:&quot;Goonetilleke&quot;,&quot;given&quot;:&quot;Ashantha&quot;,&quot;parse-names&quot;:false,&quot;dropping-particle&quot;:&quot;&quot;,&quot;non-dropping-particle&quot;:&quot;&quot;},{&quot;family&quot;:&quot;Kamruzzaman&quot;,&quot;given&quot;:&quot;Md&quot;,&quot;parse-names&quot;:false,&quot;dropping-particle&quot;:&quot;&quot;,&quot;non-dropping-particle&quot;:&quot;&quot;}],&quot;container-title&quot;:&quot;International Journal of Disaster Resilience in the Built Environment&quot;,&quot;container-title-short&quot;:&quot;Int. J. Disaster Resil. Built Environ.&quot;,&quot;DOI&quot;:&quot;10.1108/IJDRBE-08-2019-0054&quot;,&quot;ISSN&quot;:&quot;17595916&quot;,&quot;issued&quot;:{&quot;date-parts&quot;:[[2020,8,26]]},&quot;page&quot;:&quot;481-506&quot;,&quot;abstract&quot;:&quot;Purpose: The purpose of this paper is to investigate the role of gamification as a novel technique in motivating community engagement in disaster-related activities in order to address the question of how gamification can be incorporated into disaster emergency planning. Design/methodology/approach: This study conducts a systematic literature review and explores available gamified applications for disaster emergency planning and their purpose of use. In total, 51 scholarly articles on the topic and 35 disaster-related gamified applications are reviewed. Findings: The findings reveal the following: (a) gamified applications (n = 35) are used for education, research and intervention purposes; (b) gamified applications create new opportunities for community engagement and raise disaster awareness among the community in virtual environments; and (c) gamified applications help shape a new culture – i.e. gamified culture – that supports smart disaster emergency planning practice. Originality/value: During the recent years, utilisation of game elements in non-game contexts – i.e., gamification – has become a popular approach in motivating people in various actions. Increasing research highlighted the benefits of gamification in enhancing community engagement, creating interactive environments, providing better behavioural outcomes and influencing democratic processes. Despite some of the applications indicating the potential of gamification in disaster emergency planning, the use of gamification technique in this discipline is an understudied area. This study reveals gamification can be incorporated into disaster emergency planning.&quot;,&quot;publisher&quot;:&quot;Emerald Group Holdings Ltd.&quot;,&quot;issue&quot;:&quot;4&quot;,&quot;volume&quot;:&quot;11&quot;},&quot;isTemporary&quot;:false},{&quot;id&quot;:&quot;4176182c-444b-391f-99ce-f84dd897f787&quot;,&quot;itemData&quot;:{&quot;type&quot;:&quot;article-journal&quot;,&quot;id&quot;:&quot;4176182c-444b-391f-99ce-f84dd897f787&quot;,&quot;title&quot;:&quot;Development of Flood Disaster Prevention Simulation Smartphone Application Using Gamification&quot;,&quot;author&quot;:[{&quot;family&quot;:&quot;Matsuno&quot;,&quot;given&quot;:&quot;Yutaka&quot;,&quot;parse-names&quot;:false,&quot;dropping-particle&quot;:&quot;&quot;,&quot;non-dropping-particle&quot;:&quot;&quot;},{&quot;family&quot;:&quot;Fukanuma&quot;,&quot;given&quot;:&quot;Futaba&quot;,&quot;parse-names&quot;:false,&quot;dropping-particle&quot;:&quot;&quot;,&quot;non-dropping-particle&quot;:&quot;&quot;},{&quot;family&quot;:&quot;Tsuruoka&quot;,&quot;given&quot;:&quot;Shigenobu&quot;,&quot;parse-names&quot;:false,&quot;dropping-particle&quot;:&quot;&quot;,&quot;non-dropping-particle&quot;:&quot;&quot;}],&quot;container-title&quot;:&quot;Dynamics of Disasters: Impact, Risk, Resilience, and Solutions&quot;,&quot;issued&quot;:{&quot;date-parts&quot;:[[2021]]},&quot;page&quot;:&quot;147-159&quot;,&quot;abstract&quot;:&quot;In recent years, there have been many serious flood disasters. However, only a few citizens have sufficient knowledge about evacuation from the disaster. In order to reduce the damage, it is necessary for citizens to be aware of the flood risk of the residence, to prepare for disasters, and to take appropriate evacuation action at the time of disasters. For that purpose, citizens need to continuously learn disaster prevention information. Based on the above considerations, we develop a smartphone application for simulating flood disaster evacuation, based on the notion of gamification. In this paper, we report design and development of the disaster prevention smartphone application for citizens, focusing on eas-iness, continuity (wanting to use the application continuously), learning effects, and improvement of interest.&quot;},&quot;isTemporary&quot;:false},{&quot;id&quot;:&quot;d433b857-53be-3bee-b10b-cee97cab9c7b&quot;,&quot;itemData&quot;:{&quot;type&quot;:&quot;article&quot;,&quot;id&quot;:&quot;d433b857-53be-3bee-b10b-cee97cab9c7b&quot;,&quot;title&quot;:&quot;NERV Disaster Prevention&quot;,&quot;author&quot;:[{&quot;family&quot;:&quot;Gehirn Inc.&quot;,&quot;given&quot;:&quot;&quot;,&quot;parse-names&quot;:false,&quot;dropping-particle&quot;:&quot;&quot;,&quot;non-dropping-particle&quot;:&quot;&quot;}],&quot;accessed&quot;:{&quot;date-parts&quot;:[[2026,5,11]]},&quot;URL&quot;:&quot;https://play.google.com/store/apps/details?id=app.nerv&amp;hl=en&quot;,&quot;issued&quot;:{&quot;date-parts&quot;:[[2026]]}},&quot;isTemporary&quot;:false},{&quot;id&quot;:&quot;0a0ede94-d528-31c4-bd01-16cba9053d6d&quot;,&quot;itemData&quot;:{&quot;type&quot;:&quot;article&quot;,&quot;id&quot;:&quot;0a0ede94-d528-31c4-bd01-16cba9053d6d&quot;,&quot;title&quot;:&quot;UWZ Österreich: Gewitter Sturm&quot;,&quot;author&quot;:[{&quot;family&quot;:&quot;Ubimet Int. AG&quot;,&quot;given&quot;:&quot;&quot;,&quot;parse-names&quot;:false,&quot;dropping-particle&quot;:&quot;&quot;,&quot;non-dropping-particle&quot;:&quot;&quot;}],&quot;accessed&quot;:{&quot;date-parts&quot;:[[2026,5,11]]},&quot;URL&quot;:&quot;https://play.google.com/store/apps/details?id=com.ubimet.uwz&amp;hl=en&quot;,&quot;issued&quot;:{&quot;date-parts&quot;:[[2025]]}},&quot;isTemporary&quot;:false},{&quot;id&quot;:&quot;f0b01b7d-aa34-3f97-8664-4c969d93c381&quot;,&quot;itemData&quot;:{&quot;type&quot;:&quot;article&quot;,&quot;id&quot;:&quot;f0b01b7d-aa34-3f97-8664-4c969d93c381&quot;,&quot;title&quot;:&quot;Disastermon Natural Disaster Monitor&quot;,&quot;author&quot;:[{&quot;family&quot;:&quot;dominoc925&quot;,&quot;given&quot;:&quot;&quot;,&quot;parse-names&quot;:false,&quot;dropping-particle&quot;:&quot;&quot;,&quot;non-dropping-particle&quot;:&quot;&quot;}],&quot;accessed&quot;:{&quot;date-parts&quot;:[[2026,5,11]]},&quot;URL&quot;:&quot;https://play.google.com/store/apps/details?id=com.dom925.disastermon&amp;hl=en&quot;,&quot;issued&quot;:{&quot;date-parts&quot;:[[2026]]}},&quot;isTemporary&quot;:false},{&quot;id&quot;:&quot;fd2c4f96-3611-3a59-9007-f495f9af880b&quot;,&quot;itemData&quot;:{&quot;type&quot;:&quot;article&quot;,&quot;id&quot;:&quot;fd2c4f96-3611-3a59-9007-f495f9af880b&quot;,&quot;title&quot;:&quot;FloodAlert Waterlevel Alerts&quot;,&quot;author&quot;:[{&quot;family&quot;:&quot;SOBOS GmbH&quot;,&quot;given&quot;:&quot;&quot;,&quot;parse-names&quot;:false,&quot;dropping-particle&quot;:&quot;&quot;,&quot;non-dropping-particle&quot;:&quot;&quot;}],&quot;accessed&quot;:{&quot;date-parts&quot;:[[2026,5,11]]},&quot;URL&quot;:&quot;https://play.google.com/store/apps/details?id=at.pegelalarm.app&amp;hl=en&quot;,&quot;issued&quot;:{&quot;date-parts&quot;:[[2026]]}},&quot;isTemporary&quot;:false},{&quot;id&quot;:&quot;d80d37ba-b2b0-3118-a50c-727d98f799c1&quot;,&quot;itemData&quot;:{&quot;type&quot;:&quot;article&quot;,&quot;id&quot;:&quot;d80d37ba-b2b0-3118-a50c-727d98f799c1&quot;,&quot;title&quot;:&quot;KATWARN&quot;,&quot;author&quot;:[{&quot;family&quot;:&quot;CombiRisk Risk-Management GmbH&quot;,&quot;given&quot;:&quot;&quot;,&quot;parse-names&quot;:false,&quot;dropping-particle&quot;:&quot;&quot;,&quot;non-dropping-particle&quot;:&quot;&quot;}],&quot;accessed&quot;:{&quot;date-parts&quot;:[[2026,5,11]]},&quot;URL&quot;:&quot;https://play.google.com/store/apps/details?id=de.combirisk.katwarn&amp;hl=en&quot;,&quot;issued&quot;:{&quot;date-parts&quot;:[[2025]]}},&quot;isTemporary&quot;:false},{&quot;id&quot;:&quot;179826b5-150f-3045-86d2-e09327713ef9&quot;,&quot;itemData&quot;:{&quot;type&quot;:&quot;article&quot;,&quot;id&quot;:&quot;179826b5-150f-3045-86d2-e09327713ef9&quot;,&quot;title&quot;:&quot;Erste Hilfe - Rotes Kreuz&quot;,&quot;author&quot;:[{&quot;family&quot;:&quot;Österr. Rotes Kreuz&quot;,&quot;given&quot;:&quot;LV Stmk&quot;,&quot;parse-names&quot;:false,&quot;dropping-particle&quot;:&quot;&quot;,&quot;non-dropping-particle&quot;:&quot;&quot;}],&quot;accessed&quot;:{&quot;date-parts&quot;:[[2026,5,11]]},&quot;URL&quot;:&quot;https://play.google.com/store/apps/details?id=at.roteskreuz.st.erstehilfe&amp;hl=en&quot;,&quot;issued&quot;:{&quot;date-parts&quot;:[[2024]]}},&quot;isTemporary&quot;:false},{&quot;id&quot;:&quot;21f33b29-909c-3cc8-92ee-3feeaa9a3cb5&quot;,&quot;itemData&quot;:{&quot;type&quot;:&quot;paper-conference&quot;,&quot;id&quot;:&quot;21f33b29-909c-3cc8-92ee-3feeaa9a3cb5&quot;,&quot;title&quot;:&quot;Mobile Application for Disaster Safety Management&quot;,&quot;author&quot;:[{&quot;family&quot;:&quot;Nagaraju&quot;,&quot;given&quot;:&quot;M. Siva&quot;,&quot;parse-names&quot;:false,&quot;dropping-particle&quot;:&quot;&quot;,&quot;non-dropping-particle&quot;:&quot;&quot;},{&quot;family&quot;:&quot;Kakarala&quot;,&quot;given&quot;:&quot;Harshitha&quot;,&quot;parse-names&quot;:false,&quot;dropping-particle&quot;:&quot;&quot;,&quot;non-dropping-particle&quot;:&quot;&quot;},{&quot;family&quot;:&quot;Sai&quot;,&quot;given&quot;:&quot;Vadaparthi&quot;,&quot;parse-names&quot;:false,&quot;dropping-particle&quot;:&quot;&quot;,&quot;non-dropping-particle&quot;:&quot;&quot;},{&quot;family&quot;:&quot;Vattikunta&quot;,&quot;given&quot;:&quot;Vishnu Pramukh&quot;,&quot;parse-names&quot;:false,&quot;dropping-particle&quot;:&quot;&quot;,&quot;non-dropping-particle&quot;:&quot;&quot;}],&quot;container-title&quot;:&quot;10th International Conference on Advanced Computing and Communication Systems, ICACCS 2024&quot;,&quot;DOI&quot;:&quot;10.1109/ICACCS60874.2024.10717114&quot;,&quot;ISBN&quot;:&quot;9798350384369&quot;,&quot;issued&quot;:{&quot;date-parts&quot;:[[2024]]},&quot;page&quot;:&quot;1008-1013&quot;,&quot;abstract&quot;:&quot;Disasters, whether geological upheavals like earth- quakes or the fury of a cyclonic storm, are often perceived as forces beyond human control. However, viewing them solely as 'natural' phenomena hides the crucial role of human settlements in amplifying their impact. Our tendency to build in floodplains, on earthquake faults, and along vulnerable coastlines transforms these natural events into devastating disasters. This anthropogenic lens underscores the need for proactive measures, with mobile applications emerging as powerful tools for disaster preparedness, communication, and response. Beyond simply acting as emergency sirens, these apps offer a comprehensive toolkit for mitigating disaster risk. Real-time alerts and hazard maps empower communities to prepare for impending threats, allowing for timely evacuation and resource mobilization. Comprehensive guides provide step-by-step instructions on creating emergency kits, securing homes, and staying informed during critical moments. By bridging information gaps and facilitating coordinated action, mobile apps have the potential to significantly bolster disaster safety, equipping individuals and communities with the knowledge and tools to navigate the challenges posed by these complex events.&quot;,&quot;publisher&quot;:&quot;Institute of Electrical and Electronics Engineers Inc.&quot;},&quot;isTemporary&quot;:false},{&quot;id&quot;:&quot;1eb338cb-5eaf-348b-892b-5ab278b99afb&quot;,&quot;itemData&quot;:{&quot;type&quot;:&quot;webpage&quot;,&quot;id&quot;:&quot;1eb338cb-5eaf-348b-892b-5ab278b99afb&quot;,&quot;title&quot;:&quot;Warn API v1: OpenAPI Documentation&quot;,&quot;author&quot;:[{&quot;family&quot;:&quot;GeoSphere Austria&quot;,&quot;given&quot;:&quot;&quot;,&quot;parse-names&quot;:false,&quot;dropping-particle&quot;:&quot;&quot;,&quot;non-dropping-particle&quot;:&quot;&quot;}],&quot;container-title&quot;:&quot;GeoSphere Austria Swagger UI&quot;,&quot;accessed&quot;:{&quot;date-parts&quot;:[[2026,5,11]]},&quot;URL&quot;:&quot;https://openapi.hub.geosphere.at/warnapi/v1/&quot;},&quot;isTemporary&quot;:false},{&quot;id&quot;:&quot;f7319c76-9025-35c1-aaa8-5ecc17c656ae&quot;,&quot;itemData&quot;:{&quot;type&quot;:&quot;webpage&quot;,&quot;id&quot;:&quot;f7319c76-9025-35c1-aaa8-5ecc17c656ae&quot;,&quot;title&quot;:&quot;AT-Alert Web Dashboard&quot;,&quot;author&quot;:[{&quot;family&quot;:&quot;Rundfunk und Telekom Regulierungs GmbH&quot;,&quot;given&quot;:&quot;&quot;,&quot;parse-names&quot;:false,&quot;dropping-particle&quot;:&quot;&quot;,&quot;non-dropping-particle&quot;:&quot;&quot;}],&quot;container-title&quot;:&quot;AT-Alert - öffentliches Warnsystem&quot;,&quot;accessed&quot;:{&quot;date-parts&quot;:[[2026,5,11]]},&quot;URL&quot;:&quot;https://warnungen.at-alert.at/en&quot;},&quot;isTemporary&quot;:false},{&quot;id&quot;:&quot;350bf848-c1ea-3b59-b057-5de5c2d5479e&quot;,&quot;itemData&quot;:{&quot;type&quot;:&quot;webpage&quot;,&quot;id&quot;:&quot;350bf848-c1ea-3b59-b057-5de5c2d5479e&quot;,&quot;title&quot;:&quot;Current measurements from the radiation early warning system&quot;,&quot;author&quot;:[{&quot;family&quot;:&quot;Austrian Federal Ministry of Agriculture Forestry Climate and Environmental Protection Regions and Water Management&quot;,&quot;given&quot;:&quot;&quot;,&quot;parse-names&quot;:false,&quot;dropping-particle&quot;:&quot;&quot;,&quot;non-dropping-particle&quot;:&quot;&quot;}],&quot;container-title&quot;:&quot;Radiation early warning system and monitoring&quot;,&quot;accessed&quot;:{&quot;date-parts&quot;:[[2026,5,11]]},&quot;URL&quot;:&quot;https://www.bmluk.gv.at/themen/klima-und-umwelt/strahlenschutz/fruehwarnsystem/messwerte.html&quot;},&quot;isTemporary&quot;:false},{&quot;id&quot;:&quot;52865776-bddc-3507-8c04-a91ef305c533&quot;,&quot;itemData&quot;:{&quot;type&quot;:&quot;webpage&quot;,&quot;id&quot;:&quot;52865776-bddc-3507-8c04-a91ef305c533&quot;,&quot;title&quot;:&quot;Open-Meteo.com Air Quality API&quot;,&quot;author&quot;:[{&quot;family&quot;:&quot;Zippenfenig&quot;,&quot;given&quot;:&quot;Patrick&quot;,&quot;parse-names&quot;:false,&quot;dropping-particle&quot;:&quot;&quot;,&quot;non-dropping-particle&quot;:&quot;&quot;}],&quot;container-title&quot;:&quot;Open-Meteo and Copernicus Atmosphere Monitoring Service (CAMS)&quot;,&quot;accessed&quot;:{&quot;date-parts&quot;:[[2026,5,11]]},&quot;DOI&quot;:&quot;10.5281/ZENODO.7970649&quot;,&quot;URL&quot;:&quot;https://open-meteo.com/en/docs/air-quality-api&quot;,&quot;issued&quot;:{&quot;date-parts&quot;:[[2023]]}},&quot;isTemporary&quot;:false}],&quot;citationTag&quot;:&quot;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&quot;}]"/>
     <we:property name="MENDELEY_CITATIONS_STYLE" value="{&quot;id&quot;:&quot;https://www.zotero.org/styles/apa&quot;,&quot;title&quot;:&quot;APA Style 7th edition&quot;,&quot;format&quot;:&quot;author-date&quot;,&quot;defaultLocale&quot;:null,&quot;isLocaleCodeValid&quot;:true}"/>
   </we:properties>
   <we:bindings/>

</xml_diff>

<commit_message>
Literature review ready for peer review
</commit_message>
<xml_diff>
--- a/Literature Review.docx
+++ b/Literature Review.docx
@@ -2,6 +2,34 @@
 <file path=word/document.xml><?xml version="1.0" encoding="utf-8"?>
 <w:document xmlns:wpc="http://schemas.microsoft.com/office/word/2010/wordprocessingCanvas" xmlns:cx="http://schemas.microsoft.com/office/drawing/2014/chartex" xmlns:cx1="http://schemas.microsoft.com/office/drawing/2015/9/8/chartex" xmlns:cx2="http://schemas.microsoft.com/office/drawing/2015/10/21/chartex" xmlns:cx3="http://schemas.microsoft.com/office/drawing/2016/5/9/chartex" xmlns:cx4="http://schemas.microsoft.com/office/drawing/2016/5/10/chartex" xmlns:cx5="http://schemas.microsoft.com/office/drawing/2016/5/11/chartex" xmlns:cx6="http://schemas.microsoft.com/office/drawing/2016/5/12/chartex" xmlns:cx7="http://schemas.microsoft.com/office/drawing/2016/5/13/chartex" xmlns:cx8="http://schemas.microsoft.com/office/drawing/2016/5/14/chartex" xmlns:mc="http://schemas.openxmlformats.org/markup-compatibility/2006" xmlns:aink="http://schemas.microsoft.com/office/drawing/2016/ink" xmlns:am3d="http://schemas.microsoft.com/office/drawing/2017/model3d" xmlns:o="urn:schemas-microsoft-com:office:office" xmlns:oel="http://schemas.microsoft.com/office/2019/extlst" xmlns:r="http://schemas.openxmlformats.org/officeDocument/2006/relationships" xmlns:m="http://schemas.openxmlformats.org/officeDocument/2006/math" xmlns:v="urn:schemas-microsoft-com:vml" xmlns:wp14="http://schemas.microsoft.com/office/word/2010/wordprocessingDrawing" xmlns:wp="http://schemas.openxmlformats.org/drawingml/2006/wordprocessingDrawing" xmlns:w10="urn:schemas-microsoft-com:office:word" xmlns:w="http://schemas.openxmlformats.org/wordprocessingml/2006/main" xmlns:w14="http://schemas.microsoft.com/office/word/2010/wordml" xmlns:w15="http://schemas.microsoft.com/office/word/2012/wordml" xmlns:w16cex="http://schemas.microsoft.com/office/word/2018/wordml/cex" xmlns:w16cid="http://schemas.microsoft.com/office/word/2016/wordml/cid" xmlns:w16="http://schemas.microsoft.com/office/word/2018/wordml" xmlns:w16du="http://schemas.microsoft.com/office/word/2023/wordml/word16du" xmlns:w16sdtdh="http://schemas.microsoft.com/office/word/2020/wordml/sdtdatahash" xmlns:w16sdtfl="http://schemas.microsoft.com/office/word/2024/wordml/sdtformatlock" xmlns:w16se="http://schemas.microsoft.com/office/word/2015/wordml/symex" xmlns:wpg="http://schemas.microsoft.com/office/word/2010/wordprocessingGroup" xmlns:wpi="http://schemas.microsoft.com/office/word/2010/wordprocessingInk" xmlns:wne="http://schemas.microsoft.com/office/word/2006/wordml" xmlns:wps="http://schemas.microsoft.com/office/word/2010/wordprocessingShape" mc:Ignorable="w14 w15 w16se w16cid w16 w16cex w16sdtdh w16sdtfl w16du wp14">
   <w:body>
+    <w:p>
+      <w:pPr>
+        <w:rPr>
+          <w:b/>
+          <w:bCs/>
+          <w:color w:val="7030A0"/>
+          <w:lang w:val="en-US"/>
+        </w:rPr>
+      </w:pPr>
+      <w:r>
+        <w:rPr>
+          <w:b/>
+          <w:bCs/>
+          <w:color w:val="7030A0"/>
+          <w:lang w:val="en-US"/>
+        </w:rPr>
+        <w:t xml:space="preserve">Project template: </w:t>
+      </w:r>
+      <w:r>
+        <w:rPr>
+          <w:b/>
+          <w:bCs/>
+          <w:color w:val="7030A0"/>
+          <w:lang w:val="en-US"/>
+        </w:rPr>
+        <w:t>Developing a Mobile App for Local Disaster Preparedness and Response</w:t>
+      </w:r>
+    </w:p>
     <w:p>
       <w:pPr>
         <w:pStyle w:val="Heading1"/>
@@ -186,14 +214,12 @@
         </w:rPr>
         <w:t xml:space="preserve">proposed </w:t>
       </w:r>
-      <w:proofErr w:type="spellStart"/>
       <w:r>
         <w:rPr>
           <w:lang w:val="en-AT"/>
         </w:rPr>
         <w:t>SakunAPP</w:t>
       </w:r>
-      <w:proofErr w:type="spellEnd"/>
       <w:r>
         <w:rPr>
           <w:lang w:val="en-AT"/>
@@ -266,21 +292,7 @@
         <w:rPr>
           <w:lang w:val="en-AT"/>
         </w:rPr>
-        <w:t xml:space="preserve"> the aim of </w:t>
-      </w:r>
-      <w:proofErr w:type="spellStart"/>
-      <w:r>
-        <w:rPr>
-          <w:lang w:val="en-AT"/>
-        </w:rPr>
-        <w:t>ReadyAlert</w:t>
-      </w:r>
-      <w:proofErr w:type="spellEnd"/>
-      <w:r>
-        <w:rPr>
-          <w:lang w:val="en-AT"/>
-        </w:rPr>
-        <w:t xml:space="preserve">, to combine </w:t>
+        <w:t xml:space="preserve"> the aim of ReadyAlert, to combine </w:t>
       </w:r>
       <w:r>
         <w:rPr>
@@ -304,21 +316,7 @@
         <w:rPr>
           <w:lang w:val="en-AT"/>
         </w:rPr>
-        <w:t xml:space="preserve">owever, </w:t>
-      </w:r>
-      <w:proofErr w:type="spellStart"/>
-      <w:r>
-        <w:rPr>
-          <w:lang w:val="en-AT"/>
-        </w:rPr>
-        <w:t>SakunAPP</w:t>
-      </w:r>
-      <w:proofErr w:type="spellEnd"/>
-      <w:r>
-        <w:rPr>
-          <w:lang w:val="en-AT"/>
-        </w:rPr>
-        <w:t xml:space="preserve"> </w:t>
+        <w:t xml:space="preserve">owever, SakunAPP </w:t>
       </w:r>
       <w:r>
         <w:rPr>
@@ -336,21 +334,7 @@
         <w:rPr>
           <w:lang w:val="en-AT"/>
         </w:rPr>
-        <w:t xml:space="preserve"> to manually report weather or natural disaster incidents. </w:t>
-      </w:r>
-      <w:proofErr w:type="spellStart"/>
-      <w:r>
-        <w:rPr>
-          <w:lang w:val="en-AT"/>
-        </w:rPr>
-        <w:t>ReadyAlert</w:t>
-      </w:r>
-      <w:proofErr w:type="spellEnd"/>
-      <w:r>
-        <w:rPr>
-          <w:lang w:val="en-AT"/>
-        </w:rPr>
-        <w:t xml:space="preserve"> would handle this differently, by receiving the disaster alerts from official API sources automatically. In addition, this app is</w:t>
+        <w:t xml:space="preserve"> to manually report weather or natural disaster incidents. ReadyAlert would handle this differently, by receiving the disaster alerts from official API sources automatically. In addition, this app is</w:t>
       </w:r>
       <w:r>
         <w:rPr>
@@ -579,19 +563,11 @@
         </w:rPr>
         <w:t xml:space="preserve">. </w:t>
       </w:r>
-      <w:proofErr w:type="spellStart"/>
-      <w:r>
-        <w:rPr>
-          <w:lang w:val="en-AT"/>
-        </w:rPr>
-        <w:t>ReadyAlert</w:t>
-      </w:r>
-      <w:proofErr w:type="spellEnd"/>
-      <w:r>
-        <w:rPr>
-          <w:lang w:val="en-AT"/>
-        </w:rPr>
-        <w:t xml:space="preserve"> will not rely on the device sensors to estimate the severity of an </w:t>
+      <w:r>
+        <w:rPr>
+          <w:lang w:val="en-AT"/>
+        </w:rPr>
+        <w:t xml:space="preserve">ReadyAlert will not rely on the device sensors to estimate the severity of an </w:t>
       </w:r>
       <w:r>
         <w:rPr>
@@ -642,21 +618,7 @@
         <w:rPr>
           <w:lang w:val="en-US"/>
         </w:rPr>
-        <w:t xml:space="preserve">they are still useful in this review because they represent real applications that users can install and compare with </w:t>
-      </w:r>
-      <w:proofErr w:type="spellStart"/>
-      <w:r>
-        <w:rPr>
-          <w:lang w:val="en-US"/>
-        </w:rPr>
-        <w:t>ReadyAlert</w:t>
-      </w:r>
-      <w:proofErr w:type="spellEnd"/>
-      <w:r>
-        <w:rPr>
-          <w:lang w:val="en-US"/>
-        </w:rPr>
-        <w:t xml:space="preserve">. App store listings and official service websites can be considered credible for identifying an app’s publisher, target purpose, and </w:t>
+        <w:t xml:space="preserve">they are still useful in this review because they represent real applications that users can install and compare with ReadyAlert. App store listings and official service websites can be considered credible for identifying an app’s publisher, target purpose, and </w:t>
       </w:r>
       <w:proofErr w:type="gramStart"/>
       <w:r>
@@ -676,7 +638,14 @@
         <w:rPr>
           <w:lang w:val="en-US"/>
         </w:rPr>
-        <w:t xml:space="preserve"> The apps mentioned here were found by looking at the most downloaded apps for Weather, First Aid, or Disaster Alerts.</w:t>
+        <w:t xml:space="preserve"> The </w:t>
+      </w:r>
+      <w:r>
+        <w:rPr>
+          <w:lang w:val="en-US"/>
+        </w:rPr>
+        <w:lastRenderedPageBreak/>
+        <w:t>apps mentioned here were found by looking at the most downloaded apps for Weather, First Aid, or Disaster Alerts.</w:t>
       </w:r>
     </w:p>
     <w:p>
@@ -689,7 +658,6 @@
         <w:rPr>
           <w:lang w:val="en-AT"/>
         </w:rPr>
-        <w:lastRenderedPageBreak/>
         <w:t xml:space="preserve">In Austria and nearby regions, disaster-related applications are often specialized. For example, </w:t>
       </w:r>
       <w:r>
@@ -698,25 +666,7 @@
           <w:bCs/>
           <w:lang w:val="en-AT"/>
         </w:rPr>
-        <w:t xml:space="preserve">Erste </w:t>
-      </w:r>
-      <w:proofErr w:type="spellStart"/>
-      <w:r>
-        <w:rPr>
-          <w:b/>
-          <w:bCs/>
-          <w:lang w:val="en-AT"/>
-        </w:rPr>
-        <w:t>Hilfe</w:t>
-      </w:r>
-      <w:proofErr w:type="spellEnd"/>
-      <w:r>
-        <w:rPr>
-          <w:b/>
-          <w:bCs/>
-          <w:lang w:val="en-AT"/>
-        </w:rPr>
-        <w:t xml:space="preserve"> - Rotes Kreuz</w:t>
+        <w:t>Erste Hilfe - Rotes Kreuz</w:t>
       </w:r>
       <w:r>
         <w:rPr>
@@ -750,25 +700,7 @@
               <w:color w:val="000000"/>
               <w:lang w:val="en-AT"/>
             </w:rPr>
-            <w:t>(</w:t>
-          </w:r>
-          <w:proofErr w:type="spellStart"/>
-          <w:r>
-            <w:rPr>
-              <w:rFonts w:ascii="Aptos" w:hAnsi="Aptos"/>
-              <w:color w:val="000000"/>
-              <w:lang w:val="en-AT"/>
-            </w:rPr>
-            <w:t>Österr</w:t>
-          </w:r>
-          <w:proofErr w:type="spellEnd"/>
-          <w:r>
-            <w:rPr>
-              <w:rFonts w:ascii="Aptos" w:hAnsi="Aptos"/>
-              <w:color w:val="000000"/>
-              <w:lang w:val="en-AT"/>
-            </w:rPr>
-            <w:t>. Rotes Kreuz, 2024)</w:t>
+            <w:t>(Österr. Rotes Kreuz, 2024)</w:t>
           </w:r>
         </w:sdtContent>
       </w:sdt>
@@ -845,25 +777,7 @@
               <w:color w:val="000000"/>
               <w:lang w:val="en-AT"/>
             </w:rPr>
-            <w:t>(</w:t>
-          </w:r>
-          <w:proofErr w:type="spellStart"/>
-          <w:r>
-            <w:rPr>
-              <w:rFonts w:ascii="Aptos" w:hAnsi="Aptos"/>
-              <w:color w:val="000000"/>
-              <w:lang w:val="en-AT"/>
-            </w:rPr>
-            <w:t>Ubimet</w:t>
-          </w:r>
-          <w:proofErr w:type="spellEnd"/>
-          <w:r>
-            <w:rPr>
-              <w:rFonts w:ascii="Aptos" w:hAnsi="Aptos"/>
-              <w:color w:val="000000"/>
-              <w:lang w:val="en-AT"/>
-            </w:rPr>
-            <w:t xml:space="preserve"> Int. AG, 2025)</w:t>
+            <w:t>(Ubimet Int. AG, 2025)</w:t>
           </w:r>
         </w:sdtContent>
       </w:sdt>
@@ -873,41 +787,13 @@
         </w:rPr>
         <w:t xml:space="preserve">. Similarly, </w:t>
       </w:r>
-      <w:proofErr w:type="spellStart"/>
       <w:r>
         <w:rPr>
           <w:b/>
           <w:bCs/>
           <w:lang w:val="en-AT"/>
         </w:rPr>
-        <w:t>FloodAlert</w:t>
-      </w:r>
-      <w:proofErr w:type="spellEnd"/>
-      <w:r>
-        <w:rPr>
-          <w:b/>
-          <w:bCs/>
-          <w:lang w:val="en-AT"/>
-        </w:rPr>
-        <w:t xml:space="preserve"> </w:t>
-      </w:r>
-      <w:proofErr w:type="spellStart"/>
-      <w:r>
-        <w:rPr>
-          <w:b/>
-          <w:bCs/>
-          <w:lang w:val="en-AT"/>
-        </w:rPr>
-        <w:t>Waterlevel</w:t>
-      </w:r>
-      <w:proofErr w:type="spellEnd"/>
-      <w:r>
-        <w:rPr>
-          <w:b/>
-          <w:bCs/>
-          <w:lang w:val="en-AT"/>
-        </w:rPr>
-        <w:t xml:space="preserve"> Alerts</w:t>
+        <w:t>FloodAlert Waterlevel Alerts</w:t>
       </w:r>
       <w:r>
         <w:rPr>
@@ -991,21 +877,7 @@
         <w:rPr>
           <w:lang w:val="en-AT"/>
         </w:rPr>
-        <w:t xml:space="preserve">; and </w:t>
-      </w:r>
-      <w:proofErr w:type="spellStart"/>
-      <w:r>
-        <w:rPr>
-          <w:lang w:val="en-AT"/>
-        </w:rPr>
-        <w:t>FloodAlert</w:t>
-      </w:r>
-      <w:proofErr w:type="spellEnd"/>
-      <w:r>
-        <w:rPr>
-          <w:lang w:val="en-AT"/>
-        </w:rPr>
-        <w:t xml:space="preserve"> is too technical for an average user and does not bring any instructions on how to find, filter and use the data.</w:t>
+        <w:t>; and FloodAlert is too technical for an average user and does not bring any instructions on how to find, filter and use the data.</w:t>
       </w:r>
     </w:p>
     <w:p>
@@ -1052,25 +924,7 @@
               <w:color w:val="000000"/>
               <w:lang w:val="en-AT"/>
             </w:rPr>
-            <w:t>(</w:t>
-          </w:r>
-          <w:proofErr w:type="spellStart"/>
-          <w:r>
-            <w:rPr>
-              <w:rFonts w:ascii="Aptos" w:hAnsi="Aptos"/>
-              <w:color w:val="000000"/>
-              <w:lang w:val="en-AT"/>
-            </w:rPr>
-            <w:t>CombiRisk</w:t>
-          </w:r>
-          <w:proofErr w:type="spellEnd"/>
-          <w:r>
-            <w:rPr>
-              <w:rFonts w:ascii="Aptos" w:hAnsi="Aptos"/>
-              <w:color w:val="000000"/>
-              <w:lang w:val="en-AT"/>
-            </w:rPr>
-            <w:t xml:space="preserve"> Risk-Management GmbH, 2025)</w:t>
+            <w:t>(CombiRisk Risk-Management GmbH, 2025)</w:t>
           </w:r>
         </w:sdtContent>
       </w:sdt>
@@ -1086,21 +940,7 @@
         <w:rPr>
           <w:lang w:val="en-AT"/>
         </w:rPr>
-        <w:t xml:space="preserve">In this sense, </w:t>
-      </w:r>
-      <w:proofErr w:type="spellStart"/>
-      <w:r>
-        <w:rPr>
-          <w:lang w:val="en-AT"/>
-        </w:rPr>
-        <w:t>ReadyAlert</w:t>
-      </w:r>
-      <w:proofErr w:type="spellEnd"/>
-      <w:r>
-        <w:rPr>
-          <w:lang w:val="en-AT"/>
-        </w:rPr>
-        <w:t xml:space="preserve"> would include what </w:t>
+        <w:t xml:space="preserve">In this sense, ReadyAlert would include what </w:t>
       </w:r>
       <w:r>
         <w:rPr>
@@ -1153,23 +993,13 @@
         </w:rPr>
         <w:t xml:space="preserve"> and </w:t>
       </w:r>
-      <w:proofErr w:type="spellStart"/>
       <w:r>
         <w:rPr>
           <w:b/>
           <w:bCs/>
           <w:lang w:val="en-AT"/>
         </w:rPr>
-        <w:t>Disastermon</w:t>
-      </w:r>
-      <w:proofErr w:type="spellEnd"/>
-      <w:r>
-        <w:rPr>
-          <w:b/>
-          <w:bCs/>
-          <w:lang w:val="en-AT"/>
-        </w:rPr>
-        <w:t xml:space="preserve"> Natural Disaster Monitor</w:t>
+        <w:t>Disastermon Natural Disaster Monitor</w:t>
       </w:r>
       <w:r>
         <w:rPr>
@@ -1203,25 +1033,7 @@
               <w:color w:val="000000"/>
               <w:lang w:val="en-AT"/>
             </w:rPr>
-            <w:t>(</w:t>
-          </w:r>
-          <w:proofErr w:type="spellStart"/>
-          <w:r>
-            <w:rPr>
-              <w:rFonts w:ascii="Aptos" w:hAnsi="Aptos"/>
-              <w:color w:val="000000"/>
-              <w:lang w:val="en-AT"/>
-            </w:rPr>
-            <w:t>Gehirn</w:t>
-          </w:r>
-          <w:proofErr w:type="spellEnd"/>
-          <w:r>
-            <w:rPr>
-              <w:rFonts w:ascii="Aptos" w:hAnsi="Aptos"/>
-              <w:color w:val="000000"/>
-              <w:lang w:val="en-AT"/>
-            </w:rPr>
-            <w:t xml:space="preserve"> Inc., 2026; dominoc925, 2026)</w:t>
+            <w:t>(Gehirn Inc., 2026; dominoc925, 2026)</w:t>
           </w:r>
         </w:sdtContent>
       </w:sdt>
@@ -1231,19 +1043,11 @@
         </w:rPr>
         <w:t xml:space="preserve">. These examples are useful because they demonstrate that users may benefit from applications that combine multiple types of disaster-related information. However, </w:t>
       </w:r>
-      <w:proofErr w:type="spellStart"/>
-      <w:r>
-        <w:rPr>
-          <w:lang w:val="en-AT"/>
-        </w:rPr>
-        <w:t>Disastermon</w:t>
-      </w:r>
-      <w:proofErr w:type="spellEnd"/>
-      <w:r>
-        <w:rPr>
-          <w:lang w:val="en-AT"/>
-        </w:rPr>
-        <w:t xml:space="preserve"> lacks significantly in its UX making the navigation and usage confusing and overwhelming, as it does not follow many UI standards in its design.</w:t>
+      <w:r>
+        <w:rPr>
+          <w:lang w:val="en-AT"/>
+        </w:rPr>
+        <w:t>Disastermon lacks significantly in its UX making the navigation and usage confusing and overwhelming, as it does not follow many UI standards in its design.</w:t>
       </w:r>
       <w:r>
         <w:rPr>
@@ -1269,14 +1073,12 @@
         </w:rPr>
         <w:t xml:space="preserve"> prevention app in Japan and it has a very polished and clear UI that will serve as the main inspiration of </w:t>
       </w:r>
-      <w:proofErr w:type="spellStart"/>
       <w:r>
         <w:rPr>
           <w:lang w:val="en-AT"/>
         </w:rPr>
         <w:t>ReadyAlert</w:t>
       </w:r>
-      <w:proofErr w:type="spellEnd"/>
       <w:r>
         <w:rPr>
           <w:lang w:val="en-AT"/>
@@ -1294,16 +1096,8 @@
         <w:rPr>
           <w:lang w:val="en-AT"/>
         </w:rPr>
-        <w:t xml:space="preserve">Overall, the existing app landscape shows a clear pattern. Many applications provide useful disaster-related functions, but they are usually focused on a specific category such as first aid, weather, flooding, or general alerts. This supports the motivation for </w:t>
-      </w:r>
-      <w:proofErr w:type="spellStart"/>
-      <w:r>
-        <w:rPr>
-          <w:lang w:val="en-AT"/>
-        </w:rPr>
-        <w:t>ReadyAlert</w:t>
-      </w:r>
-      <w:proofErr w:type="spellEnd"/>
+        <w:t>Overall, the existing app landscape shows a clear pattern. Many applications provide useful disaster-related functions, but they are usually focused on a specific category such as first aid, weather, flooding, or general alerts. This supports the motivation for ReadyAlert</w:t>
+      </w:r>
       <w:r>
         <w:rPr>
           <w:lang w:val="en-AT"/>
@@ -1347,21 +1141,7 @@
         <w:rPr>
           <w:lang w:val="en-AT"/>
         </w:rPr>
-        <w:t xml:space="preserve">For </w:t>
-      </w:r>
-      <w:proofErr w:type="spellStart"/>
-      <w:r>
-        <w:rPr>
-          <w:lang w:val="en-AT"/>
-        </w:rPr>
-        <w:t>ReadyAlert</w:t>
-      </w:r>
-      <w:proofErr w:type="spellEnd"/>
-      <w:r>
-        <w:rPr>
-          <w:lang w:val="en-AT"/>
-        </w:rPr>
-        <w:t xml:space="preserve">, official and reliable data sources are especially important because disaster-preparedness applications should not depend only on unofficial or unclear information. Austria already provides several relevant public information services. For example, the </w:t>
+        <w:t xml:space="preserve">For ReadyAlert, official and reliable data sources are especially important because disaster-preparedness applications should not depend only on unofficial or unclear information. Austria already provides several relevant public information services. For example, the </w:t>
       </w:r>
       <w:r>
         <w:rPr>
@@ -1403,25 +1183,7 @@
               <w:color w:val="000000"/>
               <w:lang w:val="en-AT"/>
             </w:rPr>
-            <w:t xml:space="preserve">(Rundfunk und Telekom </w:t>
-          </w:r>
-          <w:proofErr w:type="spellStart"/>
-          <w:r>
-            <w:rPr>
-              <w:rFonts w:ascii="Aptos" w:hAnsi="Aptos"/>
-              <w:color w:val="000000"/>
-              <w:lang w:val="en-AT"/>
-            </w:rPr>
-            <w:t>Regulierungs</w:t>
-          </w:r>
-          <w:proofErr w:type="spellEnd"/>
-          <w:r>
-            <w:rPr>
-              <w:rFonts w:ascii="Aptos" w:hAnsi="Aptos"/>
-              <w:color w:val="000000"/>
-              <w:lang w:val="en-AT"/>
-            </w:rPr>
-            <w:t xml:space="preserve"> GmbH, n.d.)</w:t>
+            <w:t>(Rundfunk und Telekom Regulierungs GmbH, n.d.)</w:t>
           </w:r>
         </w:sdtContent>
       </w:sdt>
@@ -1438,19 +1200,12 @@
           <w:lang w:val="en-AT"/>
         </w:rPr>
       </w:pPr>
-      <w:proofErr w:type="spellStart"/>
-      <w:r>
-        <w:rPr>
-          <w:lang w:val="en-AT"/>
-        </w:rPr>
-        <w:t>GeoSphere</w:t>
-      </w:r>
-      <w:proofErr w:type="spellEnd"/>
-      <w:r>
-        <w:rPr>
-          <w:lang w:val="en-AT"/>
-        </w:rPr>
-        <w:t xml:space="preserve"> Austria also provides official weather warning data through the </w:t>
+      <w:r>
+        <w:rPr>
+          <w:lang w:val="en-AT"/>
+        </w:rPr>
+        <w:lastRenderedPageBreak/>
+        <w:t xml:space="preserve">GeoSphere Austria also provides official weather warning data through the </w:t>
       </w:r>
       <w:r>
         <w:rPr>
@@ -1486,25 +1241,7 @@
               <w:color w:val="000000"/>
               <w:lang w:val="en-AT"/>
             </w:rPr>
-            <w:t>(</w:t>
-          </w:r>
-          <w:proofErr w:type="spellStart"/>
-          <w:r>
-            <w:rPr>
-              <w:rFonts w:ascii="Aptos" w:hAnsi="Aptos"/>
-              <w:color w:val="000000"/>
-              <w:lang w:val="en-AT"/>
-            </w:rPr>
-            <w:t>GeoSphere</w:t>
-          </w:r>
-          <w:proofErr w:type="spellEnd"/>
-          <w:r>
-            <w:rPr>
-              <w:rFonts w:ascii="Aptos" w:hAnsi="Aptos"/>
-              <w:color w:val="000000"/>
-              <w:lang w:val="en-AT"/>
-            </w:rPr>
-            <w:t xml:space="preserve"> Austria, n.d.)</w:t>
+            <w:t>(GeoSphere Austria, n.d.)</w:t>
           </w:r>
         </w:sdtContent>
       </w:sdt>
@@ -1518,21 +1255,7 @@
         <w:rPr>
           <w:lang w:val="en-AT"/>
         </w:rPr>
-        <w:t xml:space="preserve"> API can allow </w:t>
-      </w:r>
-      <w:proofErr w:type="spellStart"/>
-      <w:r>
-        <w:rPr>
-          <w:lang w:val="en-AT"/>
-        </w:rPr>
-        <w:t>ReadyAlert</w:t>
-      </w:r>
-      <w:proofErr w:type="spellEnd"/>
-      <w:r>
-        <w:rPr>
-          <w:lang w:val="en-AT"/>
-        </w:rPr>
-        <w:t xml:space="preserve"> to access</w:t>
+        <w:t xml:space="preserve"> API can allow ReadyAlert to access</w:t>
       </w:r>
       <w:r>
         <w:rPr>
@@ -1544,14 +1267,7 @@
         <w:rPr>
           <w:lang w:val="en-AT"/>
         </w:rPr>
-        <w:t xml:space="preserve"> about </w:t>
-      </w:r>
-      <w:r>
-        <w:rPr>
-          <w:lang w:val="en-AT"/>
-        </w:rPr>
-        <w:lastRenderedPageBreak/>
-        <w:t>weather conditions</w:t>
+        <w:t xml:space="preserve"> about weather conditions</w:t>
       </w:r>
       <w:r>
         <w:rPr>
@@ -1661,21 +1377,7 @@
         <w:rPr>
           <w:lang w:val="en-AT"/>
         </w:rPr>
-        <w:t xml:space="preserve">Air quality is another relevant category for disaster awareness and environmental health. </w:t>
-      </w:r>
-      <w:proofErr w:type="spellStart"/>
-      <w:r>
-        <w:rPr>
-          <w:lang w:val="en-AT"/>
-        </w:rPr>
-        <w:t>Zippenfenig</w:t>
-      </w:r>
-      <w:proofErr w:type="spellEnd"/>
-      <w:r>
-        <w:rPr>
-          <w:lang w:val="en-AT"/>
-        </w:rPr>
-        <w:t xml:space="preserve"> (2023) </w:t>
+        <w:t xml:space="preserve">Air quality is another relevant category for disaster awareness and environmental health. Zippenfenig (2023) </w:t>
       </w:r>
       <w:r>
         <w:rPr>
@@ -1687,35 +1389,7 @@
         <w:rPr>
           <w:lang w:val="en-AT"/>
         </w:rPr>
-        <w:t xml:space="preserve"> the Open-</w:t>
-      </w:r>
-      <w:proofErr w:type="spellStart"/>
-      <w:r>
-        <w:rPr>
-          <w:lang w:val="en-AT"/>
-        </w:rPr>
-        <w:t>Meteo</w:t>
-      </w:r>
-      <w:proofErr w:type="spellEnd"/>
-      <w:r>
-        <w:rPr>
-          <w:lang w:val="en-AT"/>
-        </w:rPr>
-        <w:t xml:space="preserve"> Air Quality API, which uses data from Open-</w:t>
-      </w:r>
-      <w:proofErr w:type="spellStart"/>
-      <w:r>
-        <w:rPr>
-          <w:lang w:val="en-AT"/>
-        </w:rPr>
-        <w:t>Meteo</w:t>
-      </w:r>
-      <w:proofErr w:type="spellEnd"/>
-      <w:r>
-        <w:rPr>
-          <w:lang w:val="en-AT"/>
-        </w:rPr>
-        <w:t xml:space="preserve"> and the Copernicus Atmosphere Monitoring Service. This </w:t>
+        <w:t xml:space="preserve"> the Open-Meteo Air Quality API, which uses data from Open-Meteo and the Copernicus Atmosphere Monitoring Service. This </w:t>
       </w:r>
       <w:r>
         <w:rPr>
@@ -1788,21 +1462,7 @@
         <w:rPr>
           <w:lang w:val="en-AT"/>
         </w:rPr>
-        <w:t xml:space="preserve">These official and technical sources show that Austria has access to valuable disaster-related and environmental data. The issue is not necessarily the absence of data, but the separation of that data across multiple services. </w:t>
-      </w:r>
-      <w:proofErr w:type="spellStart"/>
-      <w:r>
-        <w:rPr>
-          <w:lang w:val="en-AT"/>
-        </w:rPr>
-        <w:t>ReadyAlert</w:t>
-      </w:r>
-      <w:proofErr w:type="spellEnd"/>
-      <w:r>
-        <w:rPr>
-          <w:lang w:val="en-AT"/>
-        </w:rPr>
-        <w:t xml:space="preserve"> is therefore positioned as an integration-focused project. Its contribution is to explore how these different categories of information could be presented together in a single mobile application.</w:t>
+        <w:t>These official and technical sources show that Austria has access to valuable disaster-related and environmental data. The issue is not necessarily the absence of data, but the separation of that data across multiple services. ReadyAlert is therefore positioned as an integration-focused project. Its contribution is to explore how these different categories of information could be presented together in a single mobile application.</w:t>
       </w:r>
     </w:p>
     <w:p>
@@ -1823,791 +1483,1560 @@
         <w:rPr>
           <w:lang w:val="en-US"/>
         </w:rPr>
-        <w:t xml:space="preserve">Gamification is relevant to </w:t>
-      </w:r>
-      <w:proofErr w:type="spellStart"/>
-      <w:r>
-        <w:rPr>
-          <w:lang w:val="en-US"/>
-        </w:rPr>
-        <w:t>ReadyAlert</w:t>
-      </w:r>
-      <w:proofErr w:type="spellEnd"/>
-      <w:r>
-        <w:rPr>
-          <w:lang w:val="en-US"/>
-        </w:rPr>
-        <w:t xml:space="preserve"> because the app is intended to support preparedness before an emergency occurs, not only during an emergency. Deterding et al. (2011) </w:t>
-      </w:r>
-      <w:proofErr w:type="gramStart"/>
-      <w:r>
-        <w:rPr>
-          <w:lang w:val="en-US"/>
-        </w:rPr>
-        <w:t>define</w:t>
-      </w:r>
-      <w:proofErr w:type="gramEnd"/>
-      <w:r>
-        <w:rPr>
-          <w:lang w:val="en-US"/>
-        </w:rPr>
-        <w:t xml:space="preserve"> gamification as the use of game design elements in non-game contexts. Their paper clarifies that gamification is not the same as creating a full game</w:t>
-      </w:r>
-      <w:r>
-        <w:rPr>
-          <w:highlight w:val="yellow"/>
-          <w:lang w:val="en-US"/>
-        </w:rPr>
-        <w:t xml:space="preserve">. Instead, gamification uses selected elements associated with games, such as goals, feedback, badges, levels, rankings, points, or challenges, inside a non-game system. This distinction is useful for </w:t>
-      </w:r>
-      <w:proofErr w:type="spellStart"/>
-      <w:r>
-        <w:rPr>
-          <w:highlight w:val="yellow"/>
-          <w:lang w:val="en-US"/>
-        </w:rPr>
-        <w:t>ReadyAlert</w:t>
-      </w:r>
-      <w:proofErr w:type="spellEnd"/>
-      <w:r>
-        <w:rPr>
-          <w:highlight w:val="yellow"/>
-          <w:lang w:val="en-US"/>
-        </w:rPr>
-        <w:t xml:space="preserve"> because the app should remain a disaster-preparedness tool, not become an entertainment product.</w:t>
-      </w:r>
-      <w:r>
-        <w:rPr>
-          <w:lang w:val="en-US"/>
-        </w:rPr>
-        <w:t xml:space="preserve"> </w:t>
-      </w:r>
-    </w:p>
-    <w:p>
-      <w:pPr>
-        <w:rPr>
-          <w:lang w:val="en-US"/>
-        </w:rPr>
-      </w:pPr>
-      <w:r>
-        <w:rPr>
-          <w:lang w:val="en-US"/>
-        </w:rPr>
-        <w:t xml:space="preserve">Deterding et al. also distinguish between </w:t>
-      </w:r>
-      <w:proofErr w:type="spellStart"/>
-      <w:r>
-        <w:rPr>
-          <w:lang w:val="en-US"/>
-        </w:rPr>
-        <w:t>gamefulness</w:t>
-      </w:r>
-      <w:proofErr w:type="spellEnd"/>
-      <w:r>
-        <w:rPr>
-          <w:lang w:val="en-US"/>
-        </w:rPr>
-        <w:t xml:space="preserve"> and playfulness. </w:t>
-      </w:r>
-      <w:proofErr w:type="spellStart"/>
-      <w:r>
-        <w:rPr>
-          <w:lang w:val="en-US"/>
-        </w:rPr>
-        <w:t>Gamefulness</w:t>
-      </w:r>
-      <w:proofErr w:type="spellEnd"/>
-      <w:r>
-        <w:rPr>
-          <w:lang w:val="en-US"/>
-        </w:rPr>
-        <w:t xml:space="preserve"> is more connected to structured goals, rules, achievement, and progress, while playfulness is broader and more open-ended. This distinction matters for </w:t>
-      </w:r>
-      <w:proofErr w:type="spellStart"/>
-      <w:r>
-        <w:rPr>
-          <w:lang w:val="en-US"/>
-        </w:rPr>
-        <w:t>ReadyAlert</w:t>
-      </w:r>
-      <w:proofErr w:type="spellEnd"/>
-      <w:r>
-        <w:rPr>
-          <w:lang w:val="en-US"/>
-        </w:rPr>
-        <w:t xml:space="preserve"> because disaster preparedness is a serious context. The app should not make disasters feel like a joke or reduce emergency preparation to superficial entertainment. Instead, gamification should be used in a controlled way to encourage useful actions, such as completing an emergency kit checklist, learning what to do during a weather warning, or answering preparedness questions correctly. In this sense, </w:t>
-      </w:r>
-      <w:proofErr w:type="spellStart"/>
-      <w:r>
-        <w:rPr>
-          <w:lang w:val="en-US"/>
-        </w:rPr>
-        <w:t>ReadyAlert</w:t>
-      </w:r>
-      <w:proofErr w:type="spellEnd"/>
-      <w:r>
-        <w:rPr>
-          <w:lang w:val="en-US"/>
-        </w:rPr>
-        <w:t xml:space="preserve"> should use game elements to support learning and motivation, rather than distract from the seriousness of the topic.</w:t>
-      </w:r>
-    </w:p>
-    <w:p>
-      <w:pPr>
-        <w:rPr>
-          <w:lang w:val="en-US"/>
-        </w:rPr>
-      </w:pPr>
-      <w:proofErr w:type="spellStart"/>
-      <w:r>
-        <w:rPr>
-          <w:lang w:val="en-US"/>
-        </w:rPr>
-        <w:t>Kankanamge</w:t>
-      </w:r>
-      <w:proofErr w:type="spellEnd"/>
-      <w:r>
-        <w:rPr>
-          <w:lang w:val="en-US"/>
-        </w:rPr>
-        <w:t xml:space="preserve"> et al. (2020) </w:t>
-      </w:r>
-      <w:proofErr w:type="gramStart"/>
-      <w:r>
-        <w:rPr>
-          <w:lang w:val="en-US"/>
-        </w:rPr>
-        <w:t>provide</w:t>
-      </w:r>
-      <w:proofErr w:type="gramEnd"/>
-      <w:r>
-        <w:rPr>
-          <w:lang w:val="en-US"/>
-        </w:rPr>
-        <w:t xml:space="preserve"> a disaster-specific view of gamification. Their systematic review examines 51 scholarly articles and 35 disaster-related gamified applications. They classify gamified applications into three main purposes: research, education, and intervention. This classification is useful for </w:t>
-      </w:r>
-      <w:proofErr w:type="spellStart"/>
-      <w:r>
-        <w:rPr>
-          <w:lang w:val="en-US"/>
-        </w:rPr>
-        <w:t>ReadyAlert</w:t>
-      </w:r>
-      <w:proofErr w:type="spellEnd"/>
-      <w:r>
-        <w:rPr>
-          <w:lang w:val="en-US"/>
-        </w:rPr>
-        <w:t xml:space="preserve"> because the app mostly fits into the education category, with some </w:t>
-      </w:r>
-      <w:proofErr w:type="gramStart"/>
-      <w:r>
-        <w:rPr>
-          <w:lang w:val="en-US"/>
-        </w:rPr>
-        <w:t>possible overlap</w:t>
-      </w:r>
-      <w:proofErr w:type="gramEnd"/>
-      <w:r>
-        <w:rPr>
-          <w:lang w:val="en-US"/>
-        </w:rPr>
-        <w:t xml:space="preserve"> with intervention if it encourages users to take real preparedness actions. The review also explains that gamification can motivate community engagement through both intrinsic </w:t>
-      </w:r>
-      <w:proofErr w:type="gramStart"/>
-      <w:r>
-        <w:rPr>
-          <w:lang w:val="en-US"/>
-        </w:rPr>
-        <w:t>motivation</w:t>
-      </w:r>
-      <w:proofErr w:type="gramEnd"/>
-      <w:r>
-        <w:rPr>
-          <w:lang w:val="en-US"/>
-        </w:rPr>
-        <w:t xml:space="preserve">, such as curiosity, learning, contribution, and fun, and extrinsic motivation, such as scores, badges, rewards, rankings, feedback, and goals. This </w:t>
-      </w:r>
-      <w:r>
-        <w:rPr>
-          <w:lang w:val="en-US"/>
-        </w:rPr>
-        <w:lastRenderedPageBreak/>
-        <w:t xml:space="preserve">supports the idea that </w:t>
-      </w:r>
-      <w:proofErr w:type="spellStart"/>
-      <w:r>
-        <w:rPr>
-          <w:lang w:val="en-US"/>
-        </w:rPr>
-        <w:t>ReadyAlert</w:t>
-      </w:r>
-      <w:proofErr w:type="spellEnd"/>
-      <w:r>
-        <w:rPr>
-          <w:lang w:val="en-US"/>
-        </w:rPr>
-        <w:t xml:space="preserve"> should include both meaningful content and visible progress mechanisms.</w:t>
-      </w:r>
-    </w:p>
-    <w:p>
-      <w:pPr>
-        <w:rPr>
-          <w:lang w:val="en-US"/>
-        </w:rPr>
-      </w:pPr>
-      <w:r>
-        <w:rPr>
-          <w:lang w:val="en-US"/>
-        </w:rPr>
-        <w:t xml:space="preserve">At the same time, </w:t>
-      </w:r>
-      <w:proofErr w:type="spellStart"/>
-      <w:r>
-        <w:rPr>
-          <w:lang w:val="en-US"/>
-        </w:rPr>
-        <w:t>Kankanamge</w:t>
-      </w:r>
-      <w:proofErr w:type="spellEnd"/>
-      <w:r>
-        <w:rPr>
-          <w:lang w:val="en-US"/>
-        </w:rPr>
-        <w:t xml:space="preserve"> et al. also </w:t>
-      </w:r>
-      <w:proofErr w:type="gramStart"/>
-      <w:r>
-        <w:rPr>
-          <w:lang w:val="en-US"/>
-        </w:rPr>
-        <w:t>show</w:t>
-      </w:r>
-      <w:proofErr w:type="gramEnd"/>
-      <w:r>
-        <w:rPr>
-          <w:lang w:val="en-US"/>
-        </w:rPr>
-        <w:t xml:space="preserve"> that gamification is not automatically effective. The review highlights that community engagement with disaster planning can be difficult, even when digital tools exist. This is important for </w:t>
-      </w:r>
-      <w:proofErr w:type="spellStart"/>
-      <w:r>
-        <w:rPr>
-          <w:lang w:val="en-US"/>
-        </w:rPr>
-        <w:t>ReadyAlert</w:t>
-      </w:r>
-      <w:proofErr w:type="spellEnd"/>
-      <w:r>
-        <w:rPr>
-          <w:lang w:val="en-US"/>
-        </w:rPr>
-        <w:t xml:space="preserve"> because simply adding badges or quiz points would not guarantee meaningful preparedness. The gamified elements must be connected to real preparedness outcomes. For example, a badge for completing a safety kit checklist is more relevant than a generic reward that has no connection to emergency readiness. The review therefore supports </w:t>
-      </w:r>
-      <w:proofErr w:type="gramStart"/>
-      <w:r>
-        <w:rPr>
-          <w:lang w:val="en-US"/>
-        </w:rPr>
-        <w:t>gamification, but</w:t>
-      </w:r>
-      <w:proofErr w:type="gramEnd"/>
-      <w:r>
-        <w:rPr>
-          <w:lang w:val="en-US"/>
-        </w:rPr>
-        <w:t xml:space="preserve"> also suggests that the design must be purposeful.</w:t>
-      </w:r>
-    </w:p>
-    <w:p>
-      <w:pPr>
-        <w:rPr>
-          <w:lang w:val="en-US"/>
-        </w:rPr>
-      </w:pPr>
-      <w:r>
-        <w:rPr>
-          <w:lang w:val="en-US"/>
-        </w:rPr>
-        <w:t xml:space="preserve">Bai et al. (2024) provide more recent evidence through a scoping review of gamification teaching in disaster education. Their review included 16 studies from eight countries, with 1744 participants. The reviewed studies covered seven categories of gamified disaster education: tabletop games, serious games, scenario simulation games, virtual reality mobile game-based apps, theme games, board games, and escape room games. This is useful for </w:t>
-      </w:r>
-      <w:proofErr w:type="spellStart"/>
-      <w:r>
-        <w:rPr>
-          <w:lang w:val="en-US"/>
-        </w:rPr>
-        <w:t>ReadyAlert</w:t>
-      </w:r>
-      <w:proofErr w:type="spellEnd"/>
-      <w:r>
-        <w:rPr>
-          <w:lang w:val="en-US"/>
-        </w:rPr>
-        <w:t xml:space="preserve"> because it shows that gamification has already been applied to disaster education in several formats, not only in traditional video games.</w:t>
-      </w:r>
-    </w:p>
-    <w:p>
-      <w:pPr>
-        <w:rPr>
-          <w:lang w:val="en-US"/>
-        </w:rPr>
-      </w:pPr>
-      <w:r>
-        <w:rPr>
-          <w:lang w:val="en-US"/>
-        </w:rPr>
-        <w:t xml:space="preserve">Bai et al. report that gamified disaster education can improve knowledge retention, cooperation, realism, disaster awareness, decision-making ability, practical skills, and coping ability. However, their review also identifies limitations in the evidence. Only three studies used randomized controlled trials, only two studies evaluated long-term outcomes, and most included intervention studies did not have a control group. This means the evidence is promising but not definitive. For </w:t>
-      </w:r>
-      <w:proofErr w:type="spellStart"/>
-      <w:r>
-        <w:rPr>
-          <w:lang w:val="en-US"/>
-        </w:rPr>
-        <w:t>ReadyAlert</w:t>
-      </w:r>
-      <w:proofErr w:type="spellEnd"/>
-      <w:r>
-        <w:rPr>
-          <w:lang w:val="en-US"/>
-        </w:rPr>
-        <w:t xml:space="preserve">, this supports a cautious approach: gamification should be included as a justified design strategy, but the paper should not claim that it will </w:t>
-      </w:r>
-      <w:proofErr w:type="gramStart"/>
-      <w:r>
-        <w:rPr>
-          <w:lang w:val="en-US"/>
-        </w:rPr>
-        <w:t>definitely improve</w:t>
-      </w:r>
-      <w:proofErr w:type="gramEnd"/>
-      <w:r>
-        <w:rPr>
-          <w:lang w:val="en-US"/>
-        </w:rPr>
-        <w:t xml:space="preserve"> preparedness without evaluation.</w:t>
-      </w:r>
-    </w:p>
-    <w:p>
-      <w:pPr>
-        <w:rPr>
-          <w:lang w:val="en-US"/>
-        </w:rPr>
-      </w:pPr>
-      <w:r>
-        <w:rPr>
-          <w:lang w:val="en-US"/>
-        </w:rPr>
-        <w:t xml:space="preserve">Matsuno et al. (2021) provide a concrete example of a gamified disaster-prevention smartphone application. Their project focuses on flood disaster evacuation and uses gamification to encourage users to learn about hazard maps, flooded areas, and evacuation points. The app includes a game mode based on Google Street View, </w:t>
-      </w:r>
-      <w:proofErr w:type="spellStart"/>
-      <w:r>
-        <w:rPr>
-          <w:lang w:val="en-US"/>
-        </w:rPr>
-        <w:t>Mapbox</w:t>
-      </w:r>
-      <w:proofErr w:type="spellEnd"/>
-      <w:r>
-        <w:rPr>
-          <w:lang w:val="en-US"/>
-        </w:rPr>
-        <w:t xml:space="preserve">, and hazard map data. Users try to visit evacuation points while avoiding flooded areas, and their performance is measured using elements such as score and ranking. This is directly relevant to </w:t>
-      </w:r>
-      <w:proofErr w:type="spellStart"/>
-      <w:r>
-        <w:rPr>
-          <w:lang w:val="en-US"/>
-        </w:rPr>
-        <w:t>ReadyAlert</w:t>
-      </w:r>
-      <w:proofErr w:type="spellEnd"/>
-      <w:r>
-        <w:rPr>
-          <w:lang w:val="en-US"/>
-        </w:rPr>
-        <w:t xml:space="preserve"> because it demonstrates how real disaster-prevention information can be transformed into an interactive mobile learning experience.</w:t>
-      </w:r>
-    </w:p>
-    <w:p>
-      <w:pPr>
-        <w:rPr>
-          <w:lang w:val="en-US"/>
-        </w:rPr>
-      </w:pPr>
-      <w:r>
-        <w:rPr>
-          <w:lang w:val="en-US"/>
-        </w:rPr>
-        <w:t xml:space="preserve">The evaluation by Matsuno et al. is also useful because it shows both potential and limitations. Their experiment compared users who studied flood evacuation with hazard maps and the smartphone application against users who studied only with hazard maps. The app group performed better in learning evacuation points and inundation areas, and questionnaire results suggested positive effects for interest, ease of use, and continuity. However, the number of participants was small, and the authors state that statistically significant differences were not obtained. This is an important lesson for </w:t>
-      </w:r>
-      <w:proofErr w:type="spellStart"/>
-      <w:r>
-        <w:rPr>
-          <w:lang w:val="en-US"/>
-        </w:rPr>
-        <w:t>ReadyAlert</w:t>
-      </w:r>
-      <w:proofErr w:type="spellEnd"/>
-      <w:r>
-        <w:rPr>
-          <w:lang w:val="en-US"/>
-        </w:rPr>
-        <w:t>: gamification may improve engagement and learning, but evaluation results must be interpreted carefully, especially when the sample size is limited.</w:t>
-      </w:r>
-    </w:p>
-    <w:p>
-      <w:pPr>
-        <w:pStyle w:val="Heading2"/>
-      </w:pPr>
-      <w:r>
-        <w:lastRenderedPageBreak/>
-        <w:t>Comparison and identified gap</w:t>
-      </w:r>
-    </w:p>
-    <w:p>
-      <w:pPr>
-        <w:rPr>
-          <w:lang w:val="en-AT"/>
-        </w:rPr>
-      </w:pPr>
-      <w:r>
-        <w:rPr>
-          <w:lang w:val="en-AT"/>
-        </w:rPr>
-        <w:t>The reviewed sources show that there is already significant work in mobile disaster preparedness, official warning systems, environmental monitoring, and gamified disaster education. Academic studies support the general use of mobile applications for disaster awareness and response (West &amp; Valentini, 2013; Toledo et al., 2017; Nagaraju et al., 2024). Existing applications show that users can already access specific types of disaster-related information, such as first aid, weather warnings, flood alerts, or general disaster notifications (</w:t>
-      </w:r>
-      <w:proofErr w:type="spellStart"/>
-      <w:r>
-        <w:rPr>
-          <w:lang w:val="en-AT"/>
-        </w:rPr>
-        <w:t>Österr</w:t>
-      </w:r>
-      <w:proofErr w:type="spellEnd"/>
-      <w:r>
-        <w:rPr>
-          <w:lang w:val="en-AT"/>
-        </w:rPr>
-        <w:t xml:space="preserve">. Rotes Kreuz, 2024; </w:t>
-      </w:r>
-      <w:proofErr w:type="spellStart"/>
-      <w:r>
-        <w:rPr>
-          <w:lang w:val="en-AT"/>
-        </w:rPr>
-        <w:t>Ubimet</w:t>
-      </w:r>
-      <w:proofErr w:type="spellEnd"/>
-      <w:r>
-        <w:rPr>
-          <w:lang w:val="en-AT"/>
-        </w:rPr>
-        <w:t xml:space="preserve"> Int. AG, 2025; SOBOS GmbH, 2026; </w:t>
-      </w:r>
-      <w:proofErr w:type="spellStart"/>
-      <w:r>
-        <w:rPr>
-          <w:lang w:val="en-AT"/>
-        </w:rPr>
-        <w:t>CombiRisk</w:t>
-      </w:r>
-      <w:proofErr w:type="spellEnd"/>
-      <w:r>
-        <w:rPr>
-          <w:lang w:val="en-AT"/>
-        </w:rPr>
-        <w:t xml:space="preserve"> Risk-Management GmbH, 2025). Official Austrian sources provide credible data for alerts, weather warnings, radiation monitoring, and environmental information (Rundfunk und Telekom </w:t>
-      </w:r>
-      <w:proofErr w:type="spellStart"/>
-      <w:r>
-        <w:rPr>
-          <w:lang w:val="en-AT"/>
-        </w:rPr>
-        <w:t>Regulierungs</w:t>
-      </w:r>
-      <w:proofErr w:type="spellEnd"/>
-      <w:r>
-        <w:rPr>
-          <w:lang w:val="en-AT"/>
-        </w:rPr>
-        <w:t xml:space="preserve"> GmbH, n.d.; </w:t>
-      </w:r>
-      <w:proofErr w:type="spellStart"/>
-      <w:r>
-        <w:rPr>
-          <w:lang w:val="en-AT"/>
-        </w:rPr>
-        <w:t>GeoSphere</w:t>
-      </w:r>
-      <w:proofErr w:type="spellEnd"/>
-      <w:r>
-        <w:rPr>
-          <w:lang w:val="en-AT"/>
-        </w:rPr>
-        <w:t xml:space="preserve"> Austria, n.d.; Austrian Federal Ministry of Agriculture Forestry Climate and Environmental Protection Regions and Water Management, n.d.; </w:t>
-      </w:r>
-      <w:proofErr w:type="spellStart"/>
-      <w:r>
-        <w:rPr>
-          <w:lang w:val="en-AT"/>
-        </w:rPr>
-        <w:t>Zippenfenig</w:t>
-      </w:r>
-      <w:proofErr w:type="spellEnd"/>
-      <w:r>
-        <w:rPr>
-          <w:lang w:val="en-AT"/>
-        </w:rPr>
-        <w:t xml:space="preserve">, 2023). Finally, gamification research suggests that interactive features can improve engagement and learning in disaster-preparedness contexts when they are meaningfully designed (Deterding et al., 2011; </w:t>
-      </w:r>
-      <w:proofErr w:type="spellStart"/>
-      <w:r>
-        <w:rPr>
-          <w:lang w:val="en-AT"/>
-        </w:rPr>
-        <w:t>Kankanamge</w:t>
-      </w:r>
-      <w:proofErr w:type="spellEnd"/>
-      <w:r>
-        <w:rPr>
-          <w:lang w:val="en-AT"/>
-        </w:rPr>
-        <w:t xml:space="preserve"> et al., 2020; Bai et al., 2024; Matsuno et al., 2021).</w:t>
-      </w:r>
-    </w:p>
-    <w:p>
-      <w:pPr>
-        <w:rPr>
-          <w:i/>
-          <w:iCs/>
-          <w:lang w:val="en-AT"/>
-        </w:rPr>
-      </w:pPr>
+        <w:t xml:space="preserve">Gamification is relevant to ReadyAlert because the app is intended to support preparedness </w:t>
+      </w:r>
+      <w:r>
+        <w:rPr>
+          <w:lang w:val="en-US"/>
+        </w:rPr>
+        <w:t xml:space="preserve">before an emergency occurs, not only during an emergency. </w:t>
+      </w:r>
       <w:sdt>
         <w:sdtPr>
           <w:rPr>
             <w:rFonts w:ascii="Aptos" w:hAnsi="Aptos"/>
-            <w:i/>
-            <w:iCs/>
             <w:color w:val="000000"/>
             <w:lang w:val="en-US"/>
           </w:rPr>
-          <w:tag w:val="MENDELEY_CITATION_v3_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"/>
-          <w:id w:val="-96491103"/>
+          <w:tag w:val="MENDELEY_CITATION_v3_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"/>
+          <w:id w:val="-1471896222"/>
           <w:placeholder>
-            <w:docPart w:val="1267E22D87D246579C51BA413E8DDCA3"/>
+            <w:docPart w:val="DefaultPlaceholder_-1854013440"/>
           </w:placeholder>
         </w:sdtPr>
         <w:sdtContent>
           <w:r>
             <w:rPr>
-              <w:rFonts w:ascii="Aptos" w:eastAsia="Times New Roman" w:hAnsi="Aptos"/>
-              <w:i/>
-              <w:color w:val="000000"/>
-              <w:lang w:val="fr-FR"/>
-            </w:rPr>
-            <w:t>West &amp; Valentini (2013)</w:t>
+              <w:rFonts w:ascii="Aptos" w:hAnsi="Aptos"/>
+              <w:color w:val="000000"/>
+              <w:lang w:val="en-US"/>
+            </w:rPr>
+            <w:t>Deterding et al. (2011)</w:t>
           </w:r>
         </w:sdtContent>
       </w:sdt>
       <w:r>
         <w:rPr>
-          <w:rFonts w:ascii="Aptos" w:hAnsi="Aptos"/>
-          <w:i/>
-          <w:iCs/>
-          <w:color w:val="000000"/>
-          <w:lang w:val="fr-FR"/>
-        </w:rPr>
-        <w:t xml:space="preserve">, </w:t>
-      </w:r>
+          <w:lang w:val="en-US"/>
+        </w:rPr>
+        <w:t>define gamification as the use of game design elements in non-game contexts</w:t>
+      </w:r>
+      <w:r>
+        <w:rPr>
+          <w:lang w:val="en-US"/>
+        </w:rPr>
+        <w:t>, where these elements make non-game products and services more enjoyable and engaging. For ReadyAlert, this may mean</w:t>
+      </w:r>
+      <w:r>
+        <w:rPr>
+          <w:lang w:val="en-US"/>
+        </w:rPr>
+        <w:t xml:space="preserve"> us</w:t>
+      </w:r>
+      <w:r>
+        <w:rPr>
+          <w:lang w:val="en-US"/>
+        </w:rPr>
+        <w:t>ing</w:t>
+      </w:r>
+      <w:r>
+        <w:rPr>
+          <w:lang w:val="en-US"/>
+        </w:rPr>
+        <w:t xml:space="preserve"> elements </w:t>
+      </w:r>
+      <w:r>
+        <w:rPr>
+          <w:lang w:val="en-US"/>
+        </w:rPr>
+        <w:t>s</w:t>
+      </w:r>
+      <w:r>
+        <w:rPr>
+          <w:lang w:val="en-US"/>
+        </w:rPr>
+        <w:t>uch as goals, badges, levels, points, or challenges</w:t>
+      </w:r>
+      <w:r>
+        <w:rPr>
+          <w:lang w:val="en-US"/>
+        </w:rPr>
+        <w:t xml:space="preserve">. </w:t>
+      </w:r>
+      <w:r>
+        <w:rPr>
+          <w:lang w:val="en-US"/>
+        </w:rPr>
+        <w:t xml:space="preserve">However, the </w:t>
+      </w:r>
+      <w:r>
+        <w:rPr>
+          <w:lang w:val="en-US"/>
+        </w:rPr>
+        <w:t xml:space="preserve">ReadyAlert </w:t>
+      </w:r>
+      <w:r>
+        <w:rPr>
+          <w:lang w:val="en-US"/>
+        </w:rPr>
+        <w:t>app</w:t>
+      </w:r>
+      <w:r>
+        <w:rPr>
+          <w:lang w:val="en-US"/>
+        </w:rPr>
+        <w:t xml:space="preserve"> should remain a disaster-preparedness tool, not become an entertainment product.</w:t>
+      </w:r>
+      <w:r>
+        <w:rPr>
+          <w:lang w:val="en-US"/>
+        </w:rPr>
+        <w:t xml:space="preserve"> </w:t>
+      </w:r>
+    </w:p>
+    <w:p>
+      <w:pPr>
+        <w:rPr>
+          <w:lang w:val="en-US"/>
+        </w:rPr>
+      </w:pPr>
       <w:sdt>
         <w:sdtPr>
           <w:rPr>
             <w:rFonts w:ascii="Aptos" w:hAnsi="Aptos"/>
-            <w:i/>
-            <w:iCs/>
             <w:color w:val="000000"/>
-            <w:lang w:val="fr-FR"/>
+            <w:lang w:val="en-US"/>
           </w:rPr>
-          <w:tag w:val="MENDELEY_CITATION_v3_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"/>
-          <w:id w:val="-2048824657"/>
+          <w:tag w:val="MENDELEY_CITATION_v3_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"/>
+          <w:id w:val="1875734403"/>
           <w:placeholder>
-            <w:docPart w:val="1267E22D87D246579C51BA413E8DDCA3"/>
+            <w:docPart w:val="DefaultPlaceholder_-1854013440"/>
           </w:placeholder>
         </w:sdtPr>
         <w:sdtContent>
           <w:r>
             <w:rPr>
               <w:rFonts w:ascii="Aptos" w:hAnsi="Aptos"/>
-              <w:i/>
-              <w:iCs/>
-              <w:color w:val="000000"/>
-              <w:lang w:val="fr-FR"/>
-            </w:rPr>
-            <w:t xml:space="preserve">Toledo et al. </w:t>
-          </w:r>
-          <w:r>
-            <w:rPr>
-              <w:rFonts w:ascii="Aptos" w:hAnsi="Aptos"/>
-              <w:i/>
-              <w:iCs/>
-              <w:color w:val="000000"/>
-              <w:lang w:val="en-US"/>
-            </w:rPr>
-            <w:t>(2017)</w:t>
+              <w:color w:val="000000"/>
+              <w:lang w:val="en-US"/>
+            </w:rPr>
+            <w:t>Deterding et al. (2011)</w:t>
           </w:r>
         </w:sdtContent>
       </w:sdt>
       <w:r>
         <w:rPr>
-          <w:rFonts w:ascii="Aptos" w:hAnsi="Aptos"/>
-          <w:i/>
-          <w:iCs/>
-          <w:color w:val="000000"/>
-          <w:lang w:val="en-US"/>
-        </w:rPr>
-        <w:t xml:space="preserve">, and </w:t>
-      </w:r>
+          <w:lang w:val="en-US"/>
+        </w:rPr>
+        <w:t xml:space="preserve"> </w:t>
+      </w:r>
+      <w:r>
+        <w:rPr>
+          <w:lang w:val="en-US"/>
+        </w:rPr>
+        <w:t>also distinguish between gamefulness and playfulness. Gamefulness is more connected to structured goals, rules, and progress, while playfulness is broader and more open-ended. This distinction matters for ReadyAlert because disaster preparedness is a serious context</w:t>
+      </w:r>
+      <w:r>
+        <w:rPr>
+          <w:lang w:val="en-US"/>
+        </w:rPr>
+        <w:t xml:space="preserve"> and </w:t>
+      </w:r>
+      <w:r>
+        <w:rPr>
+          <w:lang w:val="en-US"/>
+        </w:rPr>
+        <w:t>disasters</w:t>
+      </w:r>
+      <w:r>
+        <w:rPr>
+          <w:lang w:val="en-US"/>
+        </w:rPr>
+        <w:t xml:space="preserve"> should not</w:t>
+      </w:r>
+      <w:r>
+        <w:rPr>
+          <w:lang w:val="en-US"/>
+        </w:rPr>
+        <w:t xml:space="preserve"> feel like a joke or reduce emergency preparation to superficial entertainment. Instead, gamification should be used in a controlled way to encourage useful actions, such as completing an emergency kit checklist, learning what to do during a weather warning, or answering preparedness questions correctly. </w:t>
+      </w:r>
+    </w:p>
+    <w:p>
+      <w:pPr>
+        <w:rPr>
+          <w:lang w:val="en-US"/>
+        </w:rPr>
+      </w:pPr>
       <w:sdt>
         <w:sdtPr>
           <w:rPr>
             <w:rFonts w:ascii="Aptos" w:hAnsi="Aptos"/>
-            <w:i/>
-            <w:iCs/>
             <w:color w:val="000000"/>
             <w:lang w:val="en-US"/>
           </w:rPr>
-          <w:tag w:val="MENDELEY_CITATION_v3_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"/>
-          <w:id w:val="-919175952"/>
+          <w:tag w:val="MENDELEY_CITATION_v3_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"/>
+          <w:id w:val="-1379465178"/>
           <w:placeholder>
-            <w:docPart w:val="1267E22D87D246579C51BA413E8DDCA3"/>
+            <w:docPart w:val="DefaultPlaceholder_-1854013440"/>
           </w:placeholder>
         </w:sdtPr>
         <w:sdtContent>
           <w:r>
             <w:rPr>
               <w:rFonts w:ascii="Aptos" w:hAnsi="Aptos"/>
+              <w:color w:val="000000"/>
+              <w:lang w:val="en-US"/>
+            </w:rPr>
+            <w:t>Kankanamge et al. (2020)</w:t>
+          </w:r>
+        </w:sdtContent>
+      </w:sdt>
+      <w:r>
+        <w:rPr>
+          <w:lang w:val="en-US"/>
+        </w:rPr>
+        <w:t xml:space="preserve">provide a disaster-specific view of gamification. Their systematic review examines 51 scholarly articles and 35 disaster-related gamified applications. They classify gamified applications into three main purposes: research, education, and intervention. This classification is useful for ReadyAlert because the app mostly fits into the education category, with some </w:t>
+      </w:r>
+      <w:proofErr w:type="gramStart"/>
+      <w:r>
+        <w:rPr>
+          <w:lang w:val="en-US"/>
+        </w:rPr>
+        <w:t>possible overlap</w:t>
+      </w:r>
+      <w:proofErr w:type="gramEnd"/>
+      <w:r>
+        <w:rPr>
+          <w:lang w:val="en-US"/>
+        </w:rPr>
+        <w:t xml:space="preserve"> with intervention if it encourages users to take real preparedness actions. The review also explains that gamification can motivate community engagement through both intrinsic </w:t>
+      </w:r>
+      <w:proofErr w:type="gramStart"/>
+      <w:r>
+        <w:rPr>
+          <w:lang w:val="en-US"/>
+        </w:rPr>
+        <w:t>motivation</w:t>
+      </w:r>
+      <w:proofErr w:type="gramEnd"/>
+      <w:r>
+        <w:rPr>
+          <w:lang w:val="en-US"/>
+        </w:rPr>
+        <w:t>, such as curiosity</w:t>
+      </w:r>
+      <w:r>
+        <w:rPr>
+          <w:lang w:val="en-US"/>
+        </w:rPr>
+        <w:t>,</w:t>
+      </w:r>
+      <w:r>
+        <w:rPr>
+          <w:lang w:val="en-US"/>
+        </w:rPr>
+        <w:t xml:space="preserve"> learning</w:t>
+      </w:r>
+      <w:r>
+        <w:rPr>
+          <w:lang w:val="en-US"/>
+        </w:rPr>
+        <w:t>,</w:t>
+      </w:r>
+      <w:r>
+        <w:rPr>
+          <w:lang w:val="en-US"/>
+        </w:rPr>
+        <w:t xml:space="preserve"> and fun, and extrinsic </w:t>
+      </w:r>
+      <w:r>
+        <w:rPr>
+          <w:lang w:val="en-US"/>
+        </w:rPr>
+        <w:lastRenderedPageBreak/>
+        <w:t xml:space="preserve">motivation, such as scores, rewards, </w:t>
+      </w:r>
+      <w:r>
+        <w:rPr>
+          <w:lang w:val="en-US"/>
+        </w:rPr>
+        <w:t xml:space="preserve">badges, </w:t>
+      </w:r>
+      <w:r>
+        <w:rPr>
+          <w:lang w:val="en-US"/>
+        </w:rPr>
+        <w:t>and goals. This supports the idea that ReadyAlert should include both meaningful content and visible</w:t>
+      </w:r>
+      <w:r>
+        <w:rPr>
+          <w:lang w:val="en-US"/>
+        </w:rPr>
+        <w:t xml:space="preserve"> and purposeful</w:t>
+      </w:r>
+      <w:r>
+        <w:rPr>
+          <w:lang w:val="en-US"/>
+        </w:rPr>
+        <w:t xml:space="preserve"> progress mechanisms.</w:t>
+      </w:r>
+    </w:p>
+    <w:p>
+      <w:pPr>
+        <w:rPr>
+          <w:lang w:val="en-US"/>
+        </w:rPr>
+      </w:pPr>
+      <w:sdt>
+        <w:sdtPr>
+          <w:rPr>
+            <w:rFonts w:ascii="Aptos" w:hAnsi="Aptos"/>
+            <w:color w:val="000000"/>
+            <w:lang w:val="en-US"/>
+          </w:rPr>
+          <w:tag w:val="MENDELEY_CITATION_v3_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"/>
+          <w:id w:val="1439488779"/>
+          <w:placeholder>
+            <w:docPart w:val="DefaultPlaceholder_-1854013440"/>
+          </w:placeholder>
+        </w:sdtPr>
+        <w:sdtContent>
+          <w:r>
+            <w:rPr>
+              <w:rFonts w:ascii="Aptos" w:hAnsi="Aptos"/>
+              <w:color w:val="000000"/>
+              <w:lang w:val="en-US"/>
+            </w:rPr>
+            <w:t>Bai et al. (2024)</w:t>
+          </w:r>
+        </w:sdtContent>
+      </w:sdt>
+      <w:r>
+        <w:rPr>
+          <w:lang w:val="en-US"/>
+        </w:rPr>
+        <w:t xml:space="preserve"> provide more recent evidence through a scoping review of gamification teaching in disaster education. Their review included 16 studies from eight countries, with 1744 participants. The reviewed studies covered </w:t>
+      </w:r>
+      <w:proofErr w:type="gramStart"/>
+      <w:r>
+        <w:rPr>
+          <w:lang w:val="en-US"/>
+        </w:rPr>
+        <w:t>different types</w:t>
+      </w:r>
+      <w:proofErr w:type="gramEnd"/>
+      <w:r>
+        <w:rPr>
+          <w:lang w:val="en-US"/>
+        </w:rPr>
+        <w:t xml:space="preserve"> of gamified disaster education</w:t>
+      </w:r>
+      <w:r>
+        <w:rPr>
+          <w:lang w:val="en-US"/>
+        </w:rPr>
+        <w:t xml:space="preserve">, such as </w:t>
+      </w:r>
+      <w:r>
+        <w:rPr>
+          <w:lang w:val="en-US"/>
+        </w:rPr>
+        <w:t>tabletop games, virtual reality mobile game-based apps, and escape room games. This is useful for ReadyAlert because it shows that gamification has already been applied to disaster education in several formats, not only in traditional video games.</w:t>
+      </w:r>
+      <w:r>
+        <w:rPr>
+          <w:lang w:val="en-US"/>
+        </w:rPr>
+        <w:t xml:space="preserve"> </w:t>
+      </w:r>
+      <w:r>
+        <w:rPr>
+          <w:lang w:val="en-US"/>
+        </w:rPr>
+        <w:t>Gamified</w:t>
+      </w:r>
+      <w:r>
+        <w:rPr>
+          <w:lang w:val="en-US"/>
+        </w:rPr>
+        <w:t xml:space="preserve"> disaster education can improve knowledge retention, cooperation, realism, disaster awareness, decision-making ability, practical skills, and coping ability</w:t>
+      </w:r>
+      <w:r>
+        <w:rPr>
+          <w:lang w:val="en-US"/>
+        </w:rPr>
+        <w:t xml:space="preserve"> </w:t>
+      </w:r>
+      <w:sdt>
+        <w:sdtPr>
+          <w:rPr>
+            <w:rFonts w:ascii="Aptos" w:hAnsi="Aptos"/>
+            <w:color w:val="000000"/>
+            <w:lang w:val="en-US"/>
+          </w:rPr>
+          <w:tag w:val="MENDELEY_CITATION_v3_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"/>
+          <w:id w:val="-394355645"/>
+          <w:placeholder>
+            <w:docPart w:val="DefaultPlaceholder_-1854013440"/>
+          </w:placeholder>
+        </w:sdtPr>
+        <w:sdtContent>
+          <w:r>
+            <w:rPr>
+              <w:rFonts w:ascii="Aptos" w:hAnsi="Aptos"/>
+              <w:color w:val="000000"/>
+              <w:lang w:val="en-US"/>
+            </w:rPr>
+            <w:t>(Bai et al., 2024)</w:t>
+          </w:r>
+        </w:sdtContent>
+      </w:sdt>
+      <w:r>
+        <w:rPr>
+          <w:lang w:val="en-US"/>
+        </w:rPr>
+        <w:t xml:space="preserve">. </w:t>
+      </w:r>
+    </w:p>
+    <w:p>
+      <w:pPr>
+        <w:rPr>
+          <w:lang w:val="en-US"/>
+        </w:rPr>
+      </w:pPr>
+      <w:sdt>
+        <w:sdtPr>
+          <w:rPr>
+            <w:rFonts w:ascii="Aptos" w:hAnsi="Aptos"/>
+            <w:color w:val="000000"/>
+            <w:lang w:val="en-US"/>
+          </w:rPr>
+          <w:tag w:val="MENDELEY_CITATION_v3_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"/>
+          <w:id w:val="-1810231050"/>
+          <w:placeholder>
+            <w:docPart w:val="DefaultPlaceholder_-1854013440"/>
+          </w:placeholder>
+        </w:sdtPr>
+        <w:sdtContent>
+          <w:r>
+            <w:rPr>
+              <w:rFonts w:ascii="Aptos" w:hAnsi="Aptos"/>
+              <w:color w:val="000000"/>
+              <w:lang w:val="en-US"/>
+            </w:rPr>
+            <w:t>Matsuno et al. (2021)</w:t>
+          </w:r>
+        </w:sdtContent>
+      </w:sdt>
+      <w:r>
+        <w:rPr>
+          <w:lang w:val="en-US"/>
+        </w:rPr>
+        <w:t xml:space="preserve"> provide a concrete example of a gamified disaster-prevention smartphone application. Their project focuses on flood disaster evacuation and uses gamification to encourage users to learn about hazard maps, flooded areas, and evacuation points. The app includes a game mode based on Google Street View, Mapbox, and hazard map data. Users try to visit evacuation points while avoiding flooded areas, and their performance is measured using elements such as score and ranking. This is directly relevant to ReadyAlert because it demonstrates how real disaster-prevention information can be transformed into an interactive mobile learning experience.</w:t>
+      </w:r>
+    </w:p>
+    <w:p>
+      <w:pPr>
+        <w:pStyle w:val="Heading2"/>
+      </w:pPr>
+      <w:r>
+        <w:t>Comparison and identified gap</w:t>
+      </w:r>
+    </w:p>
+    <w:p>
+      <w:pPr>
+        <w:rPr>
+          <w:lang w:val="en-AT"/>
+        </w:rPr>
+      </w:pPr>
+      <w:r>
+        <w:rPr>
+          <w:lang w:val="en-AT"/>
+        </w:rPr>
+        <w:t xml:space="preserve">The reviewed sources show that there is already significant work in mobile disaster preparedness, official warning systems, environmental monitoring, and gamified disaster education. </w:t>
+      </w:r>
+      <w:r>
+        <w:rPr>
+          <w:lang w:val="en-AT"/>
+        </w:rPr>
+        <w:t xml:space="preserve">The analysis from </w:t>
+      </w:r>
+      <w:sdt>
+        <w:sdtPr>
+          <w:rPr>
+            <w:rFonts w:ascii="Aptos" w:hAnsi="Aptos"/>
+            <w:color w:val="000000"/>
+            <w:lang w:val="en-AT"/>
+          </w:rPr>
+          <w:tag w:val="MENDELEY_CITATION_v3_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"/>
+          <w:id w:val="171854129"/>
+          <w:placeholder>
+            <w:docPart w:val="DefaultPlaceholder_-1854013440"/>
+          </w:placeholder>
+        </w:sdtPr>
+        <w:sdtContent>
+          <w:r>
+            <w:rPr>
+              <w:rFonts w:ascii="Aptos" w:hAnsi="Aptos"/>
+              <w:color w:val="000000"/>
+              <w:lang w:val="en-AT"/>
+            </w:rPr>
+            <w:t>Kankanamge et al. (2020)</w:t>
+          </w:r>
+        </w:sdtContent>
+      </w:sdt>
+      <w:r>
+        <w:rPr>
+          <w:lang w:val="en-AT"/>
+        </w:rPr>
+        <w:t xml:space="preserve"> provides a useful framework to classify apps, however the ones they analyzed are all webapps (and some of them no longer exist), which makes ReadyAlert ready to fill this gap. </w:t>
+      </w:r>
+      <w:r>
+        <w:rPr>
+          <w:lang w:val="en-AT"/>
+        </w:rPr>
+        <w:t>Academic studies support the general use of mobile applications for disaster awareness and response (</w:t>
+      </w:r>
+      <w:sdt>
+        <w:sdtPr>
+          <w:rPr>
+            <w:rFonts w:ascii="Aptos" w:hAnsi="Aptos"/>
+            <w:color w:val="000000"/>
+            <w:lang w:val="en-AT"/>
+          </w:rPr>
+          <w:tag w:val="MENDELEY_CITATION_v3_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"/>
+          <w:id w:val="1940793265"/>
+          <w:placeholder>
+            <w:docPart w:val="DefaultPlaceholder_-1854013440"/>
+          </w:placeholder>
+        </w:sdtPr>
+        <w:sdtContent>
+          <w:r>
+            <w:rPr>
+              <w:rFonts w:ascii="Aptos" w:eastAsia="Times New Roman" w:hAnsi="Aptos"/>
+              <w:color w:val="000000"/>
+              <w:lang w:val="en-US"/>
+            </w:rPr>
+            <w:t>Nagaraju et al., 2024; Toledo et al., 2017; West &amp; Valentini, 2013</w:t>
+          </w:r>
+        </w:sdtContent>
+      </w:sdt>
+      <w:r>
+        <w:rPr>
+          <w:lang w:val="en-AT"/>
+        </w:rPr>
+        <w:t xml:space="preserve">). Existing applications show that users can already access specific types of disaster-related information, such as first aid, weather warnings, flood alerts, or general disaster notifications </w:t>
+      </w:r>
+      <w:sdt>
+        <w:sdtPr>
+          <w:rPr>
+            <w:rFonts w:ascii="Aptos" w:hAnsi="Aptos"/>
+            <w:color w:val="000000"/>
+            <w:lang w:val="en-AT"/>
+          </w:rPr>
+          <w:tag w:val="MENDELEY_CITATION_v3_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"/>
+          <w:id w:val="-1695231842"/>
+          <w:placeholder>
+            <w:docPart w:val="DefaultPlaceholder_-1854013440"/>
+          </w:placeholder>
+        </w:sdtPr>
+        <w:sdtContent>
+          <w:r>
+            <w:rPr>
+              <w:rFonts w:ascii="Aptos" w:hAnsi="Aptos"/>
+              <w:color w:val="000000"/>
+              <w:lang w:val="en-AT"/>
+            </w:rPr>
+            <w:t>(CombiRisk Risk-Management GmbH, 2025; Österr. Rotes Kreuz, 2024; SOBOS GmbH, 2026; Ubimet Int. AG, 2025)</w:t>
+          </w:r>
+        </w:sdtContent>
+      </w:sdt>
+      <w:r>
+        <w:rPr>
+          <w:lang w:val="en-AT"/>
+        </w:rPr>
+        <w:t xml:space="preserve">. Official Austrian sources provide credible data for alerts, weather warnings, radiation monitoring, and environmental information </w:t>
+      </w:r>
+      <w:sdt>
+        <w:sdtPr>
+          <w:rPr>
+            <w:rFonts w:ascii="Aptos" w:hAnsi="Aptos"/>
+            <w:color w:val="000000"/>
+            <w:lang w:val="en-AT"/>
+          </w:rPr>
+          <w:tag w:val="MENDELEY_CITATION_v3_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"/>
+          <w:id w:val="-88775321"/>
+          <w:placeholder>
+            <w:docPart w:val="DefaultPlaceholder_-1854013440"/>
+          </w:placeholder>
+        </w:sdtPr>
+        <w:sdtContent>
+          <w:r>
+            <w:rPr>
+              <w:rFonts w:ascii="Aptos" w:hAnsi="Aptos"/>
+              <w:color w:val="000000"/>
+              <w:lang w:val="en-AT"/>
+            </w:rPr>
+            <w:t>(Austrian Federal Ministry of Agriculture Forestry Climate and Environmental Protection Regions and Water Management, n.d.; GeoSphere Austria, n.d.; Rundfunk und Telekom Regulierungs GmbH, n.d.; Zippenfenig, 2023)</w:t>
+          </w:r>
+        </w:sdtContent>
+      </w:sdt>
+      <w:r>
+        <w:rPr>
+          <w:lang w:val="en-AT"/>
+        </w:rPr>
+        <w:t xml:space="preserve">. Finally, gamification research suggests that interactive features can improve engagement and learning in disaster-preparedness contexts when they are meaningfully designed </w:t>
+      </w:r>
+      <w:sdt>
+        <w:sdtPr>
+          <w:rPr>
+            <w:rFonts w:ascii="Aptos" w:hAnsi="Aptos"/>
+            <w:color w:val="000000"/>
+            <w:lang w:val="en-AT"/>
+          </w:rPr>
+          <w:tag w:val="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"/>
+          <w:id w:val="742060785"/>
+          <w:placeholder>
+            <w:docPart w:val="DefaultPlaceholder_-1854013440"/>
+          </w:placeholder>
+        </w:sdtPr>
+        <w:sdtContent>
+          <w:r>
+            <w:rPr>
+              <w:rFonts w:ascii="Aptos" w:hAnsi="Aptos"/>
+              <w:color w:val="000000"/>
+              <w:lang w:val="en-AT"/>
+            </w:rPr>
+            <w:t>(Bai et al., 2024; Deterding et al., 2011; Kankanamge et al., 2020; Matsuno et al., 2021)</w:t>
+          </w:r>
+        </w:sdtContent>
+      </w:sdt>
+      <w:r>
+        <w:rPr>
+          <w:lang w:val="en-AT"/>
+        </w:rPr>
+        <w:t>.</w:t>
+      </w:r>
+    </w:p>
+    <w:p>
+      <w:pPr>
+        <w:rPr>
+          <w:lang w:val="en-AT"/>
+        </w:rPr>
+      </w:pPr>
+      <w:r>
+        <w:rPr>
+          <w:lang w:val="en-AT"/>
+        </w:rPr>
+        <w:t>The main gap is that these areas are often treated separately. Existing apps may provide alerts, first-aid guidance, weather warnings, flood information, or environmental data, but they rarely combine these categories into a single local preparedness tool. Similarly, gamification research supports engagement and learning, but many real-world warning or environmental apps do not integrate gamified preparedness features. ReadyAlert is designed to explore this gap by combining Austria-focused disaster awareness, environmental information, preparedness resources, and gamified learning in one Android prototype.</w:t>
+      </w:r>
+    </w:p>
+    <w:p>
+      <w:pPr>
+        <w:rPr>
+          <w:lang w:val="en-AT"/>
+        </w:rPr>
+      </w:pPr>
+    </w:p>
+    <w:p>
+      <w:pPr>
+        <w:pStyle w:val="Heading1"/>
+      </w:pPr>
+      <w:r>
+        <w:lastRenderedPageBreak/>
+        <w:t>References</w:t>
+      </w:r>
+    </w:p>
+    <w:sdt>
+      <w:sdtPr>
+        <w:rPr>
+          <w:rFonts w:ascii="Aptos" w:hAnsi="Aptos"/>
+          <w:color w:val="000000"/>
+          <w:lang w:val="en-AT"/>
+        </w:rPr>
+        <w:tag w:val="MENDELEY_BIBLIOGRAPHY"/>
+        <w:id w:val="367885095"/>
+        <w:placeholder>
+          <w:docPart w:val="DefaultPlaceholder_-1854013440"/>
+        </w:placeholder>
+      </w:sdtPr>
+      <w:sdtContent>
+        <w:p>
+          <w:pPr>
+            <w:autoSpaceDE w:val="0"/>
+            <w:autoSpaceDN w:val="0"/>
+            <w:ind w:hanging="480"/>
+            <w:divId w:val="218903739"/>
+            <w:rPr>
+              <w:rFonts w:ascii="Aptos" w:eastAsia="Times New Roman" w:hAnsi="Aptos"/>
+              <w:color w:val="000000"/>
+              <w:kern w:val="0"/>
+              <w:szCs w:val="24"/>
+              <w:lang w:val="en-US"/>
+              <w14:ligatures w14:val="none"/>
+            </w:rPr>
+          </w:pPr>
+          <w:r>
+            <w:rPr>
+              <w:rFonts w:ascii="Aptos" w:eastAsia="Times New Roman" w:hAnsi="Aptos"/>
+              <w:color w:val="000000"/>
+              <w:lang w:val="en-US"/>
+            </w:rPr>
+            <w:t xml:space="preserve">Austrian Federal Ministry of Agriculture Forestry Climate and Environmental Protection Regions and Water Management. (n.d.). </w:t>
+          </w:r>
+          <w:r>
+            <w:rPr>
+              <w:rFonts w:ascii="Aptos" w:eastAsia="Times New Roman" w:hAnsi="Aptos"/>
               <w:i/>
               <w:iCs/>
               <w:color w:val="000000"/>
               <w:lang w:val="en-US"/>
             </w:rPr>
-            <w:t>Nagaraju et al. (2024)</w:t>
-          </w:r>
-        </w:sdtContent>
-      </w:sdt>
-      <w:r>
-        <w:rPr>
-          <w:rFonts w:ascii="Aptos" w:hAnsi="Aptos"/>
-          <w:i/>
-          <w:iCs/>
-          <w:color w:val="000000"/>
-          <w:lang w:val="en-US"/>
-        </w:rPr>
-        <w:t xml:space="preserve"> all support the same argument that mobile applications can support disaster preparedness, communication, and response, but from different angles. West and Valentini discuss mobile technology broadly as part of public safety and emergency communication. Toledo et al. focus on a local community crowdsourcing system where residents and local officials interact through a mobile application and web dashboard. Nagaraju et al. focus on a more general disaster safety app that is also based on crowdsourcing but with sensor values, reporting, and contacts. However, t</w:t>
-      </w:r>
-      <w:r>
-        <w:rPr>
-          <w:i/>
-          <w:iCs/>
-          <w:lang w:val="en-AT"/>
-        </w:rPr>
-        <w:t xml:space="preserve">he reviewed academic work also shows a recurring limitation. These academic projects focus on general disaster response concepts, using the idea of crowdsourcing to report incidents. </w:t>
-      </w:r>
-      <w:r>
-        <w:rPr>
-          <w:rFonts w:ascii="Aptos" w:hAnsi="Aptos"/>
-          <w:i/>
-          <w:iCs/>
-          <w:color w:val="000000"/>
-          <w:lang w:val="en-US"/>
-        </w:rPr>
-        <w:t xml:space="preserve">The gap for </w:t>
-      </w:r>
-      <w:proofErr w:type="spellStart"/>
-      <w:r>
-        <w:rPr>
-          <w:rFonts w:ascii="Aptos" w:hAnsi="Aptos"/>
-          <w:i/>
-          <w:iCs/>
-          <w:color w:val="000000"/>
-          <w:lang w:val="en-US"/>
-        </w:rPr>
-        <w:t>ReadyAlert</w:t>
-      </w:r>
-      <w:proofErr w:type="spellEnd"/>
-      <w:r>
-        <w:rPr>
-          <w:rFonts w:ascii="Aptos" w:hAnsi="Aptos"/>
-          <w:i/>
-          <w:iCs/>
-          <w:color w:val="000000"/>
-          <w:lang w:val="en-US"/>
-        </w:rPr>
-        <w:t xml:space="preserve"> is that these systems do not focus on and are not applicable to Austria, and they do not specifically address the integration of several existing official environmental and warning data sources into one Austria-specific Android application. </w:t>
-      </w:r>
-    </w:p>
-    <w:p>
-      <w:pPr>
-        <w:rPr>
-          <w:lang w:val="en-AT"/>
-        </w:rPr>
-      </w:pPr>
-    </w:p>
-    <w:p>
-      <w:pPr>
-        <w:rPr>
-          <w:lang w:val="en-AT"/>
-        </w:rPr>
-      </w:pPr>
-      <w:r>
-        <w:rPr>
-          <w:lang w:val="en-AT"/>
-        </w:rPr>
-        <w:t xml:space="preserve">The main gap is that these areas are often treated separately. Existing apps may provide alerts, first-aid guidance, weather warnings, flood information, or environmental data, but they rarely combine these categories into a single local preparedness tool. Similarly, gamification research supports engagement and learning, but many real-world warning or environmental apps do not strongly integrate gamified preparedness features. </w:t>
-      </w:r>
-      <w:proofErr w:type="spellStart"/>
-      <w:r>
-        <w:rPr>
-          <w:lang w:val="en-AT"/>
-        </w:rPr>
-        <w:t>ReadyAlert</w:t>
-      </w:r>
-      <w:proofErr w:type="spellEnd"/>
-      <w:r>
-        <w:rPr>
-          <w:lang w:val="en-AT"/>
-        </w:rPr>
-        <w:t xml:space="preserve"> is designed to explore this gap by combining Austria-focused disaster awareness, environmental information, preparedness resources, and gamified learning in one Android prototype.</w:t>
-      </w:r>
-    </w:p>
-    <w:p>
-      <w:pPr>
-        <w:rPr>
-          <w:lang w:val="en-AT"/>
-        </w:rPr>
-      </w:pPr>
-      <w:r>
-        <w:rPr>
-          <w:lang w:val="en-AT"/>
-        </w:rPr>
-        <w:t xml:space="preserve">This literature review therefore informs the project in three main ways. First, it confirms that mobile applications are a suitable platform for disaster preparedness and awareness. Second, it shows that Austria has several credible data sources and specialized applications, but that these are fragmented. Third, it supports the use of gamification as a method for improving engagement with preparedness content. Based on these findings, </w:t>
-      </w:r>
-      <w:proofErr w:type="spellStart"/>
-      <w:r>
-        <w:rPr>
-          <w:lang w:val="en-AT"/>
-        </w:rPr>
-        <w:t>ReadyAlert</w:t>
-      </w:r>
-      <w:proofErr w:type="spellEnd"/>
-      <w:r>
-        <w:rPr>
-          <w:lang w:val="en-AT"/>
-        </w:rPr>
-        <w:t xml:space="preserve"> is positioned as a local, integration-focused prototype that aims to make disaster-preparedness information more accessible, understandable, and engaging for users in Austria.</w:t>
-      </w:r>
-    </w:p>
+            <w:t xml:space="preserve">Current measurements from the </w:t>
+          </w:r>
+          <w:proofErr w:type="gramStart"/>
+          <w:r>
+            <w:rPr>
+              <w:rFonts w:ascii="Aptos" w:eastAsia="Times New Roman" w:hAnsi="Aptos"/>
+              <w:i/>
+              <w:iCs/>
+              <w:color w:val="000000"/>
+              <w:lang w:val="en-US"/>
+            </w:rPr>
+            <w:t>radiation early warning</w:t>
+          </w:r>
+          <w:proofErr w:type="gramEnd"/>
+          <w:r>
+            <w:rPr>
+              <w:rFonts w:ascii="Aptos" w:eastAsia="Times New Roman" w:hAnsi="Aptos"/>
+              <w:i/>
+              <w:iCs/>
+              <w:color w:val="000000"/>
+              <w:lang w:val="en-US"/>
+            </w:rPr>
+            <w:t xml:space="preserve"> system</w:t>
+          </w:r>
+          <w:r>
+            <w:rPr>
+              <w:rFonts w:ascii="Aptos" w:eastAsia="Times New Roman" w:hAnsi="Aptos"/>
+              <w:color w:val="000000"/>
+              <w:lang w:val="en-US"/>
+            </w:rPr>
+            <w:t>. Radiation Early Warning System and Monitoring. Retrieved May 11, 2026, from https://www.bmluk.gv.at/themen/klima-und-umwelt/strahlenschutz/fruehwarnsystem/messwerte.html</w:t>
+          </w:r>
+        </w:p>
+        <w:p>
+          <w:pPr>
+            <w:autoSpaceDE w:val="0"/>
+            <w:autoSpaceDN w:val="0"/>
+            <w:ind w:hanging="480"/>
+            <w:divId w:val="366565471"/>
+            <w:rPr>
+              <w:rFonts w:ascii="Aptos" w:eastAsia="Times New Roman" w:hAnsi="Aptos"/>
+              <w:color w:val="000000"/>
+              <w:lang w:val="en-US"/>
+            </w:rPr>
+          </w:pPr>
+          <w:r>
+            <w:rPr>
+              <w:rFonts w:ascii="Aptos" w:eastAsia="Times New Roman" w:hAnsi="Aptos"/>
+              <w:color w:val="000000"/>
+              <w:lang w:val="en-US"/>
+            </w:rPr>
+            <w:t xml:space="preserve">Bai, S., Zeng, H., Zhong, Q., Shen, Y., Cao, L., &amp; He, M. (2024). Application of Gamification Teaching in Disaster Education: Scoping Review. </w:t>
+          </w:r>
+          <w:r>
+            <w:rPr>
+              <w:rFonts w:ascii="Aptos" w:eastAsia="Times New Roman" w:hAnsi="Aptos"/>
+              <w:i/>
+              <w:iCs/>
+              <w:color w:val="000000"/>
+              <w:lang w:val="en-US"/>
+            </w:rPr>
+            <w:t>JMIR Serious Games</w:t>
+          </w:r>
+          <w:r>
+            <w:rPr>
+              <w:rFonts w:ascii="Aptos" w:eastAsia="Times New Roman" w:hAnsi="Aptos"/>
+              <w:color w:val="000000"/>
+              <w:lang w:val="en-US"/>
+            </w:rPr>
+            <w:t xml:space="preserve">, </w:t>
+          </w:r>
+          <w:r>
+            <w:rPr>
+              <w:rFonts w:ascii="Aptos" w:eastAsia="Times New Roman" w:hAnsi="Aptos"/>
+              <w:i/>
+              <w:iCs/>
+              <w:color w:val="000000"/>
+              <w:lang w:val="en-US"/>
+            </w:rPr>
+            <w:t>12</w:t>
+          </w:r>
+          <w:r>
+            <w:rPr>
+              <w:rFonts w:ascii="Aptos" w:eastAsia="Times New Roman" w:hAnsi="Aptos"/>
+              <w:color w:val="000000"/>
+              <w:lang w:val="en-US"/>
+            </w:rPr>
+            <w:t>, 1–11. https://doi.org/10.2196/64939</w:t>
+          </w:r>
+        </w:p>
+        <w:p>
+          <w:pPr>
+            <w:autoSpaceDE w:val="0"/>
+            <w:autoSpaceDN w:val="0"/>
+            <w:ind w:hanging="480"/>
+            <w:divId w:val="1194420035"/>
+            <w:rPr>
+              <w:rFonts w:ascii="Aptos" w:eastAsia="Times New Roman" w:hAnsi="Aptos"/>
+              <w:color w:val="000000"/>
+              <w:lang w:val="en-US"/>
+            </w:rPr>
+          </w:pPr>
+          <w:r>
+            <w:rPr>
+              <w:rFonts w:ascii="Aptos" w:eastAsia="Times New Roman" w:hAnsi="Aptos"/>
+              <w:color w:val="000000"/>
+              <w:lang w:val="en-US"/>
+            </w:rPr>
+            <w:t xml:space="preserve">CombiRisk Risk-Management GmbH. (2025). </w:t>
+          </w:r>
+          <w:r>
+            <w:rPr>
+              <w:rFonts w:ascii="Aptos" w:eastAsia="Times New Roman" w:hAnsi="Aptos"/>
+              <w:i/>
+              <w:iCs/>
+              <w:color w:val="000000"/>
+              <w:lang w:val="en-US"/>
+            </w:rPr>
+            <w:t>KATWARN</w:t>
+          </w:r>
+          <w:r>
+            <w:rPr>
+              <w:rFonts w:ascii="Aptos" w:eastAsia="Times New Roman" w:hAnsi="Aptos"/>
+              <w:color w:val="000000"/>
+              <w:lang w:val="en-US"/>
+            </w:rPr>
+            <w:t>. https://play.google.com/store/apps/details?id=de.combirisk.katwarn&amp;hl=en</w:t>
+          </w:r>
+        </w:p>
+        <w:p>
+          <w:pPr>
+            <w:autoSpaceDE w:val="0"/>
+            <w:autoSpaceDN w:val="0"/>
+            <w:ind w:hanging="480"/>
+            <w:divId w:val="2973216"/>
+            <w:rPr>
+              <w:rFonts w:ascii="Aptos" w:eastAsia="Times New Roman" w:hAnsi="Aptos"/>
+              <w:color w:val="000000"/>
+              <w:lang w:val="en-US"/>
+            </w:rPr>
+          </w:pPr>
+          <w:r>
+            <w:rPr>
+              <w:rFonts w:ascii="Aptos" w:eastAsia="Times New Roman" w:hAnsi="Aptos"/>
+              <w:color w:val="000000"/>
+              <w:lang w:val="en-US"/>
+            </w:rPr>
+            <w:t>Deterding, S., Dixon, D., Khaled, R., &amp; Nacke, L. (2011). From Game Design Elements to Gamefulness: Defining “Gamification</w:t>
+          </w:r>
+          <w:proofErr w:type="gramStart"/>
+          <w:r>
+            <w:rPr>
+              <w:rFonts w:ascii="Aptos" w:eastAsia="Times New Roman" w:hAnsi="Aptos"/>
+              <w:color w:val="000000"/>
+              <w:lang w:val="en-US"/>
+            </w:rPr>
+            <w:t>.”</w:t>
+          </w:r>
+          <w:proofErr w:type="gramEnd"/>
+          <w:r>
+            <w:rPr>
+              <w:rFonts w:ascii="Aptos" w:eastAsia="Times New Roman" w:hAnsi="Aptos"/>
+              <w:color w:val="000000"/>
+              <w:lang w:val="en-US"/>
+            </w:rPr>
+            <w:t xml:space="preserve"> </w:t>
+          </w:r>
+          <w:r>
+            <w:rPr>
+              <w:rFonts w:ascii="Aptos" w:eastAsia="Times New Roman" w:hAnsi="Aptos"/>
+              <w:i/>
+              <w:iCs/>
+              <w:color w:val="000000"/>
+              <w:lang w:val="en-US"/>
+            </w:rPr>
+            <w:t>Proceedings of the 15th International Academic MindTrek Conference: Envisioning Future Media Environments</w:t>
+          </w:r>
+          <w:r>
+            <w:rPr>
+              <w:rFonts w:ascii="Aptos" w:eastAsia="Times New Roman" w:hAnsi="Aptos"/>
+              <w:color w:val="000000"/>
+              <w:lang w:val="en-US"/>
+            </w:rPr>
+            <w:t>, 9–15.</w:t>
+          </w:r>
+        </w:p>
+        <w:p>
+          <w:pPr>
+            <w:autoSpaceDE w:val="0"/>
+            <w:autoSpaceDN w:val="0"/>
+            <w:ind w:hanging="480"/>
+            <w:divId w:val="1637487297"/>
+            <w:rPr>
+              <w:rFonts w:ascii="Aptos" w:eastAsia="Times New Roman" w:hAnsi="Aptos"/>
+              <w:color w:val="000000"/>
+              <w:lang w:val="en-US"/>
+            </w:rPr>
+          </w:pPr>
+          <w:r>
+            <w:rPr>
+              <w:rFonts w:ascii="Aptos" w:eastAsia="Times New Roman" w:hAnsi="Aptos"/>
+              <w:color w:val="000000"/>
+              <w:lang w:val="en-US"/>
+            </w:rPr>
+            <w:t xml:space="preserve">dominoc925. (2026). </w:t>
+          </w:r>
+          <w:r>
+            <w:rPr>
+              <w:rFonts w:ascii="Aptos" w:eastAsia="Times New Roman" w:hAnsi="Aptos"/>
+              <w:i/>
+              <w:iCs/>
+              <w:color w:val="000000"/>
+              <w:lang w:val="en-US"/>
+            </w:rPr>
+            <w:t>Disastermon Natural Disaster Monitor</w:t>
+          </w:r>
+          <w:r>
+            <w:rPr>
+              <w:rFonts w:ascii="Aptos" w:eastAsia="Times New Roman" w:hAnsi="Aptos"/>
+              <w:color w:val="000000"/>
+              <w:lang w:val="en-US"/>
+            </w:rPr>
+            <w:t>. https://play.google.com/store/apps/details?id=com.dom925.disastermon&amp;hl=en</w:t>
+          </w:r>
+        </w:p>
+        <w:p>
+          <w:pPr>
+            <w:autoSpaceDE w:val="0"/>
+            <w:autoSpaceDN w:val="0"/>
+            <w:ind w:hanging="480"/>
+            <w:divId w:val="296492134"/>
+            <w:rPr>
+              <w:rFonts w:ascii="Aptos" w:eastAsia="Times New Roman" w:hAnsi="Aptos"/>
+              <w:color w:val="000000"/>
+              <w:lang w:val="en-US"/>
+            </w:rPr>
+          </w:pPr>
+          <w:r>
+            <w:rPr>
+              <w:rFonts w:ascii="Aptos" w:eastAsia="Times New Roman" w:hAnsi="Aptos"/>
+              <w:color w:val="000000"/>
+              <w:lang w:val="en-US"/>
+            </w:rPr>
+            <w:t xml:space="preserve">Gehirn Inc. (2026). </w:t>
+          </w:r>
+          <w:r>
+            <w:rPr>
+              <w:rFonts w:ascii="Aptos" w:eastAsia="Times New Roman" w:hAnsi="Aptos"/>
+              <w:i/>
+              <w:iCs/>
+              <w:color w:val="000000"/>
+              <w:lang w:val="en-US"/>
+            </w:rPr>
+            <w:t>NERV Disaster Prevention</w:t>
+          </w:r>
+          <w:r>
+            <w:rPr>
+              <w:rFonts w:ascii="Aptos" w:eastAsia="Times New Roman" w:hAnsi="Aptos"/>
+              <w:color w:val="000000"/>
+              <w:lang w:val="en-US"/>
+            </w:rPr>
+            <w:t>. https://play.google.com/store/apps/details?id=app.nerv&amp;hl=en</w:t>
+          </w:r>
+        </w:p>
+        <w:p>
+          <w:pPr>
+            <w:autoSpaceDE w:val="0"/>
+            <w:autoSpaceDN w:val="0"/>
+            <w:ind w:hanging="480"/>
+            <w:divId w:val="34930959"/>
+            <w:rPr>
+              <w:rFonts w:ascii="Aptos" w:eastAsia="Times New Roman" w:hAnsi="Aptos"/>
+              <w:color w:val="000000"/>
+              <w:lang w:val="en-US"/>
+            </w:rPr>
+          </w:pPr>
+          <w:r>
+            <w:rPr>
+              <w:rFonts w:ascii="Aptos" w:eastAsia="Times New Roman" w:hAnsi="Aptos"/>
+              <w:color w:val="000000"/>
+              <w:lang w:val="en-US"/>
+            </w:rPr>
+            <w:t xml:space="preserve">GeoSphere Austria. (n.d.). </w:t>
+          </w:r>
+          <w:r>
+            <w:rPr>
+              <w:rFonts w:ascii="Aptos" w:eastAsia="Times New Roman" w:hAnsi="Aptos"/>
+              <w:i/>
+              <w:iCs/>
+              <w:color w:val="000000"/>
+              <w:lang w:val="en-US"/>
+            </w:rPr>
+            <w:t>Warn API v1: OpenAPI Documentation</w:t>
+          </w:r>
+          <w:r>
+            <w:rPr>
+              <w:rFonts w:ascii="Aptos" w:eastAsia="Times New Roman" w:hAnsi="Aptos"/>
+              <w:color w:val="000000"/>
+              <w:lang w:val="en-US"/>
+            </w:rPr>
+            <w:t>. GeoSphere Austria Swagger UI. Retrieved May 11, 2026, from https://openapi.hub.geosphere.at/warnapi/v1/</w:t>
+          </w:r>
+        </w:p>
+        <w:p>
+          <w:pPr>
+            <w:autoSpaceDE w:val="0"/>
+            <w:autoSpaceDN w:val="0"/>
+            <w:ind w:hanging="480"/>
+            <w:divId w:val="590234894"/>
+            <w:rPr>
+              <w:rFonts w:ascii="Aptos" w:eastAsia="Times New Roman" w:hAnsi="Aptos"/>
+              <w:color w:val="000000"/>
+              <w:lang w:val="en-US"/>
+            </w:rPr>
+          </w:pPr>
+          <w:r>
+            <w:rPr>
+              <w:rFonts w:ascii="Aptos" w:eastAsia="Times New Roman" w:hAnsi="Aptos"/>
+              <w:color w:val="000000"/>
+              <w:lang w:val="en-US"/>
+            </w:rPr>
+            <w:t xml:space="preserve">Kankanamge, N., Yigitcanlar, T., Goonetilleke, A., &amp; Kamruzzaman, M. (2020). How can gamification be incorporated into disaster emergency planning? A systematic review of </w:t>
+          </w:r>
+          <w:proofErr w:type="gramStart"/>
+          <w:r>
+            <w:rPr>
+              <w:rFonts w:ascii="Aptos" w:eastAsia="Times New Roman" w:hAnsi="Aptos"/>
+              <w:color w:val="000000"/>
+              <w:lang w:val="en-US"/>
+            </w:rPr>
+            <w:t>the literature</w:t>
+          </w:r>
+          <w:proofErr w:type="gramEnd"/>
+          <w:r>
+            <w:rPr>
+              <w:rFonts w:ascii="Aptos" w:eastAsia="Times New Roman" w:hAnsi="Aptos"/>
+              <w:color w:val="000000"/>
+              <w:lang w:val="en-US"/>
+            </w:rPr>
+            <w:t xml:space="preserve">. </w:t>
+          </w:r>
+          <w:r>
+            <w:rPr>
+              <w:rFonts w:ascii="Aptos" w:eastAsia="Times New Roman" w:hAnsi="Aptos"/>
+              <w:i/>
+              <w:iCs/>
+              <w:color w:val="000000"/>
+              <w:lang w:val="en-US"/>
+            </w:rPr>
+            <w:t>International Journal of Disaster Resilience in the Built Environment</w:t>
+          </w:r>
+          <w:r>
+            <w:rPr>
+              <w:rFonts w:ascii="Aptos" w:eastAsia="Times New Roman" w:hAnsi="Aptos"/>
+              <w:color w:val="000000"/>
+              <w:lang w:val="en-US"/>
+            </w:rPr>
+            <w:t xml:space="preserve">, </w:t>
+          </w:r>
+          <w:r>
+            <w:rPr>
+              <w:rFonts w:ascii="Aptos" w:eastAsia="Times New Roman" w:hAnsi="Aptos"/>
+              <w:i/>
+              <w:iCs/>
+              <w:color w:val="000000"/>
+              <w:lang w:val="en-US"/>
+            </w:rPr>
+            <w:t>11</w:t>
+          </w:r>
+          <w:r>
+            <w:rPr>
+              <w:rFonts w:ascii="Aptos" w:eastAsia="Times New Roman" w:hAnsi="Aptos"/>
+              <w:color w:val="000000"/>
+              <w:lang w:val="en-US"/>
+            </w:rPr>
+            <w:t>(4), 481–506. https://doi.org/10.1108/IJDRBE-08-2019-0054</w:t>
+          </w:r>
+        </w:p>
+        <w:p>
+          <w:pPr>
+            <w:autoSpaceDE w:val="0"/>
+            <w:autoSpaceDN w:val="0"/>
+            <w:ind w:hanging="480"/>
+            <w:divId w:val="1943564592"/>
+            <w:rPr>
+              <w:rFonts w:ascii="Aptos" w:eastAsia="Times New Roman" w:hAnsi="Aptos"/>
+              <w:color w:val="000000"/>
+              <w:lang w:val="en-US"/>
+            </w:rPr>
+          </w:pPr>
+          <w:r>
+            <w:rPr>
+              <w:rFonts w:ascii="Aptos" w:eastAsia="Times New Roman" w:hAnsi="Aptos"/>
+              <w:color w:val="000000"/>
+              <w:lang w:val="de-AT"/>
+            </w:rPr>
+            <w:t xml:space="preserve">Kuhlmann, T., Garaizar, P., &amp; Reips, U. D. (2021). </w:t>
+          </w:r>
+          <w:r>
+            <w:rPr>
+              <w:rFonts w:ascii="Aptos" w:eastAsia="Times New Roman" w:hAnsi="Aptos"/>
+              <w:color w:val="000000"/>
+              <w:lang w:val="en-US"/>
+            </w:rPr>
+            <w:t xml:space="preserve">Smartphone sensor accuracy varies from device to device in mobile research: The case of spatial orientation. </w:t>
+          </w:r>
+          <w:r>
+            <w:rPr>
+              <w:rFonts w:ascii="Aptos" w:eastAsia="Times New Roman" w:hAnsi="Aptos"/>
+              <w:i/>
+              <w:iCs/>
+              <w:color w:val="000000"/>
+              <w:lang w:val="en-US"/>
+            </w:rPr>
+            <w:t>Behavior Research Methods</w:t>
+          </w:r>
+          <w:r>
+            <w:rPr>
+              <w:rFonts w:ascii="Aptos" w:eastAsia="Times New Roman" w:hAnsi="Aptos"/>
+              <w:color w:val="000000"/>
+              <w:lang w:val="en-US"/>
+            </w:rPr>
+            <w:t xml:space="preserve">, </w:t>
+          </w:r>
+          <w:r>
+            <w:rPr>
+              <w:rFonts w:ascii="Aptos" w:eastAsia="Times New Roman" w:hAnsi="Aptos"/>
+              <w:i/>
+              <w:iCs/>
+              <w:color w:val="000000"/>
+              <w:lang w:val="en-US"/>
+            </w:rPr>
+            <w:t>53</w:t>
+          </w:r>
+          <w:r>
+            <w:rPr>
+              <w:rFonts w:ascii="Aptos" w:eastAsia="Times New Roman" w:hAnsi="Aptos"/>
+              <w:color w:val="000000"/>
+              <w:lang w:val="en-US"/>
+            </w:rPr>
+            <w:t>(1), 22–33. https://doi.org/10.3758/s13428-020-01404-5</w:t>
+          </w:r>
+        </w:p>
+        <w:p>
+          <w:pPr>
+            <w:autoSpaceDE w:val="0"/>
+            <w:autoSpaceDN w:val="0"/>
+            <w:ind w:hanging="480"/>
+            <w:divId w:val="358892333"/>
+            <w:rPr>
+              <w:rFonts w:ascii="Aptos" w:eastAsia="Times New Roman" w:hAnsi="Aptos"/>
+              <w:color w:val="000000"/>
+              <w:lang w:val="en-US"/>
+            </w:rPr>
+          </w:pPr>
+          <w:r>
+            <w:rPr>
+              <w:rFonts w:ascii="Aptos" w:eastAsia="Times New Roman" w:hAnsi="Aptos"/>
+              <w:color w:val="000000"/>
+              <w:lang w:val="en-US"/>
+            </w:rPr>
+            <w:t xml:space="preserve">Matsuno, Y., Fukanuma, F., &amp; Tsuruoka, S. (2021). Development of Flood Disaster Prevention Simulation Smartphone Application Using Gamification. </w:t>
+          </w:r>
+          <w:r>
+            <w:rPr>
+              <w:rFonts w:ascii="Aptos" w:eastAsia="Times New Roman" w:hAnsi="Aptos"/>
+              <w:i/>
+              <w:iCs/>
+              <w:color w:val="000000"/>
+              <w:lang w:val="en-US"/>
+            </w:rPr>
+            <w:t>Dynamics of Disasters: Impact, Risk, Resilience, and Solutions</w:t>
+          </w:r>
+          <w:r>
+            <w:rPr>
+              <w:rFonts w:ascii="Aptos" w:eastAsia="Times New Roman" w:hAnsi="Aptos"/>
+              <w:color w:val="000000"/>
+              <w:lang w:val="en-US"/>
+            </w:rPr>
+            <w:t>, 147–159.</w:t>
+          </w:r>
+        </w:p>
+        <w:p>
+          <w:pPr>
+            <w:autoSpaceDE w:val="0"/>
+            <w:autoSpaceDN w:val="0"/>
+            <w:ind w:hanging="480"/>
+            <w:divId w:val="1053431292"/>
+            <w:rPr>
+              <w:rFonts w:ascii="Aptos" w:eastAsia="Times New Roman" w:hAnsi="Aptos"/>
+              <w:color w:val="000000"/>
+              <w:lang w:val="en-US"/>
+            </w:rPr>
+          </w:pPr>
+          <w:r>
+            <w:rPr>
+              <w:rFonts w:ascii="Aptos" w:eastAsia="Times New Roman" w:hAnsi="Aptos"/>
+              <w:color w:val="000000"/>
+              <w:lang w:val="en-US"/>
+            </w:rPr>
+            <w:t xml:space="preserve">Nagaraju, M. S., Kakarala, H., Sai, V., &amp; Vattikunta, V. P. (2024). Mobile Application for Disaster Safety Management. </w:t>
+          </w:r>
+          <w:r>
+            <w:rPr>
+              <w:rFonts w:ascii="Aptos" w:eastAsia="Times New Roman" w:hAnsi="Aptos"/>
+              <w:i/>
+              <w:iCs/>
+              <w:color w:val="000000"/>
+              <w:lang w:val="en-US"/>
+            </w:rPr>
+            <w:t>10th International Conference on Advanced Computing and Communication Systems, ICACCS 2024</w:t>
+          </w:r>
+          <w:r>
+            <w:rPr>
+              <w:rFonts w:ascii="Aptos" w:eastAsia="Times New Roman" w:hAnsi="Aptos"/>
+              <w:color w:val="000000"/>
+              <w:lang w:val="en-US"/>
+            </w:rPr>
+            <w:t>, 1008–1013. https://doi.org/10.1109/ICACCS60874.2024.10717114</w:t>
+          </w:r>
+        </w:p>
+        <w:p>
+          <w:pPr>
+            <w:autoSpaceDE w:val="0"/>
+            <w:autoSpaceDN w:val="0"/>
+            <w:ind w:hanging="480"/>
+            <w:divId w:val="599946533"/>
+            <w:rPr>
+              <w:rFonts w:ascii="Aptos" w:eastAsia="Times New Roman" w:hAnsi="Aptos"/>
+              <w:color w:val="000000"/>
+              <w:lang w:val="de-AT"/>
+            </w:rPr>
+          </w:pPr>
+          <w:r>
+            <w:rPr>
+              <w:rFonts w:ascii="Aptos" w:eastAsia="Times New Roman" w:hAnsi="Aptos"/>
+              <w:color w:val="000000"/>
+              <w:lang w:val="de-AT"/>
+            </w:rPr>
+            <w:t xml:space="preserve">Österr. Rotes Kreuz, L. S. (2024). </w:t>
+          </w:r>
+          <w:r>
+            <w:rPr>
+              <w:rFonts w:ascii="Aptos" w:eastAsia="Times New Roman" w:hAnsi="Aptos"/>
+              <w:i/>
+              <w:iCs/>
+              <w:color w:val="000000"/>
+              <w:lang w:val="de-AT"/>
+            </w:rPr>
+            <w:t>Erste Hilfe - Rotes Kreuz</w:t>
+          </w:r>
+          <w:r>
+            <w:rPr>
+              <w:rFonts w:ascii="Aptos" w:eastAsia="Times New Roman" w:hAnsi="Aptos"/>
+              <w:color w:val="000000"/>
+              <w:lang w:val="de-AT"/>
+            </w:rPr>
+            <w:t>. https://play.google.com/store/apps/details?id=at.roteskreuz.st.erstehilfe&amp;hl=en</w:t>
+          </w:r>
+        </w:p>
+        <w:p>
+          <w:pPr>
+            <w:autoSpaceDE w:val="0"/>
+            <w:autoSpaceDN w:val="0"/>
+            <w:ind w:hanging="480"/>
+            <w:divId w:val="799416076"/>
+            <w:rPr>
+              <w:rFonts w:ascii="Aptos" w:eastAsia="Times New Roman" w:hAnsi="Aptos"/>
+              <w:color w:val="000000"/>
+              <w:lang w:val="en-US"/>
+            </w:rPr>
+          </w:pPr>
+          <w:r>
+            <w:rPr>
+              <w:rFonts w:ascii="Aptos" w:eastAsia="Times New Roman" w:hAnsi="Aptos"/>
+              <w:color w:val="000000"/>
+              <w:lang w:val="de-AT"/>
+            </w:rPr>
+            <w:t xml:space="preserve">Rundfunk und Telekom Regulierungs GmbH. </w:t>
+          </w:r>
+          <w:r>
+            <w:rPr>
+              <w:rFonts w:ascii="Aptos" w:eastAsia="Times New Roman" w:hAnsi="Aptos"/>
+              <w:color w:val="000000"/>
+              <w:lang w:val="en-US"/>
+            </w:rPr>
+            <w:t xml:space="preserve">(n.d.). </w:t>
+          </w:r>
+          <w:r>
+            <w:rPr>
+              <w:rFonts w:ascii="Aptos" w:eastAsia="Times New Roman" w:hAnsi="Aptos"/>
+              <w:i/>
+              <w:iCs/>
+              <w:color w:val="000000"/>
+              <w:lang w:val="en-US"/>
+            </w:rPr>
+            <w:t>AT-Alert Web Dashboard</w:t>
+          </w:r>
+          <w:r>
+            <w:rPr>
+              <w:rFonts w:ascii="Aptos" w:eastAsia="Times New Roman" w:hAnsi="Aptos"/>
+              <w:color w:val="000000"/>
+              <w:lang w:val="en-US"/>
+            </w:rPr>
+            <w:t>. AT-Alert - Öffentliches Warnsystem. Retrieved May 11, 2026, from https://warnungen.at-alert.at/en</w:t>
+          </w:r>
+        </w:p>
+        <w:p>
+          <w:pPr>
+            <w:autoSpaceDE w:val="0"/>
+            <w:autoSpaceDN w:val="0"/>
+            <w:ind w:hanging="480"/>
+            <w:divId w:val="1023097764"/>
+            <w:rPr>
+              <w:rFonts w:ascii="Aptos" w:eastAsia="Times New Roman" w:hAnsi="Aptos"/>
+              <w:color w:val="000000"/>
+              <w:lang w:val="en-US"/>
+            </w:rPr>
+          </w:pPr>
+          <w:r>
+            <w:rPr>
+              <w:rFonts w:ascii="Aptos" w:eastAsia="Times New Roman" w:hAnsi="Aptos"/>
+              <w:color w:val="000000"/>
+              <w:lang w:val="en-US"/>
+            </w:rPr>
+            <w:lastRenderedPageBreak/>
+            <w:t xml:space="preserve">SOBOS GmbH. (2026). </w:t>
+          </w:r>
+          <w:r>
+            <w:rPr>
+              <w:rFonts w:ascii="Aptos" w:eastAsia="Times New Roman" w:hAnsi="Aptos"/>
+              <w:i/>
+              <w:iCs/>
+              <w:color w:val="000000"/>
+              <w:lang w:val="en-US"/>
+            </w:rPr>
+            <w:t>FloodAlert Waterlevel Alerts</w:t>
+          </w:r>
+          <w:r>
+            <w:rPr>
+              <w:rFonts w:ascii="Aptos" w:eastAsia="Times New Roman" w:hAnsi="Aptos"/>
+              <w:color w:val="000000"/>
+              <w:lang w:val="en-US"/>
+            </w:rPr>
+            <w:t>. https://play.google.com/store/apps/details?id=at.pegelalarm.app&amp;hl=en</w:t>
+          </w:r>
+        </w:p>
+        <w:p>
+          <w:pPr>
+            <w:autoSpaceDE w:val="0"/>
+            <w:autoSpaceDN w:val="0"/>
+            <w:ind w:hanging="480"/>
+            <w:divId w:val="1801917503"/>
+            <w:rPr>
+              <w:rFonts w:ascii="Aptos" w:eastAsia="Times New Roman" w:hAnsi="Aptos"/>
+              <w:color w:val="000000"/>
+              <w:lang w:val="en-US"/>
+            </w:rPr>
+          </w:pPr>
+          <w:r>
+            <w:rPr>
+              <w:rFonts w:ascii="Aptos" w:eastAsia="Times New Roman" w:hAnsi="Aptos"/>
+              <w:color w:val="000000"/>
+            </w:rPr>
+            <w:t xml:space="preserve">Toledo, M. P., Sarvida, J. C. Y., Patiten, B. K. S., Mitamura, D. C. R., &amp; Guadana, R. R. H. (2017). </w:t>
+          </w:r>
+          <w:r>
+            <w:rPr>
+              <w:rFonts w:ascii="Aptos" w:eastAsia="Times New Roman" w:hAnsi="Aptos"/>
+              <w:color w:val="000000"/>
+              <w:lang w:val="en-US"/>
+            </w:rPr>
+            <w:t xml:space="preserve">SakunAPP: A framework for mobile application development in disaster awareness, </w:t>
+          </w:r>
+          <w:proofErr w:type="gramStart"/>
+          <w:r>
+            <w:rPr>
+              <w:rFonts w:ascii="Aptos" w:eastAsia="Times New Roman" w:hAnsi="Aptos"/>
+              <w:color w:val="000000"/>
+              <w:lang w:val="en-US"/>
+            </w:rPr>
+            <w:t>preparedness</w:t>
+          </w:r>
+          <w:proofErr w:type="gramEnd"/>
+          <w:r>
+            <w:rPr>
+              <w:rFonts w:ascii="Aptos" w:eastAsia="Times New Roman" w:hAnsi="Aptos"/>
+              <w:color w:val="000000"/>
+              <w:lang w:val="en-US"/>
+            </w:rPr>
+            <w:t xml:space="preserve"> and response. </w:t>
+          </w:r>
+          <w:r>
+            <w:rPr>
+              <w:rFonts w:ascii="Aptos" w:eastAsia="Times New Roman" w:hAnsi="Aptos"/>
+              <w:i/>
+              <w:iCs/>
+              <w:color w:val="000000"/>
+              <w:lang w:val="en-US"/>
+            </w:rPr>
+            <w:t>TENCON 2017 - 2017 IEEE Region 10 Conference</w:t>
+          </w:r>
+          <w:r>
+            <w:rPr>
+              <w:rFonts w:ascii="Aptos" w:eastAsia="Times New Roman" w:hAnsi="Aptos"/>
+              <w:color w:val="000000"/>
+              <w:lang w:val="en-US"/>
+            </w:rPr>
+            <w:t>, 2759–2764. https://doi.org/10.1109/TENCON.2017.8228331</w:t>
+          </w:r>
+        </w:p>
+        <w:p>
+          <w:pPr>
+            <w:autoSpaceDE w:val="0"/>
+            <w:autoSpaceDN w:val="0"/>
+            <w:ind w:hanging="480"/>
+            <w:divId w:val="1510217179"/>
+            <w:rPr>
+              <w:rFonts w:ascii="Aptos" w:eastAsia="Times New Roman" w:hAnsi="Aptos"/>
+              <w:color w:val="000000"/>
+              <w:lang w:val="de-AT"/>
+            </w:rPr>
+          </w:pPr>
+          <w:r>
+            <w:rPr>
+              <w:rFonts w:ascii="Aptos" w:eastAsia="Times New Roman" w:hAnsi="Aptos"/>
+              <w:color w:val="000000"/>
+              <w:lang w:val="en-US"/>
+            </w:rPr>
+            <w:t xml:space="preserve">Ubimet Int. AG. (2025). </w:t>
+          </w:r>
+          <w:r>
+            <w:rPr>
+              <w:rFonts w:ascii="Aptos" w:eastAsia="Times New Roman" w:hAnsi="Aptos"/>
+              <w:i/>
+              <w:iCs/>
+              <w:color w:val="000000"/>
+              <w:lang w:val="de-AT"/>
+            </w:rPr>
+            <w:t>UWZ Österreich: Gewitter Sturm</w:t>
+          </w:r>
+          <w:r>
+            <w:rPr>
+              <w:rFonts w:ascii="Aptos" w:eastAsia="Times New Roman" w:hAnsi="Aptos"/>
+              <w:color w:val="000000"/>
+              <w:lang w:val="de-AT"/>
+            </w:rPr>
+            <w:t>. https://play.google.com/store/apps/details?id=com.ubimet.uwz&amp;hl=en</w:t>
+          </w:r>
+        </w:p>
+        <w:p>
+          <w:pPr>
+            <w:autoSpaceDE w:val="0"/>
+            <w:autoSpaceDN w:val="0"/>
+            <w:ind w:hanging="480"/>
+            <w:divId w:val="631791389"/>
+            <w:rPr>
+              <w:rFonts w:ascii="Aptos" w:eastAsia="Times New Roman" w:hAnsi="Aptos"/>
+              <w:color w:val="000000"/>
+              <w:lang w:val="en-US"/>
+            </w:rPr>
+          </w:pPr>
+          <w:r>
+            <w:rPr>
+              <w:rFonts w:ascii="Aptos" w:eastAsia="Times New Roman" w:hAnsi="Aptos"/>
+              <w:color w:val="000000"/>
+              <w:lang w:val="en-US"/>
+            </w:rPr>
+            <w:t xml:space="preserve">West, D. M., &amp; Valentini, E. (2013). How Mobile Devices are Transforming Disaster Relief and Public Safety. </w:t>
+          </w:r>
+          <w:r>
+            <w:rPr>
+              <w:rFonts w:ascii="Aptos" w:eastAsia="Times New Roman" w:hAnsi="Aptos"/>
+              <w:i/>
+              <w:iCs/>
+              <w:color w:val="000000"/>
+              <w:lang w:val="en-US"/>
+            </w:rPr>
+            <w:t>Issues in Technology Innovation</w:t>
+          </w:r>
+          <w:r>
+            <w:rPr>
+              <w:rFonts w:ascii="Aptos" w:eastAsia="Times New Roman" w:hAnsi="Aptos"/>
+              <w:color w:val="000000"/>
+              <w:lang w:val="en-US"/>
+            </w:rPr>
+            <w:t>. https://www.brookings.edu/wp-content/uploads/2016/06/West_Valentini_Mobile-Technology-Disaster-Relief_v20.pdf</w:t>
+          </w:r>
+        </w:p>
+        <w:p>
+          <w:pPr>
+            <w:autoSpaceDE w:val="0"/>
+            <w:autoSpaceDN w:val="0"/>
+            <w:ind w:hanging="480"/>
+            <w:divId w:val="2020230516"/>
+            <w:rPr>
+              <w:rFonts w:ascii="Aptos" w:eastAsia="Times New Roman" w:hAnsi="Aptos"/>
+              <w:color w:val="000000"/>
+              <w:lang w:val="en-US"/>
+            </w:rPr>
+          </w:pPr>
+          <w:r>
+            <w:rPr>
+              <w:rFonts w:ascii="Aptos" w:eastAsia="Times New Roman" w:hAnsi="Aptos"/>
+              <w:color w:val="000000"/>
+              <w:lang w:val="en-US"/>
+            </w:rPr>
+            <w:t xml:space="preserve">Zippenfenig, P. (2023). </w:t>
+          </w:r>
+          <w:r>
+            <w:rPr>
+              <w:rFonts w:ascii="Aptos" w:eastAsia="Times New Roman" w:hAnsi="Aptos"/>
+              <w:i/>
+              <w:iCs/>
+              <w:color w:val="000000"/>
+              <w:lang w:val="en-US"/>
+            </w:rPr>
+            <w:t>Open-Meteo.com Air Quality API</w:t>
+          </w:r>
+          <w:r>
+            <w:rPr>
+              <w:rFonts w:ascii="Aptos" w:eastAsia="Times New Roman" w:hAnsi="Aptos"/>
+              <w:color w:val="000000"/>
+              <w:lang w:val="en-US"/>
+            </w:rPr>
+            <w:t>. Open-Meteo and Copernicus Atmosphere Monitoring Service (CAMS). https://doi.org/10.5281/ZENODO.7970649</w:t>
+          </w:r>
+        </w:p>
+        <w:p>
+          <w:pPr>
+            <w:rPr>
+              <w:lang w:val="en-AT"/>
+            </w:rPr>
+          </w:pPr>
+          <w:r>
+            <w:rPr>
+              <w:rFonts w:ascii="Aptos" w:eastAsia="Times New Roman" w:hAnsi="Aptos"/>
+              <w:color w:val="000000"/>
+              <w:lang w:val="en-US"/>
+            </w:rPr>
+            <w:t> </w:t>
+          </w:r>
+        </w:p>
+      </w:sdtContent>
+    </w:sdt>
     <w:sectPr>
       <w:pgSz w:w="11906" w:h="16838"/>
       <w:pgMar w:top="1440" w:right="1440" w:bottom="1440" w:left="1440" w:header="708" w:footer="708" w:gutter="0"/>
@@ -3980,36 +4409,6 @@
         </w:p>
       </w:docPartBody>
     </w:docPart>
-    <w:docPart>
-      <w:docPartPr>
-        <w:name w:val="1267E22D87D246579C51BA413E8DDCA3"/>
-        <w:category>
-          <w:name w:val="General"/>
-          <w:gallery w:val="placeholder"/>
-        </w:category>
-        <w:types>
-          <w:type w:val="bbPlcHdr"/>
-        </w:types>
-        <w:behaviors>
-          <w:behavior w:val="content"/>
-        </w:behaviors>
-        <w:guid w:val="{49FE4DC9-58E1-4665-9BEF-6C72624F0945}"/>
-      </w:docPartPr>
-      <w:docPartBody>
-        <w:p>
-          <w:pPr>
-            <w:pStyle w:val="1267E22D87D246579C51BA413E8DDCA3"/>
-          </w:pPr>
-          <w:r>
-            <w:rPr>
-              <w:rStyle w:val="PlaceholderText"/>
-              <w:lang w:val="en-AT"/>
-            </w:rPr>
-            <w:t>Click or tap here to enter text.</w:t>
-          </w:r>
-        </w:p>
-      </w:docPartBody>
-    </w:docPart>
   </w:docParts>
 </w:glossaryDocument>
 </file>
@@ -4100,8 +4499,8 @@
   </w:compat>
   <w:rsids>
     <w:rsidRoot w:val="00ED6501"/>
+    <w:rsid w:val="00045575"/>
     <w:rsid w:val="00766FDD"/>
-    <w:rsid w:val="00BF0795"/>
     <w:rsid w:val="00ED6501"/>
   </w:rsids>
   <m:mathPr>
@@ -4889,7 +5288,7 @@
   <we:properties>
     <we:property name="MENDELEY_BIBLIOGRAPHY_IS_DIRTY" value="false"/>
     <we:property name="MENDELEY_BIBLIOGRAPHY_LAST_MODIFIED" value="1778502931259"/>
-    <we:property name="MENDELEY_CITATIONS" value="[{&quot;citationID&quot;:&quot;MENDELEY_CITATION_d7214391-a203-484b-9d50-0d7398ea4d83&quot;,&quot;properties&quot;:{&quot;noteIndex&quot;:0,&quot;mode&quot;:&quot;suppress-author&quot;},&quot;isEdited&quot;:false,&quot;manualOverride&quot;:{&quot;isManuallyOverridden&quot;:false,&quot;citeprocText&quot;:&quot;(2013)&quot;,&quot;manualOverrideText&quot;:&quot;&quot;},&quot;citationTag&quot;:&quot;MENDELEY_CITATION_v3_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&quot;,&quot;citationItems&quot;:[{&quot;id&quot;:&quot;a6ec5793-99c6-3664-9b43-50da778f0aa2&quot;,&quot;itemData&quot;:{&quot;type&quot;:&quot;article-journal&quot;,&quot;id&quot;:&quot;a6ec5793-99c6-3664-9b43-50da778f0aa2&quot;,&quot;title&quot;:&quot;How Mobile Devices are Transforming Disaster Relief and Public Safety&quot;,&quot;author&quot;:[{&quot;family&quot;:&quot;West&quot;,&quot;given&quot;:&quot;Darrell M&quot;,&quot;parse-names&quot;:false,&quot;dropping-particle&quot;:&quot;&quot;,&quot;non-dropping-particle&quot;:&quot;&quot;},{&quot;family&quot;:&quot;Valentini&quot;,&quot;given&quot;:&quot;Elizabeth&quot;,&quot;parse-names&quot;:false,&quot;dropping-particle&quot;:&quot;&quot;,&quot;non-dropping-particle&quot;:&quot;&quot;}],&quot;container-title&quot;:&quot;Issues in Technology Innovation&quot;,&quot;accessed&quot;:{&quot;date-parts&quot;:[[2026,5,11]]},&quot;URL&quot;:&quot;https://www.brookings.edu/wp-content/uploads/2016/06/West_Valentini_Mobile-Technology-Disaster-Relief_v20.pdf&quot;,&quot;issued&quot;:{&quot;date-parts&quot;:[[2013,7]]},&quot;container-title-short&quot;:&quot;&quot;},&quot;isTemporary&quot;:false,&quot;displayAs&quot;:&quot;suppress-author&quot;,&quot;suppress-author&quot;:true,&quot;composite&quot;:false,&quot;author-only&quot;:false}]},{&quot;citationID&quot;:&quot;MENDELEY_CITATION_57f7902a-805a-422a-8600-3a660d9a1349&quot;,&quot;properties&quot;:{&quot;noteIndex&quot;:0,&quot;mode&quot;:&quot;composite&quot;},&quot;isEdited&quot;:false,&quot;manualOverride&quot;:{&quot;isManuallyOverridden&quot;:false,&quot;citeprocText&quot;:&quot;Toledo et al. (2017)&quot;,&quot;manualOverrideText&quot;:&quot;&quot;},&quot;citationTag&quot;:&quot;MENDELEY_CITATION_v3_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&quot;,&quot;citationItems&quot;:[{&quot;id&quot;:&quot;b4f339d8-6e9c-34d0-a036-639996814880&quot;,&quot;itemData&quot;:{&quot;type&quot;:&quot;paper-conference&quot;,&quot;id&quot;:&quot;b4f339d8-6e9c-34d0-a036-639996814880&quot;,&quot;title&quot;:&quot;SakunAPP: A framework for mobile application development in disaster awareness, preparedness and response&quot;,&quot;author&quot;:[{&quot;family&quot;:&quot;Toledo&quot;,&quot;given&quot;:&quot;Margarette P.&quot;,&quot;parse-names&quot;:false,&quot;dropping-particle&quot;:&quot;&quot;,&quot;non-dropping-particle&quot;:&quot;&quot;},{&quot;family&quot;:&quot;Sarvida&quot;,&quot;given&quot;:&quot;Johannah Crisanta Y.&quot;,&quot;parse-names&quot;:false,&quot;dropping-particle&quot;:&quot;&quot;,&quot;non-dropping-particle&quot;:&quot;&quot;},{&quot;family&quot;:&quot;Patiten&quot;,&quot;given&quot;:&quot;Bill Kevin S.&quot;,&quot;parse-names&quot;:false,&quot;dropping-particle&quot;:&quot;&quot;,&quot;non-dropping-particle&quot;:&quot;&quot;},{&quot;family&quot;:&quot;Mitamura&quot;,&quot;given&quot;:&quot;Daniel Carl R.&quot;,&quot;parse-names&quot;:false,&quot;dropping-particle&quot;:&quot;&quot;,&quot;non-dropping-particle&quot;:&quot;&quot;},{&quot;family&quot;:&quot;Guadana&quot;,&quot;given&quot;:&quot;Ryan Richard H.&quot;,&quot;parse-names&quot;:false,&quot;dropping-particle&quot;:&quot;&quot;,&quot;non-dropping-particle&quot;:&quot;&quot;}],&quot;container-title&quot;:&quot;TENCON 2017 - 2017 IEEE Region 10 Conference&quot;,&quot;DOI&quot;:&quot;10.1109/TENCON.2017.8228331&quot;,&quot;ISBN&quot;:&quot;978-1-5090-1134-6&quot;,&quot;issued&quot;:{&quot;date-parts&quot;:[[2017,11]]},&quot;page&quot;:&quot;2759-2764&quot;,&quot;publisher&quot;:&quot;IEEE&quot;,&quot;container-title-short&quot;:&quot;&quot;},&quot;isTemporary&quot;:false,&quot;displayAs&quot;:&quot;composite&quot;,&quot;suppress-author&quot;:false,&quot;composite&quot;:true,&quot;author-only&quot;:false}]},{&quot;citationID&quot;:&quot;MENDELEY_CITATION_6e0b71a4-6668-4990-8171-3865d20fc6f1&quot;,&quot;properties&quot;:{&quot;noteIndex&quot;:0,&quot;mode&quot;:&quot;composite&quot;},&quot;isEdited&quot;:false,&quot;manualOverride&quot;:{&quot;isManuallyOverridden&quot;:false,&quot;citeprocText&quot;:&quot;Nagaraju et al. (2024)&quot;,&quot;manualOverrideText&quot;:&quot;&quot;},&quot;citationTag&quot;:&quot;MENDELEY_CITATION_v3_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&quot;,&quot;citationItems&quot;:[{&quot;id&quot;:&quot;21f33b29-909c-3cc8-92ee-3feeaa9a3cb5&quot;,&quot;itemData&quot;:{&quot;type&quot;:&quot;paper-conference&quot;,&quot;id&quot;:&quot;21f33b29-909c-3cc8-92ee-3feeaa9a3cb5&quot;,&quot;title&quot;:&quot;Mobile Application for Disaster Safety Management&quot;,&quot;author&quot;:[{&quot;family&quot;:&quot;Nagaraju&quot;,&quot;given&quot;:&quot;M. Siva&quot;,&quot;parse-names&quot;:false,&quot;dropping-particle&quot;:&quot;&quot;,&quot;non-dropping-particle&quot;:&quot;&quot;},{&quot;family&quot;:&quot;Kakarala&quot;,&quot;given&quot;:&quot;Harshitha&quot;,&quot;parse-names&quot;:false,&quot;dropping-particle&quot;:&quot;&quot;,&quot;non-dropping-particle&quot;:&quot;&quot;},{&quot;family&quot;:&quot;Sai&quot;,&quot;given&quot;:&quot;Vadaparthi&quot;,&quot;parse-names&quot;:false,&quot;dropping-particle&quot;:&quot;&quot;,&quot;non-dropping-particle&quot;:&quot;&quot;},{&quot;family&quot;:&quot;Vattikunta&quot;,&quot;given&quot;:&quot;Vishnu Pramukh&quot;,&quot;parse-names&quot;:false,&quot;dropping-particle&quot;:&quot;&quot;,&quot;non-dropping-particle&quot;:&quot;&quot;}],&quot;container-title&quot;:&quot;10th International Conference on Advanced Computing and Communication Systems, ICACCS 2024&quot;,&quot;DOI&quot;:&quot;10.1109/ICACCS60874.2024.10717114&quot;,&quot;ISBN&quot;:&quot;9798350384369&quot;,&quot;issued&quot;:{&quot;date-parts&quot;:[[2024]]},&quot;page&quot;:&quot;1008-1013&quot;,&quot;abstract&quot;:&quot;Disasters, whether geological upheavals like earth- quakes or the fury of a cyclonic storm, are often perceived as forces beyond human control. However, viewing them solely as 'natural' phenomena hides the crucial role of human settlements in amplifying their impact. Our tendency to build in floodplains, on earthquake faults, and along vulnerable coastlines transforms these natural events into devastating disasters. This anthropogenic lens underscores the need for proactive measures, with mobile applications emerging as powerful tools for disaster preparedness, communication, and response. Beyond simply acting as emergency sirens, these apps offer a comprehensive toolkit for mitigating disaster risk. Real-time alerts and hazard maps empower communities to prepare for impending threats, allowing for timely evacuation and resource mobilization. Comprehensive guides provide step-by-step instructions on creating emergency kits, securing homes, and staying informed during critical moments. By bridging information gaps and facilitating coordinated action, mobile apps have the potential to significantly bolster disaster safety, equipping individuals and communities with the knowledge and tools to navigate the challenges posed by these complex events.&quot;,&quot;publisher&quot;:&quot;Institute of Electrical and Electronics Engineers Inc.&quot;,&quot;container-title-short&quot;:&quot;&quot;},&quot;isTemporary&quot;:false,&quot;displayAs&quot;:&quot;composite&quot;,&quot;suppress-author&quot;:false,&quot;composite&quot;:true,&quot;author-only&quot;:false}]},{&quot;citationID&quot;:&quot;MENDELEY_CITATION_6b3ee454-be67-4f06-92d3-44f30304800d&quot;,&quot;properties&quot;:{&quot;noteIndex&quot;:0,&quot;mode&quot;:&quot;composite&quot;},&quot;isEdited&quot;:false,&quot;manualOverride&quot;:{&quot;isManuallyOverridden&quot;:false,&quot;citeprocText&quot;:&quot;Kuhlmann et al. (2021)&quot;,&quot;manualOverrideText&quot;:&quot;&quot;},&quot;citationTag&quot;:&quot;MENDELEY_CITATION_v3_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&quot;,&quot;citationItems&quot;:[{&quot;id&quot;:&quot;3ecc0f8d-aec9-336a-b1b0-577fcacffed2&quot;,&quot;itemData&quot;:{&quot;type&quot;:&quot;article-journal&quot;,&quot;id&quot;:&quot;3ecc0f8d-aec9-336a-b1b0-577fcacffed2&quot;,&quot;title&quot;:&quot;Smartphone sensor accuracy varies from device to device in mobile research: The case of spatial orientation&quot;,&quot;author&quot;:[{&quot;family&quot;:&quot;Kuhlmann&quot;,&quot;given&quot;:&quot;Tim&quot;,&quot;parse-names&quot;:false,&quot;dropping-particle&quot;:&quot;&quot;,&quot;non-dropping-particle&quot;:&quot;&quot;},{&quot;family&quot;:&quot;Garaizar&quot;,&quot;given&quot;:&quot;Pablo&quot;,&quot;parse-names&quot;:false,&quot;dropping-particle&quot;:&quot;&quot;,&quot;non-dropping-particle&quot;:&quot;&quot;},{&quot;family&quot;:&quot;Reips&quot;,&quot;given&quot;:&quot;Ulf Dietrich&quot;,&quot;parse-names&quot;:false,&quot;dropping-particle&quot;:&quot;&quot;,&quot;non-dropping-particle&quot;:&quot;&quot;}],&quot;container-title&quot;:&quot;Behavior Research Methods&quot;,&quot;container-title-short&quot;:&quot;Behav. Res. Methods&quot;,&quot;DOI&quot;:&quot;10.3758/s13428-020-01404-5&quot;,&quot;ISSN&quot;:&quot;15543528&quot;,&quot;PMID&quot;:&quot;32472500&quot;,&quot;issued&quot;:{&quot;date-parts&quot;:[[2021,2,1]]},&quot;page&quot;:&quot;22-33&quot;,&quot;abstract&quot;:&quot;Smartphone usage is increasing around the globe—in daily life and as a research device in behavioral science. Smartphones offer the possibility to gather longitudinal data at little cost to researchers and participants. They provide the option to verify self-report data with data from sensors built into most smartphones. How accurate this sensor data is when gathered via different smartphone devices, e.g., in a typical experience sampling framework, has not been investigated systematically. With the present study, we investigated the accuracy of orientation data about the spatial position of smartphones via a newly invented measurement device, the RollPitcher. Objective status of pitch (vertical orientation) and roll (horizontal orientation) of the smartphone was compared to data gathered from the sensors via web browsers and native apps. Bayesian ANOVAs confirmed that the deviations in pitch and roll differed between smartphone models, with mean inaccuracies per device of up to 2.1° and 6.6°, respectively. The inaccuracies for measurements of roll were higher than for pitch, d =.28, p &lt;.001. Our results confirm the presence of heterogeneities when gathering orientation data from different smartphone devices. In most cases, measurement via a web browser was identical to measurement via a native app, but this was not true for all smartphone devices. As a solution to lack of sensor accuracy, we recommend the development and implementation of a coherent research framework and also discuss the implications of the heterogeneities in orientation data for different research designs.&quot;,&quot;publisher&quot;:&quot;Springer&quot;,&quot;issue&quot;:&quot;1&quot;,&quot;volume&quot;:&quot;53&quot;},&quot;isTemporary&quot;:false,&quot;displayAs&quot;:&quot;composite&quot;,&quot;suppress-author&quot;:false,&quot;composite&quot;:true,&quot;author-only&quot;:false}]},{&quot;citationID&quot;:&quot;MENDELEY_CITATION_9896379d-b93d-451c-b9be-fa321f4c29e5&quot;,&quot;properties&quot;:{&quot;noteIndex&quot;:0},&quot;isEdited&quot;:false,&quot;manualOverride&quot;:{&quot;isManuallyOverridden&quot;:false,&quot;citeprocText&quot;:&quot;(Österr. Rotes Kreuz, 2024)&quot;,&quot;manualOverrideText&quot;:&quot;&quot;},&quot;citationTag&quot;:&quot;MENDELEY_CITATION_v3_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&quot;,&quot;citationItems&quot;:[{&quot;id&quot;:&quot;179826b5-150f-3045-86d2-e09327713ef9&quot;,&quot;itemData&quot;:{&quot;type&quot;:&quot;article&quot;,&quot;id&quot;:&quot;179826b5-150f-3045-86d2-e09327713ef9&quot;,&quot;title&quot;:&quot;Erste Hilfe - Rotes Kreuz&quot;,&quot;author&quot;:[{&quot;family&quot;:&quot;Österr. Rotes Kreuz&quot;,&quot;given&quot;:&quot;LV Stmk&quot;,&quot;parse-names&quot;:false,&quot;dropping-particle&quot;:&quot;&quot;,&quot;non-dropping-particle&quot;:&quot;&quot;}],&quot;accessed&quot;:{&quot;date-parts&quot;:[[2026,5,11]]},&quot;URL&quot;:&quot;https://play.google.com/store/apps/details?id=at.roteskreuz.st.erstehilfe&amp;hl=en&quot;,&quot;issued&quot;:{&quot;date-parts&quot;:[[2024]]},&quot;container-title-short&quot;:&quot;&quot;},&quot;isTemporary&quot;:false,&quot;suppress-author&quot;:false,&quot;composite&quot;:false,&quot;author-only&quot;:false}]},{&quot;citationID&quot;:&quot;MENDELEY_CITATION_886671ad-60e0-435a-bce4-cdd2e12acb0a&quot;,&quot;properties&quot;:{&quot;noteIndex&quot;:0},&quot;isEdited&quot;:false,&quot;manualOverride&quot;:{&quot;isManuallyOverridden&quot;:false,&quot;citeprocText&quot;:&quot;(Ubimet Int. AG, 2025)&quot;,&quot;manualOverrideText&quot;:&quot;&quot;},&quot;citationTag&quot;:&quot;MENDELEY_CITATION_v3_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&quot;,&quot;citationItems&quot;:[{&quot;id&quot;:&quot;0a0ede94-d528-31c4-bd01-16cba9053d6d&quot;,&quot;itemData&quot;:{&quot;type&quot;:&quot;article&quot;,&quot;id&quot;:&quot;0a0ede94-d528-31c4-bd01-16cba9053d6d&quot;,&quot;title&quot;:&quot;UWZ Österreich: Gewitter Sturm&quot;,&quot;author&quot;:[{&quot;family&quot;:&quot;Ubimet Int. AG&quot;,&quot;given&quot;:&quot;&quot;,&quot;parse-names&quot;:false,&quot;dropping-particle&quot;:&quot;&quot;,&quot;non-dropping-particle&quot;:&quot;&quot;}],&quot;accessed&quot;:{&quot;date-parts&quot;:[[2026,5,11]]},&quot;URL&quot;:&quot;https://play.google.com/store/apps/details?id=com.ubimet.uwz&amp;hl=en&quot;,&quot;issued&quot;:{&quot;date-parts&quot;:[[2025]]},&quot;container-title-short&quot;:&quot;&quot;},&quot;isTemporary&quot;:false,&quot;suppress-author&quot;:false,&quot;composite&quot;:false,&quot;author-only&quot;:false}]},{&quot;citationID&quot;:&quot;MENDELEY_CITATION_0d855cf6-e64e-48df-98eb-f43914fe822b&quot;,&quot;properties&quot;:{&quot;noteIndex&quot;:0},&quot;isEdited&quot;:false,&quot;manualOverride&quot;:{&quot;isManuallyOverridden&quot;:false,&quot;citeprocText&quot;:&quot;(SOBOS GmbH, 2026)&quot;,&quot;manualOverrideText&quot;:&quot;&quot;},&quot;citationTag&quot;:&quot;MENDELEY_CITATION_v3_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&quot;,&quot;citationItems&quot;:[{&quot;id&quot;:&quot;fd2c4f96-3611-3a59-9007-f495f9af880b&quot;,&quot;itemData&quot;:{&quot;type&quot;:&quot;article&quot;,&quot;id&quot;:&quot;fd2c4f96-3611-3a59-9007-f495f9af880b&quot;,&quot;title&quot;:&quot;FloodAlert Waterlevel Alerts&quot;,&quot;author&quot;:[{&quot;family&quot;:&quot;SOBOS GmbH&quot;,&quot;given&quot;:&quot;&quot;,&quot;parse-names&quot;:false,&quot;dropping-particle&quot;:&quot;&quot;,&quot;non-dropping-particle&quot;:&quot;&quot;}],&quot;accessed&quot;:{&quot;date-parts&quot;:[[2026,5,11]]},&quot;URL&quot;:&quot;https://play.google.com/store/apps/details?id=at.pegelalarm.app&amp;hl=en&quot;,&quot;issued&quot;:{&quot;date-parts&quot;:[[2026]]},&quot;container-title-short&quot;:&quot;&quot;},&quot;isTemporary&quot;:false,&quot;suppress-author&quot;:false,&quot;composite&quot;:false,&quot;author-only&quot;:false}]},{&quot;citationID&quot;:&quot;MENDELEY_CITATION_e105d078-37da-4078-a5d6-d97703616d8c&quot;,&quot;properties&quot;:{&quot;noteIndex&quot;:0},&quot;isEdited&quot;:false,&quot;manualOverride&quot;:{&quot;isManuallyOverridden&quot;:false,&quot;citeprocText&quot;:&quot;(CombiRisk Risk-Management GmbH, 2025)&quot;,&quot;manualOverrideText&quot;:&quot;&quot;},&quot;citationTag&quot;:&quot;MENDELEY_CITATION_v3_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&quot;,&quot;citationItems&quot;:[{&quot;id&quot;:&quot;d80d37ba-b2b0-3118-a50c-727d98f799c1&quot;,&quot;itemData&quot;:{&quot;type&quot;:&quot;article&quot;,&quot;id&quot;:&quot;d80d37ba-b2b0-3118-a50c-727d98f799c1&quot;,&quot;title&quot;:&quot;KATWARN&quot;,&quot;author&quot;:[{&quot;family&quot;:&quot;CombiRisk Risk-Management GmbH&quot;,&quot;given&quot;:&quot;&quot;,&quot;parse-names&quot;:false,&quot;dropping-particle&quot;:&quot;&quot;,&quot;non-dropping-particle&quot;:&quot;&quot;}],&quot;accessed&quot;:{&quot;date-parts&quot;:[[2026,5,11]]},&quot;URL&quot;:&quot;https://play.google.com/store/apps/details?id=de.combirisk.katwarn&amp;hl=en&quot;,&quot;issued&quot;:{&quot;date-parts&quot;:[[2025]]},&quot;container-title-short&quot;:&quot;&quot;},&quot;isTemporary&quot;:false,&quot;suppress-author&quot;:false,&quot;composite&quot;:false,&quot;author-only&quot;:false}]},{&quot;citationID&quot;:&quot;MENDELEY_CITATION_e14d5e21-56ca-4a3d-9123-0d31935a1303&quot;,&quot;properties&quot;:{&quot;noteIndex&quot;:0},&quot;isEdited&quot;:false,&quot;manualOverride&quot;:{&quot;isManuallyOverridden&quot;:true,&quot;citeprocText&quot;:&quot;(dominoc925, 2026; Gehirn Inc., 2026)&quot;,&quot;manualOverrideText&quot;:&quot;(Gehirn Inc., 2026; dominoc925, 2026)&quot;},&quot;citationTag&quot;:&quot;MENDELEY_CITATION_v3_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&quot;,&quot;citationItems&quot;:[{&quot;id&quot;:&quot;f0b01b7d-aa34-3f97-8664-4c969d93c381&quot;,&quot;itemData&quot;:{&quot;type&quot;:&quot;article&quot;,&quot;id&quot;:&quot;f0b01b7d-aa34-3f97-8664-4c969d93c381&quot;,&quot;title&quot;:&quot;Disastermon Natural Disaster Monitor&quot;,&quot;author&quot;:[{&quot;family&quot;:&quot;dominoc925&quot;,&quot;given&quot;:&quot;&quot;,&quot;parse-names&quot;:false,&quot;dropping-particle&quot;:&quot;&quot;,&quot;non-dropping-particle&quot;:&quot;&quot;}],&quot;accessed&quot;:{&quot;date-parts&quot;:[[2026,5,11]]},&quot;URL&quot;:&quot;https://play.google.com/store/apps/details?id=com.dom925.disastermon&amp;hl=en&quot;,&quot;issued&quot;:{&quot;date-parts&quot;:[[2026]]},&quot;container-title-short&quot;:&quot;&quot;},&quot;isTemporary&quot;:false},{&quot;id&quot;:&quot;d433b857-53be-3bee-b10b-cee97cab9c7b&quot;,&quot;itemData&quot;:{&quot;type&quot;:&quot;article&quot;,&quot;id&quot;:&quot;d433b857-53be-3bee-b10b-cee97cab9c7b&quot;,&quot;title&quot;:&quot;NERV Disaster Prevention&quot;,&quot;author&quot;:[{&quot;family&quot;:&quot;Gehirn Inc.&quot;,&quot;given&quot;:&quot;&quot;,&quot;parse-names&quot;:false,&quot;dropping-particle&quot;:&quot;&quot;,&quot;non-dropping-particle&quot;:&quot;&quot;}],&quot;accessed&quot;:{&quot;date-parts&quot;:[[2026,5,11]]},&quot;URL&quot;:&quot;https://play.google.com/store/apps/details?id=app.nerv&amp;hl=en&quot;,&quot;issued&quot;:{&quot;date-parts&quot;:[[2026]]},&quot;container-title-short&quot;:&quot;&quot;},&quot;isTemporary&quot;:false}]},{&quot;citationID&quot;:&quot;MENDELEY_CITATION_3f4ded40-ee20-47bc-b072-d5e9ce0024fe&quot;,&quot;properties&quot;:{&quot;noteIndex&quot;:0},&quot;isEdited&quot;:false,&quot;manualOverride&quot;:{&quot;isManuallyOverridden&quot;:false,&quot;citeprocText&quot;:&quot;(Rundfunk und Telekom Regulierungs GmbH, n.d.)&quot;,&quot;manualOverrideText&quot;:&quot;&quot;},&quot;citationTag&quot;:&quot;MENDELEY_CITATION_v3_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&quot;,&quot;citationItems&quot;:[{&quot;id&quot;:&quot;f7319c76-9025-35c1-aaa8-5ecc17c656ae&quot;,&quot;itemData&quot;:{&quot;type&quot;:&quot;webpage&quot;,&quot;id&quot;:&quot;f7319c76-9025-35c1-aaa8-5ecc17c656ae&quot;,&quot;title&quot;:&quot;AT-Alert Web Dashboard&quot;,&quot;author&quot;:[{&quot;family&quot;:&quot;Rundfunk und Telekom Regulierungs GmbH&quot;,&quot;given&quot;:&quot;&quot;,&quot;parse-names&quot;:false,&quot;dropping-particle&quot;:&quot;&quot;,&quot;non-dropping-particle&quot;:&quot;&quot;}],&quot;container-title&quot;:&quot;AT-Alert - öffentliches Warnsystem&quot;,&quot;accessed&quot;:{&quot;date-parts&quot;:[[2026,5,11]]},&quot;URL&quot;:&quot;https://warnungen.at-alert.at/en&quot;,&quot;container-title-short&quot;:&quot;&quot;},&quot;isTemporary&quot;:false,&quot;suppress-author&quot;:false,&quot;composite&quot;:false,&quot;author-only&quot;:false}]},{&quot;citationID&quot;:&quot;MENDELEY_CITATION_1cbcc268-165a-4575-828b-2e05f705d6e4&quot;,&quot;properties&quot;:{&quot;noteIndex&quot;:0},&quot;isEdited&quot;:false,&quot;manualOverride&quot;:{&quot;isManuallyOverridden&quot;:false,&quot;citeprocText&quot;:&quot;(GeoSphere Austria, n.d.)&quot;,&quot;manualOverrideText&quot;:&quot;&quot;},&quot;citationTag&quot;:&quot;MENDELEY_CITATION_v3_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&quot;,&quot;citationItems&quot;:[{&quot;id&quot;:&quot;1eb338cb-5eaf-348b-892b-5ab278b99afb&quot;,&quot;itemData&quot;:{&quot;type&quot;:&quot;webpage&quot;,&quot;id&quot;:&quot;1eb338cb-5eaf-348b-892b-5ab278b99afb&quot;,&quot;title&quot;:&quot;Warn API v1: OpenAPI Documentation&quot;,&quot;author&quot;:[{&quot;family&quot;:&quot;GeoSphere Austria&quot;,&quot;given&quot;:&quot;&quot;,&quot;parse-names&quot;:false,&quot;dropping-particle&quot;:&quot;&quot;,&quot;non-dropping-particle&quot;:&quot;&quot;}],&quot;container-title&quot;:&quot;GeoSphere Austria Swagger UI&quot;,&quot;accessed&quot;:{&quot;date-parts&quot;:[[2026,5,11]]},&quot;URL&quot;:&quot;https://openapi.hub.geosphere.at/warnapi/v1/&quot;,&quot;container-title-short&quot;:&quot;&quot;},&quot;isTemporary&quot;:false,&quot;suppress-author&quot;:false,&quot;composite&quot;:false,&quot;author-only&quot;:false}]},{&quot;citationID&quot;:&quot;MENDELEY_CITATION_341eb66c-e290-468f-8143-e991c26356f6&quot;,&quot;properties&quot;:{&quot;noteIndex&quot;:0,&quot;mode&quot;:&quot;suppress-author&quot;},&quot;isEdited&quot;:false,&quot;manualOverride&quot;:{&quot;isManuallyOverridden&quot;:false,&quot;citeprocText&quot;:&quot;(n.d.)&quot;,&quot;manualOverrideText&quot;:&quot;&quot;},&quot;citationTag&quot;:&quot;MENDELEY_CITATION_v3_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&quot;,&quot;citationItems&quot;:[{&quot;id&quot;:&quot;350bf848-c1ea-3b59-b057-5de5c2d5479e&quot;,&quot;itemData&quot;:{&quot;type&quot;:&quot;webpage&quot;,&quot;id&quot;:&quot;350bf848-c1ea-3b59-b057-5de5c2d5479e&quot;,&quot;title&quot;:&quot;Current measurements from the radiation early warning system&quot;,&quot;author&quot;:[{&quot;family&quot;:&quot;Austrian Federal Ministry of Agriculture Forestry Climate and Environmental Protection Regions and Water Management&quot;,&quot;given&quot;:&quot;&quot;,&quot;parse-names&quot;:false,&quot;dropping-particle&quot;:&quot;&quot;,&quot;non-dropping-particle&quot;:&quot;&quot;}],&quot;container-title&quot;:&quot;Radiation early warning system and monitoring&quot;,&quot;accessed&quot;:{&quot;date-parts&quot;:[[2026,5,11]]},&quot;URL&quot;:&quot;https://www.bmluk.gv.at/themen/klima-und-umwelt/strahlenschutz/fruehwarnsystem/messwerte.html&quot;,&quot;container-title-short&quot;:&quot;&quot;},&quot;isTemporary&quot;:false,&quot;displayAs&quot;:&quot;suppress-author&quot;,&quot;suppress-author&quot;:true,&quot;composite&quot;:false,&quot;author-only&quot;:false}]},{&quot;citationID&quot;:&quot;MENDELEY_CITATION_f92a6daf-97dd-40fe-b390-b5bf6f34d878&quot;,&quot;properties&quot;:{&quot;noteIndex&quot;:0,&quot;mode&quot;:&quot;composite&quot;},&quot;isEdited&quot;:false,&quot;manualOverride&quot;:{&quot;isManuallyOverridden&quot;:false,&quot;citeprocText&quot;:&quot;West &amp;#38; Valentini (2013)&quot;,&quot;manualOverrideText&quot;:&quot;&quot;},&quot;citationItems&quot;:[{&quot;id&quot;:&quot;a6ec5793-99c6-3664-9b43-50da778f0aa2&quot;,&quot;itemData&quot;:{&quot;type&quot;:&quot;article-journal&quot;,&quot;id&quot;:&quot;a6ec5793-99c6-3664-9b43-50da778f0aa2&quot;,&quot;title&quot;:&quot;How Mobile Devices are Transforming Disaster Relief and Public Safety&quot;,&quot;author&quot;:[{&quot;family&quot;:&quot;West&quot;,&quot;given&quot;:&quot;Darrell M&quot;,&quot;parse-names&quot;:false,&quot;dropping-particle&quot;:&quot;&quot;,&quot;non-dropping-particle&quot;:&quot;&quot;},{&quot;family&quot;:&quot;Valentini&quot;,&quot;given&quot;:&quot;Elizabeth&quot;,&quot;parse-names&quot;:false,&quot;dropping-particle&quot;:&quot;&quot;,&quot;non-dropping-particle&quot;:&quot;&quot;}],&quot;container-title&quot;:&quot;Issues in Technology Innovation&quot;,&quot;accessed&quot;:{&quot;date-parts&quot;:[[2026,5,11]]},&quot;URL&quot;:&quot;https://www.brookings.edu/wp-content/uploads/2016/06/West_Valentini_Mobile-Technology-Disaster-Relief_v20.pdf&quot;,&quot;issued&quot;:{&quot;date-parts&quot;:[[2013,7]]},&quot;container-title-short&quot;:&quot;&quot;},&quot;isTemporary&quot;:false,&quot;displayAs&quot;:&quot;composite&quot;,&quot;suppress-author&quot;:false,&quot;composite&quot;:true,&quot;author-only&quot;:false}],&quot;citationTag&quot;:&quot;MENDELEY_CITATION_v3_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&quot;},{&quot;citationID&quot;:&quot;MENDELEY_CITATION_a2c2ae21-bc8d-41f3-829e-3fd079960b91&quot;,&quot;properties&quot;:{&quot;noteIndex&quot;:0,&quot;mode&quot;:&quot;composite&quot;},&quot;isEdited&quot;:false,&quot;manualOverride&quot;:{&quot;isManuallyOverridden&quot;:false,&quot;citeprocText&quot;:&quot;Toledo et al. (2017)&quot;,&quot;manualOverrideText&quot;:&quot;&quot;},&quot;citationItems&quot;:[{&quot;id&quot;:&quot;b4f339d8-6e9c-34d0-a036-639996814880&quot;,&quot;itemData&quot;:{&quot;type&quot;:&quot;paper-conference&quot;,&quot;id&quot;:&quot;b4f339d8-6e9c-34d0-a036-639996814880&quot;,&quot;title&quot;:&quot;SakunAPP: A framework for mobile application development in disaster awareness, preparedness and response&quot;,&quot;author&quot;:[{&quot;family&quot;:&quot;Toledo&quot;,&quot;given&quot;:&quot;Margarette P.&quot;,&quot;parse-names&quot;:false,&quot;dropping-particle&quot;:&quot;&quot;,&quot;non-dropping-particle&quot;:&quot;&quot;},{&quot;family&quot;:&quot;Sarvida&quot;,&quot;given&quot;:&quot;Johannah Crisanta Y.&quot;,&quot;parse-names&quot;:false,&quot;dropping-particle&quot;:&quot;&quot;,&quot;non-dropping-particle&quot;:&quot;&quot;},{&quot;family&quot;:&quot;Patiten&quot;,&quot;given&quot;:&quot;Bill Kevin S.&quot;,&quot;parse-names&quot;:false,&quot;dropping-particle&quot;:&quot;&quot;,&quot;non-dropping-particle&quot;:&quot;&quot;},{&quot;family&quot;:&quot;Mitamura&quot;,&quot;given&quot;:&quot;Daniel Carl R.&quot;,&quot;parse-names&quot;:false,&quot;dropping-particle&quot;:&quot;&quot;,&quot;non-dropping-particle&quot;:&quot;&quot;},{&quot;family&quot;:&quot;Guadana&quot;,&quot;given&quot;:&quot;Ryan Richard H.&quot;,&quot;parse-names&quot;:false,&quot;dropping-particle&quot;:&quot;&quot;,&quot;non-dropping-particle&quot;:&quot;&quot;}],&quot;container-title&quot;:&quot;TENCON 2017 - 2017 IEEE Region 10 Conference&quot;,&quot;DOI&quot;:&quot;10.1109/TENCON.2017.8228331&quot;,&quot;ISBN&quot;:&quot;978-1-5090-1134-6&quot;,&quot;issued&quot;:{&quot;date-parts&quot;:[[2017,11]]},&quot;page&quot;:&quot;2759-2764&quot;,&quot;publisher&quot;:&quot;IEEE&quot;,&quot;container-title-short&quot;:&quot;&quot;},&quot;isTemporary&quot;:false,&quot;displayAs&quot;:&quot;composite&quot;,&quot;suppress-author&quot;:false,&quot;composite&quot;:true,&quot;author-only&quot;:false}],&quot;citationTag&quot;:&quot;MENDELEY_CITATION_v3_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&quot;},{&quot;citationID&quot;:&quot;MENDELEY_CITATION_86be5e15-e3c5-4d4b-8e70-e865b61e368a&quot;,&quot;properties&quot;:{&quot;noteIndex&quot;:0,&quot;mode&quot;:&quot;composite&quot;},&quot;isEdited&quot;:false,&quot;manualOverride&quot;:{&quot;isManuallyOverridden&quot;:false,&quot;citeprocText&quot;:&quot;Nagaraju et al. (2024)&quot;,&quot;manualOverrideText&quot;:&quot;&quot;},&quot;citationItems&quot;:[{&quot;id&quot;:&quot;21f33b29-909c-3cc8-92ee-3feeaa9a3cb5&quot;,&quot;itemData&quot;:{&quot;type&quot;:&quot;paper-conference&quot;,&quot;id&quot;:&quot;21f33b29-909c-3cc8-92ee-3feeaa9a3cb5&quot;,&quot;title&quot;:&quot;Mobile Application for Disaster Safety Management&quot;,&quot;author&quot;:[{&quot;family&quot;:&quot;Nagaraju&quot;,&quot;given&quot;:&quot;M. Siva&quot;,&quot;parse-names&quot;:false,&quot;dropping-particle&quot;:&quot;&quot;,&quot;non-dropping-particle&quot;:&quot;&quot;},{&quot;family&quot;:&quot;Kakarala&quot;,&quot;given&quot;:&quot;Harshitha&quot;,&quot;parse-names&quot;:false,&quot;dropping-particle&quot;:&quot;&quot;,&quot;non-dropping-particle&quot;:&quot;&quot;},{&quot;family&quot;:&quot;Sai&quot;,&quot;given&quot;:&quot;Vadaparthi&quot;,&quot;parse-names&quot;:false,&quot;dropping-particle&quot;:&quot;&quot;,&quot;non-dropping-particle&quot;:&quot;&quot;},{&quot;family&quot;:&quot;Vattikunta&quot;,&quot;given&quot;:&quot;Vishnu Pramukh&quot;,&quot;parse-names&quot;:false,&quot;dropping-particle&quot;:&quot;&quot;,&quot;non-dropping-particle&quot;:&quot;&quot;}],&quot;container-title&quot;:&quot;10th International Conference on Advanced Computing and Communication Systems, ICACCS 2024&quot;,&quot;DOI&quot;:&quot;10.1109/ICACCS60874.2024.10717114&quot;,&quot;ISBN&quot;:&quot;9798350384369&quot;,&quot;issued&quot;:{&quot;date-parts&quot;:[[2024]]},&quot;page&quot;:&quot;1008-1013&quot;,&quot;abstract&quot;:&quot;Disasters, whether geological upheavals like earth- quakes or the fury of a cyclonic storm, are often perceived as forces beyond human control. However, viewing them solely as 'natural' phenomena hides the crucial role of human settlements in amplifying their impact. Our tendency to build in floodplains, on earthquake faults, and along vulnerable coastlines transforms these natural events into devastating disasters. This anthropogenic lens underscores the need for proactive measures, with mobile applications emerging as powerful tools for disaster preparedness, communication, and response. Beyond simply acting as emergency sirens, these apps offer a comprehensive toolkit for mitigating disaster risk. Real-time alerts and hazard maps empower communities to prepare for impending threats, allowing for timely evacuation and resource mobilization. Comprehensive guides provide step-by-step instructions on creating emergency kits, securing homes, and staying informed during critical moments. By bridging information gaps and facilitating coordinated action, mobile apps have the potential to significantly bolster disaster safety, equipping individuals and communities with the knowledge and tools to navigate the challenges posed by these complex events.&quot;,&quot;publisher&quot;:&quot;Institute of Electrical and Electronics Engineers Inc.&quot;,&quot;container-title-short&quot;:&quot;&quot;},&quot;isTemporary&quot;:false,&quot;displayAs&quot;:&quot;composite&quot;,&quot;suppress-author&quot;:false,&quot;composite&quot;:true,&quot;author-only&quot;:false}],&quot;citationTag&quot;:&quot;MENDELEY_CITATION_v3_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&quot;}]"/>
+    <we:property name="MENDELEY_CITATIONS" value="[{&quot;citationID&quot;:&quot;MENDELEY_CITATION_d7214391-a203-484b-9d50-0d7398ea4d83&quot;,&quot;properties&quot;:{&quot;noteIndex&quot;:0,&quot;mode&quot;:&quot;suppress-author&quot;},&quot;isEdited&quot;:false,&quot;manualOverride&quot;:{&quot;isManuallyOverridden&quot;:false,&quot;citeprocText&quot;:&quot;(2013)&quot;,&quot;manualOverrideText&quot;:&quot;&quot;},&quot;citationTag&quot;:&quot;MENDELEY_CITATION_v3_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&quot;,&quot;citationItems&quot;:[{&quot;id&quot;:&quot;a6ec5793-99c6-3664-9b43-50da778f0aa2&quot;,&quot;itemData&quot;:{&quot;type&quot;:&quot;article-journal&quot;,&quot;id&quot;:&quot;a6ec5793-99c6-3664-9b43-50da778f0aa2&quot;,&quot;title&quot;:&quot;How Mobile Devices are Transforming Disaster Relief and Public Safety&quot;,&quot;author&quot;:[{&quot;family&quot;:&quot;West&quot;,&quot;given&quot;:&quot;Darrell M&quot;,&quot;parse-names&quot;:false,&quot;dropping-particle&quot;:&quot;&quot;,&quot;non-dropping-particle&quot;:&quot;&quot;},{&quot;family&quot;:&quot;Valentini&quot;,&quot;given&quot;:&quot;Elizabeth&quot;,&quot;parse-names&quot;:false,&quot;dropping-particle&quot;:&quot;&quot;,&quot;non-dropping-particle&quot;:&quot;&quot;}],&quot;container-title&quot;:&quot;Issues in Technology Innovation&quot;,&quot;accessed&quot;:{&quot;date-parts&quot;:[[2026,5,11]]},&quot;URL&quot;:&quot;https://www.brookings.edu/wp-content/uploads/2016/06/West_Valentini_Mobile-Technology-Disaster-Relief_v20.pdf&quot;,&quot;issued&quot;:{&quot;date-parts&quot;:[[2013,7]]},&quot;container-title-short&quot;:&quot;&quot;},&quot;isTemporary&quot;:false,&quot;displayAs&quot;:&quot;suppress-author&quot;,&quot;suppress-author&quot;:true,&quot;composite&quot;:false,&quot;author-only&quot;:false}]},{&quot;citationID&quot;:&quot;MENDELEY_CITATION_57f7902a-805a-422a-8600-3a660d9a1349&quot;,&quot;properties&quot;:{&quot;noteIndex&quot;:0,&quot;mode&quot;:&quot;composite&quot;},&quot;isEdited&quot;:false,&quot;manualOverride&quot;:{&quot;isManuallyOverridden&quot;:false,&quot;citeprocText&quot;:&quot;Toledo et al. (2017)&quot;,&quot;manualOverrideText&quot;:&quot;&quot;},&quot;citationTag&quot;:&quot;MENDELEY_CITATION_v3_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&quot;,&quot;citationItems&quot;:[{&quot;id&quot;:&quot;b4f339d8-6e9c-34d0-a036-639996814880&quot;,&quot;itemData&quot;:{&quot;type&quot;:&quot;paper-conference&quot;,&quot;id&quot;:&quot;b4f339d8-6e9c-34d0-a036-639996814880&quot;,&quot;title&quot;:&quot;SakunAPP: A framework for mobile application development in disaster awareness, preparedness and response&quot;,&quot;author&quot;:[{&quot;family&quot;:&quot;Toledo&quot;,&quot;given&quot;:&quot;Margarette P.&quot;,&quot;parse-names&quot;:false,&quot;dropping-particle&quot;:&quot;&quot;,&quot;non-dropping-particle&quot;:&quot;&quot;},{&quot;family&quot;:&quot;Sarvida&quot;,&quot;given&quot;:&quot;Johannah Crisanta Y.&quot;,&quot;parse-names&quot;:false,&quot;dropping-particle&quot;:&quot;&quot;,&quot;non-dropping-particle&quot;:&quot;&quot;},{&quot;family&quot;:&quot;Patiten&quot;,&quot;given&quot;:&quot;Bill Kevin S.&quot;,&quot;parse-names&quot;:false,&quot;dropping-particle&quot;:&quot;&quot;,&quot;non-dropping-particle&quot;:&quot;&quot;},{&quot;family&quot;:&quot;Mitamura&quot;,&quot;given&quot;:&quot;Daniel Carl R.&quot;,&quot;parse-names&quot;:false,&quot;dropping-particle&quot;:&quot;&quot;,&quot;non-dropping-particle&quot;:&quot;&quot;},{&quot;family&quot;:&quot;Guadana&quot;,&quot;given&quot;:&quot;Ryan Richard H.&quot;,&quot;parse-names&quot;:false,&quot;dropping-particle&quot;:&quot;&quot;,&quot;non-dropping-particle&quot;:&quot;&quot;}],&quot;container-title&quot;:&quot;TENCON 2017 - 2017 IEEE Region 10 Conference&quot;,&quot;DOI&quot;:&quot;10.1109/TENCON.2017.8228331&quot;,&quot;ISBN&quot;:&quot;978-1-5090-1134-6&quot;,&quot;issued&quot;:{&quot;date-parts&quot;:[[2017,11]]},&quot;page&quot;:&quot;2759-2764&quot;,&quot;publisher&quot;:&quot;IEEE&quot;,&quot;container-title-short&quot;:&quot;&quot;},&quot;isTemporary&quot;:false,&quot;displayAs&quot;:&quot;composite&quot;,&quot;suppress-author&quot;:false,&quot;composite&quot;:true,&quot;author-only&quot;:false}]},{&quot;citationID&quot;:&quot;MENDELEY_CITATION_6e0b71a4-6668-4990-8171-3865d20fc6f1&quot;,&quot;properties&quot;:{&quot;noteIndex&quot;:0,&quot;mode&quot;:&quot;composite&quot;},&quot;isEdited&quot;:false,&quot;manualOverride&quot;:{&quot;isManuallyOverridden&quot;:false,&quot;citeprocText&quot;:&quot;Nagaraju et al. (2024)&quot;,&quot;manualOverrideText&quot;:&quot;&quot;},&quot;citationTag&quot;:&quot;MENDELEY_CITATION_v3_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&quot;,&quot;citationItems&quot;:[{&quot;id&quot;:&quot;21f33b29-909c-3cc8-92ee-3feeaa9a3cb5&quot;,&quot;itemData&quot;:{&quot;type&quot;:&quot;paper-conference&quot;,&quot;id&quot;:&quot;21f33b29-909c-3cc8-92ee-3feeaa9a3cb5&quot;,&quot;title&quot;:&quot;Mobile Application for Disaster Safety Management&quot;,&quot;author&quot;:[{&quot;family&quot;:&quot;Nagaraju&quot;,&quot;given&quot;:&quot;M. Siva&quot;,&quot;parse-names&quot;:false,&quot;dropping-particle&quot;:&quot;&quot;,&quot;non-dropping-particle&quot;:&quot;&quot;},{&quot;family&quot;:&quot;Kakarala&quot;,&quot;given&quot;:&quot;Harshitha&quot;,&quot;parse-names&quot;:false,&quot;dropping-particle&quot;:&quot;&quot;,&quot;non-dropping-particle&quot;:&quot;&quot;},{&quot;family&quot;:&quot;Sai&quot;,&quot;given&quot;:&quot;Vadaparthi&quot;,&quot;parse-names&quot;:false,&quot;dropping-particle&quot;:&quot;&quot;,&quot;non-dropping-particle&quot;:&quot;&quot;},{&quot;family&quot;:&quot;Vattikunta&quot;,&quot;given&quot;:&quot;Vishnu Pramukh&quot;,&quot;parse-names&quot;:false,&quot;dropping-particle&quot;:&quot;&quot;,&quot;non-dropping-particle&quot;:&quot;&quot;}],&quot;container-title&quot;:&quot;10th International Conference on Advanced Computing and Communication Systems, ICACCS 2024&quot;,&quot;DOI&quot;:&quot;10.1109/ICACCS60874.2024.10717114&quot;,&quot;ISBN&quot;:&quot;9798350384369&quot;,&quot;issued&quot;:{&quot;date-parts&quot;:[[2024]]},&quot;page&quot;:&quot;1008-1013&quot;,&quot;abstract&quot;:&quot;Disasters, whether geological upheavals like earth- quakes or the fury of a cyclonic storm, are often perceived as forces beyond human control. However, viewing them solely as 'natural' phenomena hides the crucial role of human settlements in amplifying their impact. Our tendency to build in floodplains, on earthquake faults, and along vulnerable coastlines transforms these natural events into devastating disasters. This anthropogenic lens underscores the need for proactive measures, with mobile applications emerging as powerful tools for disaster preparedness, communication, and response. Beyond simply acting as emergency sirens, these apps offer a comprehensive toolkit for mitigating disaster risk. Real-time alerts and hazard maps empower communities to prepare for impending threats, allowing for timely evacuation and resource mobilization. Comprehensive guides provide step-by-step instructions on creating emergency kits, securing homes, and staying informed during critical moments. By bridging information gaps and facilitating coordinated action, mobile apps have the potential to significantly bolster disaster safety, equipping individuals and communities with the knowledge and tools to navigate the challenges posed by these complex events.&quot;,&quot;publisher&quot;:&quot;Institute of Electrical and Electronics Engineers Inc.&quot;,&quot;container-title-short&quot;:&quot;&quot;},&quot;isTemporary&quot;:false,&quot;displayAs&quot;:&quot;composite&quot;,&quot;suppress-author&quot;:false,&quot;composite&quot;:true,&quot;author-only&quot;:false}]},{&quot;citationID&quot;:&quot;MENDELEY_CITATION_6b3ee454-be67-4f06-92d3-44f30304800d&quot;,&quot;properties&quot;:{&quot;noteIndex&quot;:0,&quot;mode&quot;:&quot;composite&quot;},&quot;isEdited&quot;:false,&quot;manualOverride&quot;:{&quot;isManuallyOverridden&quot;:false,&quot;citeprocText&quot;:&quot;Kuhlmann et al. (2021)&quot;,&quot;manualOverrideText&quot;:&quot;&quot;},&quot;citationTag&quot;:&quot;MENDELEY_CITATION_v3_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&quot;,&quot;citationItems&quot;:[{&quot;id&quot;:&quot;3ecc0f8d-aec9-336a-b1b0-577fcacffed2&quot;,&quot;itemData&quot;:{&quot;type&quot;:&quot;article-journal&quot;,&quot;id&quot;:&quot;3ecc0f8d-aec9-336a-b1b0-577fcacffed2&quot;,&quot;title&quot;:&quot;Smartphone sensor accuracy varies from device to device in mobile research: The case of spatial orientation&quot;,&quot;author&quot;:[{&quot;family&quot;:&quot;Kuhlmann&quot;,&quot;given&quot;:&quot;Tim&quot;,&quot;parse-names&quot;:false,&quot;dropping-particle&quot;:&quot;&quot;,&quot;non-dropping-particle&quot;:&quot;&quot;},{&quot;family&quot;:&quot;Garaizar&quot;,&quot;given&quot;:&quot;Pablo&quot;,&quot;parse-names&quot;:false,&quot;dropping-particle&quot;:&quot;&quot;,&quot;non-dropping-particle&quot;:&quot;&quot;},{&quot;family&quot;:&quot;Reips&quot;,&quot;given&quot;:&quot;Ulf Dietrich&quot;,&quot;parse-names&quot;:false,&quot;dropping-particle&quot;:&quot;&quot;,&quot;non-dropping-particle&quot;:&quot;&quot;}],&quot;container-title&quot;:&quot;Behavior Research Methods&quot;,&quot;container-title-short&quot;:&quot;Behav. Res. Methods&quot;,&quot;DOI&quot;:&quot;10.3758/s13428-020-01404-5&quot;,&quot;ISSN&quot;:&quot;15543528&quot;,&quot;PMID&quot;:&quot;32472500&quot;,&quot;issued&quot;:{&quot;date-parts&quot;:[[2021,2,1]]},&quot;page&quot;:&quot;22-33&quot;,&quot;abstract&quot;:&quot;Smartphone usage is increasing around the globe—in daily life and as a research device in behavioral science. Smartphones offer the possibility to gather longitudinal data at little cost to researchers and participants. They provide the option to verify self-report data with data from sensors built into most smartphones. How accurate this sensor data is when gathered via different smartphone devices, e.g., in a typical experience sampling framework, has not been investigated systematically. With the present study, we investigated the accuracy of orientation data about the spatial position of smartphones via a newly invented measurement device, the RollPitcher. Objective status of pitch (vertical orientation) and roll (horizontal orientation) of the smartphone was compared to data gathered from the sensors via web browsers and native apps. Bayesian ANOVAs confirmed that the deviations in pitch and roll differed between smartphone models, with mean inaccuracies per device of up to 2.1° and 6.6°, respectively. The inaccuracies for measurements of roll were higher than for pitch, d =.28, p &lt;.001. Our results confirm the presence of heterogeneities when gathering orientation data from different smartphone devices. In most cases, measurement via a web browser was identical to measurement via a native app, but this was not true for all smartphone devices. As a solution to lack of sensor accuracy, we recommend the development and implementation of a coherent research framework and also discuss the implications of the heterogeneities in orientation data for different research designs.&quot;,&quot;publisher&quot;:&quot;Springer&quot;,&quot;issue&quot;:&quot;1&quot;,&quot;volume&quot;:&quot;53&quot;},&quot;isTemporary&quot;:false,&quot;displayAs&quot;:&quot;composite&quot;,&quot;suppress-author&quot;:false,&quot;composite&quot;:true,&quot;author-only&quot;:false}]},{&quot;citationID&quot;:&quot;MENDELEY_CITATION_9896379d-b93d-451c-b9be-fa321f4c29e5&quot;,&quot;properties&quot;:{&quot;noteIndex&quot;:0},&quot;isEdited&quot;:false,&quot;manualOverride&quot;:{&quot;isManuallyOverridden&quot;:false,&quot;citeprocText&quot;:&quot;(Österr. Rotes Kreuz, 2024)&quot;,&quot;manualOverrideText&quot;:&quot;&quot;},&quot;citationTag&quot;:&quot;MENDELEY_CITATION_v3_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&quot;,&quot;citationItems&quot;:[{&quot;id&quot;:&quot;179826b5-150f-3045-86d2-e09327713ef9&quot;,&quot;itemData&quot;:{&quot;type&quot;:&quot;article&quot;,&quot;id&quot;:&quot;179826b5-150f-3045-86d2-e09327713ef9&quot;,&quot;title&quot;:&quot;Erste Hilfe - Rotes Kreuz&quot;,&quot;author&quot;:[{&quot;family&quot;:&quot;Österr. Rotes Kreuz&quot;,&quot;given&quot;:&quot;LV Stmk&quot;,&quot;parse-names&quot;:false,&quot;dropping-particle&quot;:&quot;&quot;,&quot;non-dropping-particle&quot;:&quot;&quot;}],&quot;accessed&quot;:{&quot;date-parts&quot;:[[2026,5,11]]},&quot;URL&quot;:&quot;https://play.google.com/store/apps/details?id=at.roteskreuz.st.erstehilfe&amp;hl=en&quot;,&quot;issued&quot;:{&quot;date-parts&quot;:[[2024]]},&quot;container-title-short&quot;:&quot;&quot;},&quot;isTemporary&quot;:false,&quot;suppress-author&quot;:false,&quot;composite&quot;:false,&quot;author-only&quot;:false}]},{&quot;citationID&quot;:&quot;MENDELEY_CITATION_886671ad-60e0-435a-bce4-cdd2e12acb0a&quot;,&quot;properties&quot;:{&quot;noteIndex&quot;:0},&quot;isEdited&quot;:false,&quot;manualOverride&quot;:{&quot;isManuallyOverridden&quot;:false,&quot;citeprocText&quot;:&quot;(Ubimet Int. AG, 2025)&quot;,&quot;manualOverrideText&quot;:&quot;&quot;},&quot;citationTag&quot;:&quot;MENDELEY_CITATION_v3_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&quot;,&quot;citationItems&quot;:[{&quot;id&quot;:&quot;0a0ede94-d528-31c4-bd01-16cba9053d6d&quot;,&quot;itemData&quot;:{&quot;type&quot;:&quot;article&quot;,&quot;id&quot;:&quot;0a0ede94-d528-31c4-bd01-16cba9053d6d&quot;,&quot;title&quot;:&quot;UWZ Österreich: Gewitter Sturm&quot;,&quot;author&quot;:[{&quot;family&quot;:&quot;Ubimet Int. AG&quot;,&quot;given&quot;:&quot;&quot;,&quot;parse-names&quot;:false,&quot;dropping-particle&quot;:&quot;&quot;,&quot;non-dropping-particle&quot;:&quot;&quot;}],&quot;accessed&quot;:{&quot;date-parts&quot;:[[2026,5,11]]},&quot;URL&quot;:&quot;https://play.google.com/store/apps/details?id=com.ubimet.uwz&amp;hl=en&quot;,&quot;issued&quot;:{&quot;date-parts&quot;:[[2025]]},&quot;container-title-short&quot;:&quot;&quot;},&quot;isTemporary&quot;:false,&quot;suppress-author&quot;:false,&quot;composite&quot;:false,&quot;author-only&quot;:false}]},{&quot;citationID&quot;:&quot;MENDELEY_CITATION_0d855cf6-e64e-48df-98eb-f43914fe822b&quot;,&quot;properties&quot;:{&quot;noteIndex&quot;:0},&quot;isEdited&quot;:false,&quot;manualOverride&quot;:{&quot;isManuallyOverridden&quot;:false,&quot;citeprocText&quot;:&quot;(SOBOS GmbH, 2026)&quot;,&quot;manualOverrideText&quot;:&quot;&quot;},&quot;citationTag&quot;:&quot;MENDELEY_CITATION_v3_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&quot;,&quot;citationItems&quot;:[{&quot;id&quot;:&quot;fd2c4f96-3611-3a59-9007-f495f9af880b&quot;,&quot;itemData&quot;:{&quot;type&quot;:&quot;article&quot;,&quot;id&quot;:&quot;fd2c4f96-3611-3a59-9007-f495f9af880b&quot;,&quot;title&quot;:&quot;FloodAlert Waterlevel Alerts&quot;,&quot;author&quot;:[{&quot;family&quot;:&quot;SOBOS GmbH&quot;,&quot;given&quot;:&quot;&quot;,&quot;parse-names&quot;:false,&quot;dropping-particle&quot;:&quot;&quot;,&quot;non-dropping-particle&quot;:&quot;&quot;}],&quot;accessed&quot;:{&quot;date-parts&quot;:[[2026,5,11]]},&quot;URL&quot;:&quot;https://play.google.com/store/apps/details?id=at.pegelalarm.app&amp;hl=en&quot;,&quot;issued&quot;:{&quot;date-parts&quot;:[[2026]]},&quot;container-title-short&quot;:&quot;&quot;},&quot;isTemporary&quot;:false,&quot;suppress-author&quot;:false,&quot;composite&quot;:false,&quot;author-only&quot;:false}]},{&quot;citationID&quot;:&quot;MENDELEY_CITATION_e105d078-37da-4078-a5d6-d97703616d8c&quot;,&quot;properties&quot;:{&quot;noteIndex&quot;:0},&quot;isEdited&quot;:false,&quot;manualOverride&quot;:{&quot;isManuallyOverridden&quot;:false,&quot;citeprocText&quot;:&quot;(CombiRisk Risk-Management GmbH, 2025)&quot;,&quot;manualOverrideText&quot;:&quot;&quot;},&quot;citationTag&quot;:&quot;MENDELEY_CITATION_v3_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&quot;,&quot;citationItems&quot;:[{&quot;id&quot;:&quot;d80d37ba-b2b0-3118-a50c-727d98f799c1&quot;,&quot;itemData&quot;:{&quot;type&quot;:&quot;article&quot;,&quot;id&quot;:&quot;d80d37ba-b2b0-3118-a50c-727d98f799c1&quot;,&quot;title&quot;:&quot;KATWARN&quot;,&quot;author&quot;:[{&quot;family&quot;:&quot;CombiRisk Risk-Management GmbH&quot;,&quot;given&quot;:&quot;&quot;,&quot;parse-names&quot;:false,&quot;dropping-particle&quot;:&quot;&quot;,&quot;non-dropping-particle&quot;:&quot;&quot;}],&quot;accessed&quot;:{&quot;date-parts&quot;:[[2026,5,11]]},&quot;URL&quot;:&quot;https://play.google.com/store/apps/details?id=de.combirisk.katwarn&amp;hl=en&quot;,&quot;issued&quot;:{&quot;date-parts&quot;:[[2025]]},&quot;container-title-short&quot;:&quot;&quot;},&quot;isTemporary&quot;:false,&quot;suppress-author&quot;:false,&quot;composite&quot;:false,&quot;author-only&quot;:false}]},{&quot;citationID&quot;:&quot;MENDELEY_CITATION_e14d5e21-56ca-4a3d-9123-0d31935a1303&quot;,&quot;properties&quot;:{&quot;noteIndex&quot;:0},&quot;isEdited&quot;:false,&quot;manualOverride&quot;:{&quot;isManuallyOverridden&quot;:true,&quot;citeprocText&quot;:&quot;(dominoc925, 2026; Gehirn Inc., 2026)&quot;,&quot;manualOverrideText&quot;:&quot;(Gehirn Inc., 2026; dominoc925, 2026)&quot;},&quot;citationTag&quot;:&quot;MENDELEY_CITATION_v3_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&quot;,&quot;citationItems&quot;:[{&quot;id&quot;:&quot;f0b01b7d-aa34-3f97-8664-4c969d93c381&quot;,&quot;itemData&quot;:{&quot;type&quot;:&quot;article&quot;,&quot;id&quot;:&quot;f0b01b7d-aa34-3f97-8664-4c969d93c381&quot;,&quot;title&quot;:&quot;Disastermon Natural Disaster Monitor&quot;,&quot;author&quot;:[{&quot;family&quot;:&quot;dominoc925&quot;,&quot;given&quot;:&quot;&quot;,&quot;parse-names&quot;:false,&quot;dropping-particle&quot;:&quot;&quot;,&quot;non-dropping-particle&quot;:&quot;&quot;}],&quot;accessed&quot;:{&quot;date-parts&quot;:[[2026,5,11]]},&quot;URL&quot;:&quot;https://play.google.com/store/apps/details?id=com.dom925.disastermon&amp;hl=en&quot;,&quot;issued&quot;:{&quot;date-parts&quot;:[[2026]]},&quot;container-title-short&quot;:&quot;&quot;},&quot;isTemporary&quot;:false},{&quot;id&quot;:&quot;d433b857-53be-3bee-b10b-cee97cab9c7b&quot;,&quot;itemData&quot;:{&quot;type&quot;:&quot;article&quot;,&quot;id&quot;:&quot;d433b857-53be-3bee-b10b-cee97cab9c7b&quot;,&quot;title&quot;:&quot;NERV Disaster Prevention&quot;,&quot;author&quot;:[{&quot;family&quot;:&quot;Gehirn Inc.&quot;,&quot;given&quot;:&quot;&quot;,&quot;parse-names&quot;:false,&quot;dropping-particle&quot;:&quot;&quot;,&quot;non-dropping-particle&quot;:&quot;&quot;}],&quot;accessed&quot;:{&quot;date-parts&quot;:[[2026,5,11]]},&quot;URL&quot;:&quot;https://play.google.com/store/apps/details?id=app.nerv&amp;hl=en&quot;,&quot;issued&quot;:{&quot;date-parts&quot;:[[2026]]},&quot;container-title-short&quot;:&quot;&quot;},&quot;isTemporary&quot;:false}]},{&quot;citationID&quot;:&quot;MENDELEY_CITATION_3f4ded40-ee20-47bc-b072-d5e9ce0024fe&quot;,&quot;properties&quot;:{&quot;noteIndex&quot;:0},&quot;isEdited&quot;:false,&quot;manualOverride&quot;:{&quot;isManuallyOverridden&quot;:false,&quot;citeprocText&quot;:&quot;(Rundfunk und Telekom Regulierungs GmbH, n.d.)&quot;,&quot;manualOverrideText&quot;:&quot;&quot;},&quot;citationTag&quot;:&quot;MENDELEY_CITATION_v3_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&quot;,&quot;citationItems&quot;:[{&quot;id&quot;:&quot;f7319c76-9025-35c1-aaa8-5ecc17c656ae&quot;,&quot;itemData&quot;:{&quot;type&quot;:&quot;webpage&quot;,&quot;id&quot;:&quot;f7319c76-9025-35c1-aaa8-5ecc17c656ae&quot;,&quot;title&quot;:&quot;AT-Alert Web Dashboard&quot;,&quot;author&quot;:[{&quot;family&quot;:&quot;Rundfunk und Telekom Regulierungs GmbH&quot;,&quot;given&quot;:&quot;&quot;,&quot;parse-names&quot;:false,&quot;dropping-particle&quot;:&quot;&quot;,&quot;non-dropping-particle&quot;:&quot;&quot;}],&quot;container-title&quot;:&quot;AT-Alert - öffentliches Warnsystem&quot;,&quot;accessed&quot;:{&quot;date-parts&quot;:[[2026,5,11]]},&quot;URL&quot;:&quot;https://warnungen.at-alert.at/en&quot;,&quot;container-title-short&quot;:&quot;&quot;},&quot;isTemporary&quot;:false,&quot;suppress-author&quot;:false,&quot;composite&quot;:false,&quot;author-only&quot;:false}]},{&quot;citationID&quot;:&quot;MENDELEY_CITATION_1cbcc268-165a-4575-828b-2e05f705d6e4&quot;,&quot;properties&quot;:{&quot;noteIndex&quot;:0},&quot;isEdited&quot;:false,&quot;manualOverride&quot;:{&quot;isManuallyOverridden&quot;:false,&quot;citeprocText&quot;:&quot;(GeoSphere Austria, n.d.)&quot;,&quot;manualOverrideText&quot;:&quot;&quot;},&quot;citationTag&quot;:&quot;MENDELEY_CITATION_v3_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&quot;,&quot;citationItems&quot;:[{&quot;id&quot;:&quot;1eb338cb-5eaf-348b-892b-5ab278b99afb&quot;,&quot;itemData&quot;:{&quot;type&quot;:&quot;webpage&quot;,&quot;id&quot;:&quot;1eb338cb-5eaf-348b-892b-5ab278b99afb&quot;,&quot;title&quot;:&quot;Warn API v1: OpenAPI Documentation&quot;,&quot;author&quot;:[{&quot;family&quot;:&quot;GeoSphere Austria&quot;,&quot;given&quot;:&quot;&quot;,&quot;parse-names&quot;:false,&quot;dropping-particle&quot;:&quot;&quot;,&quot;non-dropping-particle&quot;:&quot;&quot;}],&quot;container-title&quot;:&quot;GeoSphere Austria Swagger UI&quot;,&quot;accessed&quot;:{&quot;date-parts&quot;:[[2026,5,11]]},&quot;URL&quot;:&quot;https://openapi.hub.geosphere.at/warnapi/v1/&quot;,&quot;container-title-short&quot;:&quot;&quot;},&quot;isTemporary&quot;:false,&quot;suppress-author&quot;:false,&quot;composite&quot;:false,&quot;author-only&quot;:false}]},{&quot;citationID&quot;:&quot;MENDELEY_CITATION_341eb66c-e290-468f-8143-e991c26356f6&quot;,&quot;properties&quot;:{&quot;noteIndex&quot;:0,&quot;mode&quot;:&quot;suppress-author&quot;},&quot;isEdited&quot;:false,&quot;manualOverride&quot;:{&quot;isManuallyOverridden&quot;:false,&quot;citeprocText&quot;:&quot;(n.d.)&quot;,&quot;manualOverrideText&quot;:&quot;&quot;},&quot;citationTag&quot;:&quot;MENDELEY_CITATION_v3_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&quot;,&quot;citationItems&quot;:[{&quot;id&quot;:&quot;350bf848-c1ea-3b59-b057-5de5c2d5479e&quot;,&quot;itemData&quot;:{&quot;type&quot;:&quot;webpage&quot;,&quot;id&quot;:&quot;350bf848-c1ea-3b59-b057-5de5c2d5479e&quot;,&quot;title&quot;:&quot;Current measurements from the radiation early warning system&quot;,&quot;author&quot;:[{&quot;family&quot;:&quot;Austrian Federal Ministry of Agriculture Forestry Climate and Environmental Protection Regions and Water Management&quot;,&quot;given&quot;:&quot;&quot;,&quot;parse-names&quot;:false,&quot;dropping-particle&quot;:&quot;&quot;,&quot;non-dropping-particle&quot;:&quot;&quot;}],&quot;container-title&quot;:&quot;Radiation early warning system and monitoring&quot;,&quot;accessed&quot;:{&quot;date-parts&quot;:[[2026,5,11]]},&quot;URL&quot;:&quot;https://www.bmluk.gv.at/themen/klima-und-umwelt/strahlenschutz/fruehwarnsystem/messwerte.html&quot;,&quot;container-title-short&quot;:&quot;&quot;},&quot;isTemporary&quot;:false,&quot;displayAs&quot;:&quot;suppress-author&quot;,&quot;suppress-author&quot;:true,&quot;composite&quot;:false,&quot;author-only&quot;:false}]},{&quot;citationID&quot;:&quot;MENDELEY_CITATION_4cf7abba-ef0e-419a-bf3b-832c887855d5&quot;,&quot;properties&quot;:{&quot;noteIndex&quot;:0,&quot;mode&quot;:&quot;composite&quot;},&quot;isEdited&quot;:false,&quot;manualOverride&quot;:{&quot;isManuallyOverridden&quot;:false,&quot;citeprocText&quot;:&quot;Deterding et al. (2011)&quot;,&quot;manualOverrideText&quot;:&quot;&quot;},&quot;citationTag&quot;:&quot;MENDELEY_CITATION_v3_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&quot;,&quot;citationItems&quot;:[{&quot;id&quot;:&quot;332fb8dc-3abe-3461-903f-d31239c3b66c&quot;,&quot;itemData&quot;:{&quot;type&quot;:&quot;article-journal&quot;,&quot;id&quot;:&quot;332fb8dc-3abe-3461-903f-d31239c3b66c&quot;,&quot;title&quot;:&quot;From Game Design Elements to Gamefulness: Defining \&quot;Gamification\&quot;&quot;,&quot;author&quot;:[{&quot;family&quot;:&quot;Deterding&quot;,&quot;given&quot;:&quot;Sebastian&quot;,&quot;parse-names&quot;:false,&quot;dropping-particle&quot;:&quot;&quot;,&quot;non-dropping-particle&quot;:&quot;&quot;},{&quot;family&quot;:&quot;Dixon&quot;,&quot;given&quot;:&quot;Dan&quot;,&quot;parse-names&quot;:false,&quot;dropping-particle&quot;:&quot;&quot;,&quot;non-dropping-particle&quot;:&quot;&quot;},{&quot;family&quot;:&quot;Khaled&quot;,&quot;given&quot;:&quot;Rilla&quot;,&quot;parse-names&quot;:false,&quot;dropping-particle&quot;:&quot;&quot;,&quot;non-dropping-particle&quot;:&quot;&quot;},{&quot;family&quot;:&quot;Nacke&quot;,&quot;given&quot;:&quot;Lennart&quot;,&quot;parse-names&quot;:false,&quot;dropping-particle&quot;:&quot;&quot;,&quot;non-dropping-particle&quot;:&quot;&quot;}],&quot;container-title&quot;:&quot;Proceedings of the 15th International Academic MindTrek Conference: Envisioning Future Media Environments&quot;,&quot;ISBN&quot;:&quot;9781450308168&quot;,&quot;issued&quot;:{&quot;date-parts&quot;:[[2011]]},&quot;page&quot;:&quot;9-15&quot;,&quot;container-title-short&quot;:&quot;&quot;},&quot;isTemporary&quot;:false,&quot;displayAs&quot;:&quot;composite&quot;,&quot;suppress-author&quot;:false,&quot;composite&quot;:true,&quot;author-only&quot;:false}]},{&quot;citationID&quot;:&quot;MENDELEY_CITATION_a98fd18c-3c17-445d-af04-3857d25e2f41&quot;,&quot;properties&quot;:{&quot;noteIndex&quot;:0,&quot;mode&quot;:&quot;composite&quot;},&quot;isEdited&quot;:false,&quot;manualOverride&quot;:{&quot;isManuallyOverridden&quot;:false,&quot;citeprocText&quot;:&quot;Deterding et al. (2011)&quot;,&quot;manualOverrideText&quot;:&quot;&quot;},&quot;citationTag&quot;:&quot;MENDELEY_CITATION_v3_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&quot;,&quot;citationItems&quot;:[{&quot;id&quot;:&quot;332fb8dc-3abe-3461-903f-d31239c3b66c&quot;,&quot;itemData&quot;:{&quot;type&quot;:&quot;article-journal&quot;,&quot;id&quot;:&quot;332fb8dc-3abe-3461-903f-d31239c3b66c&quot;,&quot;title&quot;:&quot;From Game Design Elements to Gamefulness: Defining \&quot;Gamification\&quot;&quot;,&quot;author&quot;:[{&quot;family&quot;:&quot;Deterding&quot;,&quot;given&quot;:&quot;Sebastian&quot;,&quot;parse-names&quot;:false,&quot;dropping-particle&quot;:&quot;&quot;,&quot;non-dropping-particle&quot;:&quot;&quot;},{&quot;family&quot;:&quot;Dixon&quot;,&quot;given&quot;:&quot;Dan&quot;,&quot;parse-names&quot;:false,&quot;dropping-particle&quot;:&quot;&quot;,&quot;non-dropping-particle&quot;:&quot;&quot;},{&quot;family&quot;:&quot;Khaled&quot;,&quot;given&quot;:&quot;Rilla&quot;,&quot;parse-names&quot;:false,&quot;dropping-particle&quot;:&quot;&quot;,&quot;non-dropping-particle&quot;:&quot;&quot;},{&quot;family&quot;:&quot;Nacke&quot;,&quot;given&quot;:&quot;Lennart&quot;,&quot;parse-names&quot;:false,&quot;dropping-particle&quot;:&quot;&quot;,&quot;non-dropping-particle&quot;:&quot;&quot;}],&quot;container-title&quot;:&quot;Proceedings of the 15th International Academic MindTrek Conference: Envisioning Future Media Environments&quot;,&quot;ISBN&quot;:&quot;9781450308168&quot;,&quot;issued&quot;:{&quot;date-parts&quot;:[[2011]]},&quot;page&quot;:&quot;9-15&quot;,&quot;container-title-short&quot;:&quot;&quot;},&quot;isTemporary&quot;:false,&quot;displayAs&quot;:&quot;composite&quot;,&quot;suppress-author&quot;:false,&quot;composite&quot;:true,&quot;author-only&quot;:false}]},{&quot;citationID&quot;:&quot;MENDELEY_CITATION_48645824-af53-4ad6-962f-bd7069ec8ba3&quot;,&quot;properties&quot;:{&quot;noteIndex&quot;:0,&quot;mode&quot;:&quot;composite&quot;},&quot;isEdited&quot;:false,&quot;manualOverride&quot;:{&quot;isManuallyOverridden&quot;:false,&quot;citeprocText&quot;:&quot;Kankanamge et al. (2020)&quot;,&quot;manualOverrideText&quot;:&quot;&quot;},&quot;citationTag&quot;:&quot;MENDELEY_CITATION_v3_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&quot;,&quot;citationItems&quot;:[{&quot;id&quot;:&quot;6f1f5b91-4a36-3c87-8f0d-acad8cf02e27&quot;,&quot;itemData&quot;:{&quot;type&quot;:&quot;article-journal&quot;,&quot;id&quot;:&quot;6f1f5b91-4a36-3c87-8f0d-acad8cf02e27&quot;,&quot;title&quot;:&quot;How can gamification be incorporated into disaster emergency planning? A systematic review of the literature&quot;,&quot;author&quot;:[{&quot;family&quot;:&quot;Kankanamge&quot;,&quot;given&quot;:&quot;Nayomi&quot;,&quot;parse-names&quot;:false,&quot;dropping-particle&quot;:&quot;&quot;,&quot;non-dropping-particle&quot;:&quot;&quot;},{&quot;family&quot;:&quot;Yigitcanlar&quot;,&quot;given&quot;:&quot;Tan&quot;,&quot;parse-names&quot;:false,&quot;dropping-particle&quot;:&quot;&quot;,&quot;non-dropping-particle&quot;:&quot;&quot;},{&quot;family&quot;:&quot;Goonetilleke&quot;,&quot;given&quot;:&quot;Ashantha&quot;,&quot;parse-names&quot;:false,&quot;dropping-particle&quot;:&quot;&quot;,&quot;non-dropping-particle&quot;:&quot;&quot;},{&quot;family&quot;:&quot;Kamruzzaman&quot;,&quot;given&quot;:&quot;Md&quot;,&quot;parse-names&quot;:false,&quot;dropping-particle&quot;:&quot;&quot;,&quot;non-dropping-particle&quot;:&quot;&quot;}],&quot;container-title&quot;:&quot;International Journal of Disaster Resilience in the Built Environment&quot;,&quot;container-title-short&quot;:&quot;Int. J. Disaster Resil. Built Environ.&quot;,&quot;DOI&quot;:&quot;10.1108/IJDRBE-08-2019-0054&quot;,&quot;ISSN&quot;:&quot;17595916&quot;,&quot;issued&quot;:{&quot;date-parts&quot;:[[2020,8,26]]},&quot;page&quot;:&quot;481-506&quot;,&quot;abstract&quot;:&quot;Purpose: The purpose of this paper is to investigate the role of gamification as a novel technique in motivating community engagement in disaster-related activities in order to address the question of how gamification can be incorporated into disaster emergency planning. Design/methodology/approach: This study conducts a systematic literature review and explores available gamified applications for disaster emergency planning and their purpose of use. In total, 51 scholarly articles on the topic and 35 disaster-related gamified applications are reviewed. Findings: The findings reveal the following: (a) gamified applications (n = 35) are used for education, research and intervention purposes; (b) gamified applications create new opportunities for community engagement and raise disaster awareness among the community in virtual environments; and (c) gamified applications help shape a new culture – i.e. gamified culture – that supports smart disaster emergency planning practice. Originality/value: During the recent years, utilisation of game elements in non-game contexts – i.e., gamification – has become a popular approach in motivating people in various actions. Increasing research highlighted the benefits of gamification in enhancing community engagement, creating interactive environments, providing better behavioural outcomes and influencing democratic processes. Despite some of the applications indicating the potential of gamification in disaster emergency planning, the use of gamification technique in this discipline is an understudied area. This study reveals gamification can be incorporated into disaster emergency planning.&quot;,&quot;publisher&quot;:&quot;Emerald Group Holdings Ltd.&quot;,&quot;issue&quot;:&quot;4&quot;,&quot;volume&quot;:&quot;11&quot;},&quot;isTemporary&quot;:false,&quot;displayAs&quot;:&quot;composite&quot;,&quot;suppress-author&quot;:false,&quot;composite&quot;:true,&quot;author-only&quot;:false}]},{&quot;citationID&quot;:&quot;MENDELEY_CITATION_78afc2fd-4af1-495e-a7bd-6b0f93394098&quot;,&quot;properties&quot;:{&quot;noteIndex&quot;:0,&quot;mode&quot;:&quot;composite&quot;},&quot;isEdited&quot;:false,&quot;manualOverride&quot;:{&quot;isManuallyOverridden&quot;:false,&quot;citeprocText&quot;:&quot;Bai et al. (2024)&quot;,&quot;manualOverrideText&quot;:&quot;&quot;},&quot;citationTag&quot;:&quot;MENDELEY_CITATION_v3_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&quot;,&quot;citationItems&quot;:[{&quot;id&quot;:&quot;54229e43-90a5-31fa-8326-385619e7ca8a&quot;,&quot;itemData&quot;:{&quot;type&quot;:&quot;article-journal&quot;,&quot;id&quot;:&quot;54229e43-90a5-31fa-8326-385619e7ca8a&quot;,&quot;title&quot;:&quot;Application of Gamification Teaching in Disaster Education: Scoping Review&quot;,&quot;author&quot;:[{&quot;family&quot;:&quot;Bai&quot;,&quot;given&quot;:&quot;Shiyi&quot;,&quot;parse-names&quot;:false,&quot;dropping-particle&quot;:&quot;&quot;,&quot;non-dropping-particle&quot;:&quot;&quot;},{&quot;family&quot;:&quot;Zeng&quot;,&quot;given&quot;:&quot;Huijuan&quot;,&quot;parse-names&quot;:false,&quot;dropping-particle&quot;:&quot;&quot;,&quot;non-dropping-particle&quot;:&quot;&quot;},{&quot;family&quot;:&quot;Zhong&quot;,&quot;given&quot;:&quot;Qianmei&quot;,&quot;parse-names&quot;:false,&quot;dropping-particle&quot;:&quot;&quot;,&quot;non-dropping-particle&quot;:&quot;&quot;},{&quot;family&quot;:&quot;Shen&quot;,&quot;given&quot;:&quot;Yuqi&quot;,&quot;parse-names&quot;:false,&quot;dropping-particle&quot;:&quot;&quot;,&quot;non-dropping-particle&quot;:&quot;&quot;},{&quot;family&quot;:&quot;Cao&quot;,&quot;given&quot;:&quot;Lulu&quot;,&quot;parse-names&quot;:false,&quot;dropping-particle&quot;:&quot;&quot;,&quot;non-dropping-particle&quot;:&quot;&quot;},{&quot;family&quot;:&quot;He&quot;,&quot;given&quot;:&quot;Mei&quot;,&quot;parse-names&quot;:false,&quot;dropping-particle&quot;:&quot;&quot;,&quot;non-dropping-particle&quot;:&quot;&quot;}],&quot;container-title&quot;:&quot;JMIR Serious Games&quot;,&quot;container-title-short&quot;:&quot;JMIR Serious Games&quot;,&quot;DOI&quot;:&quot;10.2196/64939&quot;,&quot;ISSN&quot;:&quot;2291-9279&quot;,&quot;URL&quot;:&quot;https://games.jmir.org/2024/1/e64939&quot;,&quot;issued&quot;:{&quot;date-parts&quot;:[[2024,12,11]]},&quot;page&quot;:&quot;1-11&quot;,&quot;volume&quot;:&quot;12&quot;},&quot;isTemporary&quot;:false,&quot;displayAs&quot;:&quot;composite&quot;,&quot;suppress-author&quot;:false,&quot;composite&quot;:true,&quot;author-only&quot;:false}]},{&quot;citationID&quot;:&quot;MENDELEY_CITATION_34f8a526-1fdb-44de-8f23-90a3186c8f95&quot;,&quot;properties&quot;:{&quot;noteIndex&quot;:0},&quot;isEdited&quot;:false,&quot;manualOverride&quot;:{&quot;isManuallyOverridden&quot;:false,&quot;citeprocText&quot;:&quot;(Bai et al., 2024)&quot;,&quot;manualOverrideText&quot;:&quot;&quot;},&quot;citationTag&quot;:&quot;MENDELEY_CITATION_v3_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&quot;,&quot;citationItems&quot;:[{&quot;id&quot;:&quot;54229e43-90a5-31fa-8326-385619e7ca8a&quot;,&quot;itemData&quot;:{&quot;type&quot;:&quot;article-journal&quot;,&quot;id&quot;:&quot;54229e43-90a5-31fa-8326-385619e7ca8a&quot;,&quot;title&quot;:&quot;Application of Gamification Teaching in Disaster Education: Scoping Review&quot;,&quot;author&quot;:[{&quot;family&quot;:&quot;Bai&quot;,&quot;given&quot;:&quot;Shiyi&quot;,&quot;parse-names&quot;:false,&quot;dropping-particle&quot;:&quot;&quot;,&quot;non-dropping-particle&quot;:&quot;&quot;},{&quot;family&quot;:&quot;Zeng&quot;,&quot;given&quot;:&quot;Huijuan&quot;,&quot;parse-names&quot;:false,&quot;dropping-particle&quot;:&quot;&quot;,&quot;non-dropping-particle&quot;:&quot;&quot;},{&quot;family&quot;:&quot;Zhong&quot;,&quot;given&quot;:&quot;Qianmei&quot;,&quot;parse-names&quot;:false,&quot;dropping-particle&quot;:&quot;&quot;,&quot;non-dropping-particle&quot;:&quot;&quot;},{&quot;family&quot;:&quot;Shen&quot;,&quot;given&quot;:&quot;Yuqi&quot;,&quot;parse-names&quot;:false,&quot;dropping-particle&quot;:&quot;&quot;,&quot;non-dropping-particle&quot;:&quot;&quot;},{&quot;family&quot;:&quot;Cao&quot;,&quot;given&quot;:&quot;Lulu&quot;,&quot;parse-names&quot;:false,&quot;dropping-particle&quot;:&quot;&quot;,&quot;non-dropping-particle&quot;:&quot;&quot;},{&quot;family&quot;:&quot;He&quot;,&quot;given&quot;:&quot;Mei&quot;,&quot;parse-names&quot;:false,&quot;dropping-particle&quot;:&quot;&quot;,&quot;non-dropping-particle&quot;:&quot;&quot;}],&quot;container-title&quot;:&quot;JMIR Serious Games&quot;,&quot;container-title-short&quot;:&quot;JMIR Serious Games&quot;,&quot;DOI&quot;:&quot;10.2196/64939&quot;,&quot;ISSN&quot;:&quot;2291-9279&quot;,&quot;URL&quot;:&quot;https://games.jmir.org/2024/1/e64939&quot;,&quot;issued&quot;:{&quot;date-parts&quot;:[[2024,12,11]]},&quot;page&quot;:&quot;1-11&quot;,&quot;volume&quot;:&quot;12&quot;},&quot;isTemporary&quot;:false,&quot;suppress-author&quot;:false,&quot;composite&quot;:false,&quot;author-only&quot;:false}]},{&quot;citationID&quot;:&quot;MENDELEY_CITATION_9b6e06ba-acf2-471d-9ffa-13be86058412&quot;,&quot;properties&quot;:{&quot;noteIndex&quot;:0,&quot;mode&quot;:&quot;composite&quot;},&quot;isEdited&quot;:false,&quot;manualOverride&quot;:{&quot;isManuallyOverridden&quot;:false,&quot;citeprocText&quot;:&quot;Matsuno et al. (2021)&quot;,&quot;manualOverrideText&quot;:&quot;&quot;},&quot;citationTag&quot;:&quot;MENDELEY_CITATION_v3_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&quot;,&quot;citationItems&quot;:[{&quot;id&quot;:&quot;4176182c-444b-391f-99ce-f84dd897f787&quot;,&quot;itemData&quot;:{&quot;type&quot;:&quot;article-journal&quot;,&quot;id&quot;:&quot;4176182c-444b-391f-99ce-f84dd897f787&quot;,&quot;title&quot;:&quot;Development of Flood Disaster Prevention Simulation Smartphone Application Using Gamification&quot;,&quot;author&quot;:[{&quot;family&quot;:&quot;Matsuno&quot;,&quot;given&quot;:&quot;Yutaka&quot;,&quot;parse-names&quot;:false,&quot;dropping-particle&quot;:&quot;&quot;,&quot;non-dropping-particle&quot;:&quot;&quot;},{&quot;family&quot;:&quot;Fukanuma&quot;,&quot;given&quot;:&quot;Futaba&quot;,&quot;parse-names&quot;:false,&quot;dropping-particle&quot;:&quot;&quot;,&quot;non-dropping-particle&quot;:&quot;&quot;},{&quot;family&quot;:&quot;Tsuruoka&quot;,&quot;given&quot;:&quot;Shigenobu&quot;,&quot;parse-names&quot;:false,&quot;dropping-particle&quot;:&quot;&quot;,&quot;non-dropping-particle&quot;:&quot;&quot;}],&quot;container-title&quot;:&quot;Dynamics of Disasters: Impact, Risk, Resilience, and Solutions&quot;,&quot;issued&quot;:{&quot;date-parts&quot;:[[2021]]},&quot;page&quot;:&quot;147-159&quot;,&quot;abstract&quot;:&quot;In recent years, there have been many serious flood disasters. However, only a few citizens have sufficient knowledge about evacuation from the disaster. In order to reduce the damage, it is necessary for citizens to be aware of the flood risk of the residence, to prepare for disasters, and to take appropriate evacuation action at the time of disasters. For that purpose, citizens need to continuously learn disaster prevention information. Based on the above considerations, we develop a smartphone application for simulating flood disaster evacuation, based on the notion of gamification. In this paper, we report design and development of the disaster prevention smartphone application for citizens, focusing on eas-iness, continuity (wanting to use the application continuously), learning effects, and improvement of interest.&quot;,&quot;container-title-short&quot;:&quot;&quot;},&quot;isTemporary&quot;:false,&quot;displayAs&quot;:&quot;composite&quot;,&quot;suppress-author&quot;:false,&quot;composite&quot;:true,&quot;author-only&quot;:false}]},{&quot;citationID&quot;:&quot;MENDELEY_CITATION_e027c3b1-3894-47c3-8121-7ccd86147184&quot;,&quot;properties&quot;:{&quot;noteIndex&quot;:0,&quot;mode&quot;:&quot;composite&quot;},&quot;isEdited&quot;:false,&quot;manualOverride&quot;:{&quot;isManuallyOverridden&quot;:false,&quot;citeprocText&quot;:&quot;Kankanamge et al. (2020)&quot;,&quot;manualOverrideText&quot;:&quot;&quot;},&quot;citationTag&quot;:&quot;MENDELEY_CITATION_v3_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&quot;,&quot;citationItems&quot;:[{&quot;id&quot;:&quot;6f1f5b91-4a36-3c87-8f0d-acad8cf02e27&quot;,&quot;itemData&quot;:{&quot;type&quot;:&quot;article-journal&quot;,&quot;id&quot;:&quot;6f1f5b91-4a36-3c87-8f0d-acad8cf02e27&quot;,&quot;title&quot;:&quot;How can gamification be incorporated into disaster emergency planning? A systematic review of the literature&quot;,&quot;author&quot;:[{&quot;family&quot;:&quot;Kankanamge&quot;,&quot;given&quot;:&quot;Nayomi&quot;,&quot;parse-names&quot;:false,&quot;dropping-particle&quot;:&quot;&quot;,&quot;non-dropping-particle&quot;:&quot;&quot;},{&quot;family&quot;:&quot;Yigitcanlar&quot;,&quot;given&quot;:&quot;Tan&quot;,&quot;parse-names&quot;:false,&quot;dropping-particle&quot;:&quot;&quot;,&quot;non-dropping-particle&quot;:&quot;&quot;},{&quot;family&quot;:&quot;Goonetilleke&quot;,&quot;given&quot;:&quot;Ashantha&quot;,&quot;parse-names&quot;:false,&quot;dropping-particle&quot;:&quot;&quot;,&quot;non-dropping-particle&quot;:&quot;&quot;},{&quot;family&quot;:&quot;Kamruzzaman&quot;,&quot;given&quot;:&quot;Md&quot;,&quot;parse-names&quot;:false,&quot;dropping-particle&quot;:&quot;&quot;,&quot;non-dropping-particle&quot;:&quot;&quot;}],&quot;container-title&quot;:&quot;International Journal of Disaster Resilience in the Built Environment&quot;,&quot;container-title-short&quot;:&quot;Int. J. Disaster Resil. Built Environ.&quot;,&quot;DOI&quot;:&quot;10.1108/IJDRBE-08-2019-0054&quot;,&quot;ISSN&quot;:&quot;17595916&quot;,&quot;issued&quot;:{&quot;date-parts&quot;:[[2020,8,26]]},&quot;page&quot;:&quot;481-506&quot;,&quot;abstract&quot;:&quot;Purpose: The purpose of this paper is to investigate the role of gamification as a novel technique in motivating community engagement in disaster-related activities in order to address the question of how gamification can be incorporated into disaster emergency planning. Design/methodology/approach: This study conducts a systematic literature review and explores available gamified applications for disaster emergency planning and their purpose of use. In total, 51 scholarly articles on the topic and 35 disaster-related gamified applications are reviewed. Findings: The findings reveal the following: (a) gamified applications (n = 35) are used for education, research and intervention purposes; (b) gamified applications create new opportunities for community engagement and raise disaster awareness among the community in virtual environments; and (c) gamified applications help shape a new culture – i.e. gamified culture – that supports smart disaster emergency planning practice. Originality/value: During the recent years, utilisation of game elements in non-game contexts – i.e., gamification – has become a popular approach in motivating people in various actions. Increasing research highlighted the benefits of gamification in enhancing community engagement, creating interactive environments, providing better behavioural outcomes and influencing democratic processes. Despite some of the applications indicating the potential of gamification in disaster emergency planning, the use of gamification technique in this discipline is an understudied area. This study reveals gamification can be incorporated into disaster emergency planning.&quot;,&quot;publisher&quot;:&quot;Emerald Group Holdings Ltd.&quot;,&quot;issue&quot;:&quot;4&quot;,&quot;volume&quot;:&quot;11&quot;},&quot;isTemporary&quot;:false,&quot;displayAs&quot;:&quot;composite&quot;,&quot;suppress-author&quot;:false,&quot;composite&quot;:true,&quot;author-only&quot;:false}]},{&quot;citationID&quot;:&quot;MENDELEY_CITATION_96ff4853-f93d-4e23-925a-e92762cd09a7&quot;,&quot;properties&quot;:{&quot;noteIndex&quot;:0},&quot;isEdited&quot;:false,&quot;manualOverride&quot;:{&quot;isManuallyOverridden&quot;:true,&quot;citeprocText&quot;:&quot;(Nagaraju et al., 2024; Toledo et al., 2017; West &amp;#38; Valentini, 2013)&quot;,&quot;manualOverrideText&quot;:&quot;Nagaraju et al., 2024; Toledo et al., 2017; West &amp; Valentini, 2013&quot;},&quot;citationTag&quot;:&quot;MENDELEY_CITATION_v3_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&quot;,&quot;citationItems&quot;:[{&quot;id&quot;:&quot;a6ec5793-99c6-3664-9b43-50da778f0aa2&quot;,&quot;itemData&quot;:{&quot;type&quot;:&quot;article-journal&quot;,&quot;id&quot;:&quot;a6ec5793-99c6-3664-9b43-50da778f0aa2&quot;,&quot;title&quot;:&quot;How Mobile Devices are Transforming Disaster Relief and Public Safety&quot;,&quot;author&quot;:[{&quot;family&quot;:&quot;West&quot;,&quot;given&quot;:&quot;Darrell M&quot;,&quot;parse-names&quot;:false,&quot;dropping-particle&quot;:&quot;&quot;,&quot;non-dropping-particle&quot;:&quot;&quot;},{&quot;family&quot;:&quot;Valentini&quot;,&quot;given&quot;:&quot;Elizabeth&quot;,&quot;parse-names&quot;:false,&quot;dropping-particle&quot;:&quot;&quot;,&quot;non-dropping-particle&quot;:&quot;&quot;}],&quot;container-title&quot;:&quot;Issues in Technology Innovation&quot;,&quot;accessed&quot;:{&quot;date-parts&quot;:[[2026,5,11]]},&quot;URL&quot;:&quot;https://www.brookings.edu/wp-content/uploads/2016/06/West_Valentini_Mobile-Technology-Disaster-Relief_v20.pdf&quot;,&quot;issued&quot;:{&quot;date-parts&quot;:[[2013,7]]},&quot;container-title-short&quot;:&quot;&quot;},&quot;isTemporary&quot;:false},{&quot;id&quot;:&quot;b4f339d8-6e9c-34d0-a036-639996814880&quot;,&quot;itemData&quot;:{&quot;type&quot;:&quot;paper-conference&quot;,&quot;id&quot;:&quot;b4f339d8-6e9c-34d0-a036-639996814880&quot;,&quot;title&quot;:&quot;SakunAPP: A framework for mobile application development in disaster awareness, preparedness and response&quot;,&quot;author&quot;:[{&quot;family&quot;:&quot;Toledo&quot;,&quot;given&quot;:&quot;Margarette P.&quot;,&quot;parse-names&quot;:false,&quot;dropping-particle&quot;:&quot;&quot;,&quot;non-dropping-particle&quot;:&quot;&quot;},{&quot;family&quot;:&quot;Sarvida&quot;,&quot;given&quot;:&quot;Johannah Crisanta Y.&quot;,&quot;parse-names&quot;:false,&quot;dropping-particle&quot;:&quot;&quot;,&quot;non-dropping-particle&quot;:&quot;&quot;},{&quot;family&quot;:&quot;Patiten&quot;,&quot;given&quot;:&quot;Bill Kevin S.&quot;,&quot;parse-names&quot;:false,&quot;dropping-particle&quot;:&quot;&quot;,&quot;non-dropping-particle&quot;:&quot;&quot;},{&quot;family&quot;:&quot;Mitamura&quot;,&quot;given&quot;:&quot;Daniel Carl R.&quot;,&quot;parse-names&quot;:false,&quot;dropping-particle&quot;:&quot;&quot;,&quot;non-dropping-particle&quot;:&quot;&quot;},{&quot;family&quot;:&quot;Guadana&quot;,&quot;given&quot;:&quot;Ryan Richard H.&quot;,&quot;parse-names&quot;:false,&quot;dropping-particle&quot;:&quot;&quot;,&quot;non-dropping-particle&quot;:&quot;&quot;}],&quot;container-title&quot;:&quot;TENCON 2017 - 2017 IEEE Region 10 Conference&quot;,&quot;DOI&quot;:&quot;10.1109/TENCON.2017.8228331&quot;,&quot;ISBN&quot;:&quot;978-1-5090-1134-6&quot;,&quot;issued&quot;:{&quot;date-parts&quot;:[[2017,11]]},&quot;page&quot;:&quot;2759-2764&quot;,&quot;publisher&quot;:&quot;IEEE&quot;,&quot;container-title-short&quot;:&quot;&quot;},&quot;isTemporary&quot;:false},{&quot;id&quot;:&quot;21f33b29-909c-3cc8-92ee-3feeaa9a3cb5&quot;,&quot;itemData&quot;:{&quot;type&quot;:&quot;paper-conference&quot;,&quot;id&quot;:&quot;21f33b29-909c-3cc8-92ee-3feeaa9a3cb5&quot;,&quot;title&quot;:&quot;Mobile Application for Disaster Safety Management&quot;,&quot;author&quot;:[{&quot;family&quot;:&quot;Nagaraju&quot;,&quot;given&quot;:&quot;M. Siva&quot;,&quot;parse-names&quot;:false,&quot;dropping-particle&quot;:&quot;&quot;,&quot;non-dropping-particle&quot;:&quot;&quot;},{&quot;family&quot;:&quot;Kakarala&quot;,&quot;given&quot;:&quot;Harshitha&quot;,&quot;parse-names&quot;:false,&quot;dropping-particle&quot;:&quot;&quot;,&quot;non-dropping-particle&quot;:&quot;&quot;},{&quot;family&quot;:&quot;Sai&quot;,&quot;given&quot;:&quot;Vadaparthi&quot;,&quot;parse-names&quot;:false,&quot;dropping-particle&quot;:&quot;&quot;,&quot;non-dropping-particle&quot;:&quot;&quot;},{&quot;family&quot;:&quot;Vattikunta&quot;,&quot;given&quot;:&quot;Vishnu Pramukh&quot;,&quot;parse-names&quot;:false,&quot;dropping-particle&quot;:&quot;&quot;,&quot;non-dropping-particle&quot;:&quot;&quot;}],&quot;container-title&quot;:&quot;10th International Conference on Advanced Computing and Communication Systems, ICACCS 2024&quot;,&quot;DOI&quot;:&quot;10.1109/ICACCS60874.2024.10717114&quot;,&quot;ISBN&quot;:&quot;9798350384369&quot;,&quot;issued&quot;:{&quot;date-parts&quot;:[[2024]]},&quot;page&quot;:&quot;1008-1013&quot;,&quot;abstract&quot;:&quot;Disasters, whether geological upheavals like earth- quakes or the fury of a cyclonic storm, are often perceived as forces beyond human control. However, viewing them solely as 'natural' phenomena hides the crucial role of human settlements in amplifying their impact. Our tendency to build in floodplains, on earthquake faults, and along vulnerable coastlines transforms these natural events into devastating disasters. This anthropogenic lens underscores the need for proactive measures, with mobile applications emerging as powerful tools for disaster preparedness, communication, and response. Beyond simply acting as emergency sirens, these apps offer a comprehensive toolkit for mitigating disaster risk. Real-time alerts and hazard maps empower communities to prepare for impending threats, allowing for timely evacuation and resource mobilization. Comprehensive guides provide step-by-step instructions on creating emergency kits, securing homes, and staying informed during critical moments. By bridging information gaps and facilitating coordinated action, mobile apps have the potential to significantly bolster disaster safety, equipping individuals and communities with the knowledge and tools to navigate the challenges posed by these complex events.&quot;,&quot;publisher&quot;:&quot;Institute of Electrical and Electronics Engineers Inc.&quot;,&quot;container-title-short&quot;:&quot;&quot;},&quot;isTemporary&quot;:false}]},{&quot;citationID&quot;:&quot;MENDELEY_CITATION_fdd0ead7-4109-4f54-b135-d01532226a40&quot;,&quot;properties&quot;:{&quot;noteIndex&quot;:0},&quot;isEdited&quot;:false,&quot;manualOverride&quot;:{&quot;isManuallyOverridden&quot;:false,&quot;citeprocText&quot;:&quot;(CombiRisk Risk-Management GmbH, 2025; Österr. Rotes Kreuz, 2024; SOBOS GmbH, 2026; Ubimet Int. AG, 2025)&quot;,&quot;manualOverrideText&quot;:&quot;&quot;},&quot;citationTag&quot;:&quot;MENDELEY_CITATION_v3_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&quot;,&quot;citationItems&quot;:[{&quot;id&quot;:&quot;179826b5-150f-3045-86d2-e09327713ef9&quot;,&quot;itemData&quot;:{&quot;type&quot;:&quot;article&quot;,&quot;id&quot;:&quot;179826b5-150f-3045-86d2-e09327713ef9&quot;,&quot;title&quot;:&quot;Erste Hilfe - Rotes Kreuz&quot;,&quot;author&quot;:[{&quot;family&quot;:&quot;Österr. Rotes Kreuz&quot;,&quot;given&quot;:&quot;LV Stmk&quot;,&quot;parse-names&quot;:false,&quot;dropping-particle&quot;:&quot;&quot;,&quot;non-dropping-particle&quot;:&quot;&quot;}],&quot;accessed&quot;:{&quot;date-parts&quot;:[[2026,5,11]]},&quot;URL&quot;:&quot;https://play.google.com/store/apps/details?id=at.roteskreuz.st.erstehilfe&amp;hl=en&quot;,&quot;issued&quot;:{&quot;date-parts&quot;:[[2024]]},&quot;container-title-short&quot;:&quot;&quot;},&quot;isTemporary&quot;:false},{&quot;id&quot;:&quot;0a0ede94-d528-31c4-bd01-16cba9053d6d&quot;,&quot;itemData&quot;:{&quot;type&quot;:&quot;article&quot;,&quot;id&quot;:&quot;0a0ede94-d528-31c4-bd01-16cba9053d6d&quot;,&quot;title&quot;:&quot;UWZ Österreich: Gewitter Sturm&quot;,&quot;author&quot;:[{&quot;family&quot;:&quot;Ubimet Int. AG&quot;,&quot;given&quot;:&quot;&quot;,&quot;parse-names&quot;:false,&quot;dropping-particle&quot;:&quot;&quot;,&quot;non-dropping-particle&quot;:&quot;&quot;}],&quot;accessed&quot;:{&quot;date-parts&quot;:[[2026,5,11]]},&quot;URL&quot;:&quot;https://play.google.com/store/apps/details?id=com.ubimet.uwz&amp;hl=en&quot;,&quot;issued&quot;:{&quot;date-parts&quot;:[[2025]]},&quot;container-title-short&quot;:&quot;&quot;},&quot;isTemporary&quot;:false},{&quot;id&quot;:&quot;fd2c4f96-3611-3a59-9007-f495f9af880b&quot;,&quot;itemData&quot;:{&quot;type&quot;:&quot;article&quot;,&quot;id&quot;:&quot;fd2c4f96-3611-3a59-9007-f495f9af880b&quot;,&quot;title&quot;:&quot;FloodAlert Waterlevel Alerts&quot;,&quot;author&quot;:[{&quot;family&quot;:&quot;SOBOS GmbH&quot;,&quot;given&quot;:&quot;&quot;,&quot;parse-names&quot;:false,&quot;dropping-particle&quot;:&quot;&quot;,&quot;non-dropping-particle&quot;:&quot;&quot;}],&quot;accessed&quot;:{&quot;date-parts&quot;:[[2026,5,11]]},&quot;URL&quot;:&quot;https://play.google.com/store/apps/details?id=at.pegelalarm.app&amp;hl=en&quot;,&quot;issued&quot;:{&quot;date-parts&quot;:[[2026]]},&quot;container-title-short&quot;:&quot;&quot;},&quot;isTemporary&quot;:false},{&quot;id&quot;:&quot;d80d37ba-b2b0-3118-a50c-727d98f799c1&quot;,&quot;itemData&quot;:{&quot;type&quot;:&quot;article&quot;,&quot;id&quot;:&quot;d80d37ba-b2b0-3118-a50c-727d98f799c1&quot;,&quot;title&quot;:&quot;KATWARN&quot;,&quot;author&quot;:[{&quot;family&quot;:&quot;CombiRisk Risk-Management GmbH&quot;,&quot;given&quot;:&quot;&quot;,&quot;parse-names&quot;:false,&quot;dropping-particle&quot;:&quot;&quot;,&quot;non-dropping-particle&quot;:&quot;&quot;}],&quot;accessed&quot;:{&quot;date-parts&quot;:[[2026,5,11]]},&quot;URL&quot;:&quot;https://play.google.com/store/apps/details?id=de.combirisk.katwarn&amp;hl=en&quot;,&quot;issued&quot;:{&quot;date-parts&quot;:[[2025]]},&quot;container-title-short&quot;:&quot;&quot;},&quot;isTemporary&quot;:false}]},{&quot;citationID&quot;:&quot;MENDELEY_CITATION_4a357a16-ebd8-4b8d-85ae-31c092d210ff&quot;,&quot;properties&quot;:{&quot;noteIndex&quot;:0},&quot;isEdited&quot;:false,&quot;manualOverride&quot;:{&quot;isManuallyOverridden&quot;:false,&quot;citeprocText&quot;:&quot;(Austrian Federal Ministry of Agriculture Forestry Climate and Environmental Protection Regions and Water Management, n.d.; GeoSphere Austria, n.d.; Rundfunk und Telekom Regulierungs GmbH, n.d.; Zippenfenig, 2023)&quot;,&quot;manualOverrideText&quot;:&quot;&quot;},&quot;citationTag&quot;:&quot;MENDELEY_CITATION_v3_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&quot;,&quot;citationItems&quot;:[{&quot;id&quot;:&quot;f7319c76-9025-35c1-aaa8-5ecc17c656ae&quot;,&quot;itemData&quot;:{&quot;type&quot;:&quot;webpage&quot;,&quot;id&quot;:&quot;f7319c76-9025-35c1-aaa8-5ecc17c656ae&quot;,&quot;title&quot;:&quot;AT-Alert Web Dashboard&quot;,&quot;author&quot;:[{&quot;family&quot;:&quot;Rundfunk und Telekom Regulierungs GmbH&quot;,&quot;given&quot;:&quot;&quot;,&quot;parse-names&quot;:false,&quot;dropping-particle&quot;:&quot;&quot;,&quot;non-dropping-particle&quot;:&quot;&quot;}],&quot;container-title&quot;:&quot;AT-Alert - öffentliches Warnsystem&quot;,&quot;accessed&quot;:{&quot;date-parts&quot;:[[2026,5,11]]},&quot;URL&quot;:&quot;https://warnungen.at-alert.at/en&quot;,&quot;container-title-short&quot;:&quot;&quot;},&quot;isTemporary&quot;:false},{&quot;id&quot;:&quot;1eb338cb-5eaf-348b-892b-5ab278b99afb&quot;,&quot;itemData&quot;:{&quot;type&quot;:&quot;webpage&quot;,&quot;id&quot;:&quot;1eb338cb-5eaf-348b-892b-5ab278b99afb&quot;,&quot;title&quot;:&quot;Warn API v1: OpenAPI Documentation&quot;,&quot;author&quot;:[{&quot;family&quot;:&quot;GeoSphere Austria&quot;,&quot;given&quot;:&quot;&quot;,&quot;parse-names&quot;:false,&quot;dropping-particle&quot;:&quot;&quot;,&quot;non-dropping-particle&quot;:&quot;&quot;}],&quot;container-title&quot;:&quot;GeoSphere Austria Swagger UI&quot;,&quot;accessed&quot;:{&quot;date-parts&quot;:[[2026,5,11]]},&quot;URL&quot;:&quot;https://openapi.hub.geosphere.at/warnapi/v1/&quot;,&quot;container-title-short&quot;:&quot;&quot;},&quot;isTemporary&quot;:false},{&quot;id&quot;:&quot;350bf848-c1ea-3b59-b057-5de5c2d5479e&quot;,&quot;itemData&quot;:{&quot;type&quot;:&quot;webpage&quot;,&quot;id&quot;:&quot;350bf848-c1ea-3b59-b057-5de5c2d5479e&quot;,&quot;title&quot;:&quot;Current measurements from the radiation early warning system&quot;,&quot;author&quot;:[{&quot;family&quot;:&quot;Austrian Federal Ministry of Agriculture Forestry Climate and Environmental Protection Regions and Water Management&quot;,&quot;given&quot;:&quot;&quot;,&quot;parse-names&quot;:false,&quot;dropping-particle&quot;:&quot;&quot;,&quot;non-dropping-particle&quot;:&quot;&quot;}],&quot;container-title&quot;:&quot;Radiation early warning system and monitoring&quot;,&quot;accessed&quot;:{&quot;date-parts&quot;:[[2026,5,11]]},&quot;URL&quot;:&quot;https://www.bmluk.gv.at/themen/klima-und-umwelt/strahlenschutz/fruehwarnsystem/messwerte.html&quot;,&quot;container-title-short&quot;:&quot;&quot;},&quot;isTemporary&quot;:false},{&quot;id&quot;:&quot;52865776-bddc-3507-8c04-a91ef305c533&quot;,&quot;itemData&quot;:{&quot;type&quot;:&quot;webpage&quot;,&quot;id&quot;:&quot;52865776-bddc-3507-8c04-a91ef305c533&quot;,&quot;title&quot;:&quot;Open-Meteo.com Air Quality API&quot;,&quot;author&quot;:[{&quot;family&quot;:&quot;Zippenfenig&quot;,&quot;given&quot;:&quot;Patrick&quot;,&quot;parse-names&quot;:false,&quot;dropping-particle&quot;:&quot;&quot;,&quot;non-dropping-particle&quot;:&quot;&quot;}],&quot;container-title&quot;:&quot;Open-Meteo and Copernicus Atmosphere Monitoring Service (CAMS)&quot;,&quot;accessed&quot;:{&quot;date-parts&quot;:[[2026,5,11]]},&quot;DOI&quot;:&quot;10.5281/ZENODO.7970649&quot;,&quot;URL&quot;:&quot;https://open-meteo.com/en/docs/air-quality-api&quot;,&quot;issued&quot;:{&quot;date-parts&quot;:[[2023]]},&quot;container-title-short&quot;:&quot;&quot;},&quot;isTemporary&quot;:false}]},{&quot;citationID&quot;:&quot;MENDELEY_CITATION_7016325e-6610-4235-af48-1c1d15e1ba17&quot;,&quot;properties&quot;:{&quot;noteIndex&quot;:0},&quot;isEdited&quot;:false,&quot;manualOverride&quot;:{&quot;isManuallyOverridden&quot;:false,&quot;citeprocText&quot;:&quot;(Bai et al., 2024; Deterding et al., 2011; Kankanamge et al., 2020; Matsuno et al., 2021)&quot;,&quot;manualOverrideText&quot;:&quot;&quot;},&quot;citationTag&quot;:&quot;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&quot;,&quot;citationItems&quot;:[{&quot;id&quot;:&quot;4176182c-444b-391f-99ce-f84dd897f787&quot;,&quot;itemData&quot;:{&quot;type&quot;:&quot;article-journal&quot;,&quot;id&quot;:&quot;4176182c-444b-391f-99ce-f84dd897f787&quot;,&quot;title&quot;:&quot;Development of Flood Disaster Prevention Simulation Smartphone Application Using Gamification&quot;,&quot;author&quot;:[{&quot;family&quot;:&quot;Matsuno&quot;,&quot;given&quot;:&quot;Yutaka&quot;,&quot;parse-names&quot;:false,&quot;dropping-particle&quot;:&quot;&quot;,&quot;non-dropping-particle&quot;:&quot;&quot;},{&quot;family&quot;:&quot;Fukanuma&quot;,&quot;given&quot;:&quot;Futaba&quot;,&quot;parse-names&quot;:false,&quot;dropping-particle&quot;:&quot;&quot;,&quot;non-dropping-particle&quot;:&quot;&quot;},{&quot;family&quot;:&quot;Tsuruoka&quot;,&quot;given&quot;:&quot;Shigenobu&quot;,&quot;parse-names&quot;:false,&quot;dropping-particle&quot;:&quot;&quot;,&quot;non-dropping-particle&quot;:&quot;&quot;}],&quot;container-title&quot;:&quot;Dynamics of Disasters: Impact, Risk, Resilience, and Solutions&quot;,&quot;issued&quot;:{&quot;date-parts&quot;:[[2021]]},&quot;page&quot;:&quot;147-159&quot;,&quot;abstract&quot;:&quot;In recent years, there have been many serious flood disasters. However, only a few citizens have sufficient knowledge about evacuation from the disaster. In order to reduce the damage, it is necessary for citizens to be aware of the flood risk of the residence, to prepare for disasters, and to take appropriate evacuation action at the time of disasters. For that purpose, citizens need to continuously learn disaster prevention information. Based on the above considerations, we develop a smartphone application for simulating flood disaster evacuation, based on the notion of gamification. In this paper, we report design and development of the disaster prevention smartphone application for citizens, focusing on eas-iness, continuity (wanting to use the application continuously), learning effects, and improvement of interest.&quot;,&quot;container-title-short&quot;:&quot;&quot;},&quot;isTemporary&quot;:false},{&quot;id&quot;:&quot;54229e43-90a5-31fa-8326-385619e7ca8a&quot;,&quot;itemData&quot;:{&quot;type&quot;:&quot;article-journal&quot;,&quot;id&quot;:&quot;54229e43-90a5-31fa-8326-385619e7ca8a&quot;,&quot;title&quot;:&quot;Application of Gamification Teaching in Disaster Education: Scoping Review&quot;,&quot;author&quot;:[{&quot;family&quot;:&quot;Bai&quot;,&quot;given&quot;:&quot;Shiyi&quot;,&quot;parse-names&quot;:false,&quot;dropping-particle&quot;:&quot;&quot;,&quot;non-dropping-particle&quot;:&quot;&quot;},{&quot;family&quot;:&quot;Zeng&quot;,&quot;given&quot;:&quot;Huijuan&quot;,&quot;parse-names&quot;:false,&quot;dropping-particle&quot;:&quot;&quot;,&quot;non-dropping-particle&quot;:&quot;&quot;},{&quot;family&quot;:&quot;Zhong&quot;,&quot;given&quot;:&quot;Qianmei&quot;,&quot;parse-names&quot;:false,&quot;dropping-particle&quot;:&quot;&quot;,&quot;non-dropping-particle&quot;:&quot;&quot;},{&quot;family&quot;:&quot;Shen&quot;,&quot;given&quot;:&quot;Yuqi&quot;,&quot;parse-names&quot;:false,&quot;dropping-particle&quot;:&quot;&quot;,&quot;non-dropping-particle&quot;:&quot;&quot;},{&quot;family&quot;:&quot;Cao&quot;,&quot;given&quot;:&quot;Lulu&quot;,&quot;parse-names&quot;:false,&quot;dropping-particle&quot;:&quot;&quot;,&quot;non-dropping-particle&quot;:&quot;&quot;},{&quot;family&quot;:&quot;He&quot;,&quot;given&quot;:&quot;Mei&quot;,&quot;parse-names&quot;:false,&quot;dropping-particle&quot;:&quot;&quot;,&quot;non-dropping-particle&quot;:&quot;&quot;}],&quot;container-title&quot;:&quot;JMIR Serious Games&quot;,&quot;container-title-short&quot;:&quot;JMIR Serious Games&quot;,&quot;DOI&quot;:&quot;10.2196/64939&quot;,&quot;ISSN&quot;:&quot;2291-9279&quot;,&quot;URL&quot;:&quot;https://games.jmir.org/2024/1/e64939&quot;,&quot;issued&quot;:{&quot;date-parts&quot;:[[2024,12,11]]},&quot;page&quot;:&quot;1-11&quot;,&quot;volume&quot;:&quot;12&quot;},&quot;isTemporary&quot;:false},{&quot;id&quot;:&quot;6f1f5b91-4a36-3c87-8f0d-acad8cf02e27&quot;,&quot;itemData&quot;:{&quot;type&quot;:&quot;article-journal&quot;,&quot;id&quot;:&quot;6f1f5b91-4a36-3c87-8f0d-acad8cf02e27&quot;,&quot;title&quot;:&quot;How can gamification be incorporated into disaster emergency planning? A systematic review of the literature&quot;,&quot;author&quot;:[{&quot;family&quot;:&quot;Kankanamge&quot;,&quot;given&quot;:&quot;Nayomi&quot;,&quot;parse-names&quot;:false,&quot;dropping-particle&quot;:&quot;&quot;,&quot;non-dropping-particle&quot;:&quot;&quot;},{&quot;family&quot;:&quot;Yigitcanlar&quot;,&quot;given&quot;:&quot;Tan&quot;,&quot;parse-names&quot;:false,&quot;dropping-particle&quot;:&quot;&quot;,&quot;non-dropping-particle&quot;:&quot;&quot;},{&quot;family&quot;:&quot;Goonetilleke&quot;,&quot;given&quot;:&quot;Ashantha&quot;,&quot;parse-names&quot;:false,&quot;dropping-particle&quot;:&quot;&quot;,&quot;non-dropping-particle&quot;:&quot;&quot;},{&quot;family&quot;:&quot;Kamruzzaman&quot;,&quot;given&quot;:&quot;Md&quot;,&quot;parse-names&quot;:false,&quot;dropping-particle&quot;:&quot;&quot;,&quot;non-dropping-particle&quot;:&quot;&quot;}],&quot;container-title&quot;:&quot;International Journal of Disaster Resilience in the Built Environment&quot;,&quot;container-title-short&quot;:&quot;Int. J. Disaster Resil. Built Environ.&quot;,&quot;DOI&quot;:&quot;10.1108/IJDRBE-08-2019-0054&quot;,&quot;ISSN&quot;:&quot;17595916&quot;,&quot;issued&quot;:{&quot;date-parts&quot;:[[2020,8,26]]},&quot;page&quot;:&quot;481-506&quot;,&quot;abstract&quot;:&quot;Purpose: The purpose of this paper is to investigate the role of gamification as a novel technique in motivating community engagement in disaster-related activities in order to address the question of how gamification can be incorporated into disaster emergency planning. Design/methodology/approach: This study conducts a systematic literature review and explores available gamified applications for disaster emergency planning and their purpose of use. In total, 51 scholarly articles on the topic and 35 disaster-related gamified applications are reviewed. Findings: The findings reveal the following: (a) gamified applications (n = 35) are used for education, research and intervention purposes; (b) gamified applications create new opportunities for community engagement and raise disaster awareness among the community in virtual environments; and (c) gamified applications help shape a new culture – i.e. gamified culture – that supports smart disaster emergency planning practice. Originality/value: During the recent years, utilisation of game elements in non-game contexts – i.e., gamification – has become a popular approach in motivating people in various actions. Increasing research highlighted the benefits of gamification in enhancing community engagement, creating interactive environments, providing better behavioural outcomes and influencing democratic processes. Despite some of the applications indicating the potential of gamification in disaster emergency planning, the use of gamification technique in this discipline is an understudied area. This study reveals gamification can be incorporated into disaster emergency planning.&quot;,&quot;publisher&quot;:&quot;Emerald Group Holdings Ltd.&quot;,&quot;issue&quot;:&quot;4&quot;,&quot;volume&quot;:&quot;11&quot;},&quot;isTemporary&quot;:false},{&quot;id&quot;:&quot;332fb8dc-3abe-3461-903f-d31239c3b66c&quot;,&quot;itemData&quot;:{&quot;type&quot;:&quot;article-journal&quot;,&quot;id&quot;:&quot;332fb8dc-3abe-3461-903f-d31239c3b66c&quot;,&quot;title&quot;:&quot;From Game Design Elements to Gamefulness: Defining \&quot;Gamification\&quot;&quot;,&quot;author&quot;:[{&quot;family&quot;:&quot;Deterding&quot;,&quot;given&quot;:&quot;Sebastian&quot;,&quot;parse-names&quot;:false,&quot;dropping-particle&quot;:&quot;&quot;,&quot;non-dropping-particle&quot;:&quot;&quot;},{&quot;family&quot;:&quot;Dixon&quot;,&quot;given&quot;:&quot;Dan&quot;,&quot;parse-names&quot;:false,&quot;dropping-particle&quot;:&quot;&quot;,&quot;non-dropping-particle&quot;:&quot;&quot;},{&quot;family&quot;:&quot;Khaled&quot;,&quot;given&quot;:&quot;Rilla&quot;,&quot;parse-names&quot;:false,&quot;dropping-particle&quot;:&quot;&quot;,&quot;non-dropping-particle&quot;:&quot;&quot;},{&quot;family&quot;:&quot;Nacke&quot;,&quot;given&quot;:&quot;Lennart&quot;,&quot;parse-names&quot;:false,&quot;dropping-particle&quot;:&quot;&quot;,&quot;non-dropping-particle&quot;:&quot;&quot;}],&quot;container-title&quot;:&quot;Proceedings of the 15th International Academic MindTrek Conference: Envisioning Future Media Environments&quot;,&quot;ISBN&quot;:&quot;9781450308168&quot;,&quot;issued&quot;:{&quot;date-parts&quot;:[[2011]]},&quot;page&quot;:&quot;9-15&quot;,&quot;container-title-short&quot;:&quot;&quot;},&quot;isTemporary&quot;:false}]}]"/>
     <we:property name="MENDELEY_CITATIONS_STYLE" value="{&quot;id&quot;:&quot;https://www.zotero.org/styles/apa&quot;,&quot;title&quot;:&quot;APA Style 7th edition&quot;,&quot;format&quot;:&quot;author-date&quot;,&quot;defaultLocale&quot;:null,&quot;isLocaleCodeValid&quot;:true}"/>
   </we:properties>
   <we:bindings/>

</xml_diff>